<commit_message>
Update wrestling report with browser-verified sources
Apply the 13 August 2026 qualification system (ranking quota dates),
official Paris 2024 bout scores, LA28 schedule, 2026 national championship
result and Asian Games selection notice; flag unverified claims from the
second report.

Co-Authored-By: Claude Opus 5.5 <noreply@anthropic.com>
Claude-Session: https://claude.ai/code/session_01QJuodyHvSeVR7zYgSAMTnd
</commit_message>
<xml_diff>
--- a/广西队摔跤夺金情报研判_优化版.docx
+++ b/广西队摔跤夺金情报研判_优化版.docx
@@ -495,7 +495,7 @@
           <w:sz w:val="21"/>
           <w:szCs w:val="21"/>
         </w:rPr>
-        <w:t>8</w:t>
+        <w:t>9</w:t>
       </w:r>
     </w:p>
     <w:p>
@@ -710,7 +710,7 @@
           <w:szCs w:val="24"/>
         </w:rPr>
         <w:tab/>
-        <w:t>13</w:t>
+        <w:t>14</w:t>
       </w:r>
     </w:p>
     <w:p>
@@ -743,7 +743,7 @@
           <w:sz w:val="21"/>
           <w:szCs w:val="21"/>
         </w:rPr>
-        <w:t>13</w:t>
+        <w:t>14</w:t>
       </w:r>
     </w:p>
     <w:p>
@@ -776,7 +776,7 @@
           <w:sz w:val="21"/>
           <w:szCs w:val="21"/>
         </w:rPr>
-        <w:t>13</w:t>
+        <w:t>14</w:t>
       </w:r>
     </w:p>
     <w:p>
@@ -809,7 +809,7 @@
           <w:sz w:val="21"/>
           <w:szCs w:val="21"/>
         </w:rPr>
-        <w:t>14</w:t>
+        <w:t>15</w:t>
       </w:r>
     </w:p>
     <w:p>
@@ -842,7 +842,7 @@
           <w:sz w:val="21"/>
           <w:szCs w:val="21"/>
         </w:rPr>
-        <w:t>14</w:t>
+        <w:t>15</w:t>
       </w:r>
     </w:p>
     <w:p>
@@ -875,7 +875,7 @@
           <w:sz w:val="21"/>
           <w:szCs w:val="21"/>
         </w:rPr>
-        <w:t>14</w:t>
+        <w:t>15</w:t>
       </w:r>
     </w:p>
     <w:p>
@@ -900,7 +900,7 @@
           <w:szCs w:val="24"/>
         </w:rPr>
         <w:tab/>
-        <w:t>16</w:t>
+        <w:t>17</w:t>
       </w:r>
     </w:p>
     <w:p>
@@ -933,7 +933,7 @@
           <w:sz w:val="21"/>
           <w:szCs w:val="21"/>
         </w:rPr>
-        <w:t>16</w:t>
+        <w:t>17</w:t>
       </w:r>
     </w:p>
     <w:p>
@@ -966,7 +966,7 @@
           <w:sz w:val="21"/>
           <w:szCs w:val="21"/>
         </w:rPr>
-        <w:t>16</w:t>
+        <w:t>17</w:t>
       </w:r>
     </w:p>
     <w:p>
@@ -991,7 +991,7 @@
           <w:szCs w:val="24"/>
         </w:rPr>
         <w:tab/>
-        <w:t>18</w:t>
+        <w:t>19</w:t>
       </w:r>
     </w:p>
     <w:p>
@@ -1024,7 +1024,7 @@
           <w:sz w:val="21"/>
           <w:szCs w:val="21"/>
         </w:rPr>
-        <w:t>18</w:t>
+        <w:t>19</w:t>
       </w:r>
     </w:p>
     <w:p>
@@ -1057,7 +1057,7 @@
           <w:sz w:val="21"/>
           <w:szCs w:val="21"/>
         </w:rPr>
-        <w:t>18</w:t>
+        <w:t>19</w:t>
       </w:r>
     </w:p>
     <w:p>
@@ -1090,7 +1090,7 @@
           <w:sz w:val="21"/>
           <w:szCs w:val="21"/>
         </w:rPr>
-        <w:t>18</w:t>
+        <w:t>19</w:t>
       </w:r>
     </w:p>
     <w:p>
@@ -1115,7 +1115,7 @@
           <w:szCs w:val="24"/>
         </w:rPr>
         <w:tab/>
-        <w:t>19</w:t>
+        <w:t>20</w:t>
       </w:r>
     </w:p>
     <w:p>
@@ -1148,7 +1148,7 @@
           <w:sz w:val="21"/>
           <w:szCs w:val="21"/>
         </w:rPr>
-        <w:t>19</w:t>
+        <w:t>20</w:t>
       </w:r>
     </w:p>
     <w:p>
@@ -1181,7 +1181,7 @@
           <w:sz w:val="21"/>
           <w:szCs w:val="21"/>
         </w:rPr>
-        <w:t>19</w:t>
+        <w:t>20</w:t>
       </w:r>
     </w:p>
     <w:p>
@@ -1214,7 +1214,7 @@
           <w:sz w:val="21"/>
           <w:szCs w:val="21"/>
         </w:rPr>
-        <w:t>20</w:t>
+        <w:t>21</w:t>
       </w:r>
     </w:p>
     <w:p>
@@ -1247,7 +1247,7 @@
           <w:sz w:val="21"/>
           <w:szCs w:val="21"/>
         </w:rPr>
-        <w:t>20</w:t>
+        <w:t>21</w:t>
       </w:r>
     </w:p>
     <w:p>
@@ -1280,7 +1280,7 @@
           <w:sz w:val="21"/>
           <w:szCs w:val="21"/>
         </w:rPr>
-        <w:t>20</w:t>
+        <w:t>21</w:t>
       </w:r>
     </w:p>
     <w:p>
@@ -1305,7 +1305,7 @@
           <w:szCs w:val="24"/>
         </w:rPr>
         <w:tab/>
-        <w:t>21</w:t>
+        <w:t>22</w:t>
       </w:r>
       <w:r>
         <w:fldChar w:fldCharType="end"/>
@@ -3114,7 +3114,7 @@
                 <w:sz w:val="18"/>
                 <w:szCs w:val="18"/>
               </w:rPr>
-              <w:t xml:space="preserve">7项赛事（2027年洲际锦标赛、2027年3站排名赛、2027年世锦赛、2028年1站排名赛、2028年洲际锦标赛）取最好5项计分；第一阶段未获名额者中排名前3者为国家得名额；洲际赛事只取3项中最好2项</w:t>
+              <w:t xml:space="preserve">7项赛事（2027年洲际锦标赛、2027年3站排名赛、2027年世锦赛、2028年1站排名赛、2028年洲际锦标赛）取最好5项计分；第一阶段未获名额者中排名前3者为国家得名额；同一年洲际锦标赛和洲际运动会不能叠加，只取高分</w:t>
             </w:r>
             <w:r>
               <w:rPr>
@@ -4622,7 +4622,7 @@
                 <w:sz w:val="18"/>
                 <w:szCs w:val="18"/>
               </w:rPr>
-              <w:t xml:space="preserve">计入排名；排名名额于2028年1月26日书面确认</w:t>
+              <w:t xml:space="preserve">计入排名</w:t>
             </w:r>
             <w:r>
               <w:rPr>
@@ -4731,18 +4731,7 @@
                 <w:sz w:val="18"/>
                 <w:szCs w:val="18"/>
               </w:rPr>
-              <w:t xml:space="preserve">列入排名池，但排在排名名额确认日之后，文件前后不一致，可能只用于种子排位</w:t>
-            </w:r>
-            <w:r>
-              <w:rPr>
-                <w:rFonts w:ascii="Calibri" w:hAnsi="Calibri" w:eastAsia="微软雅黑" w:cs="Calibri"/>
-                <w:b/>
-                <w:bCs/>
-                <w:color w:val="C00000"/>
-                <w:sz w:val="18"/>
-                <w:szCs w:val="18"/>
-              </w:rPr>
-              <w:t xml:space="preserve">【待核实】</w:t>
+              <w:t xml:space="preserve">计入排名，是排名池最后一项；排名名额于2028年3月20日书面确认（8月13日版；6月3日版写1月26日，已按新版更正）</w:t>
             </w:r>
             <w:r>
               <w:rPr>
@@ -4750,7 +4739,7 @@
                 <w:sz w:val="17"/>
                 <w:szCs w:val="17"/>
               </w:rPr>
-              <w:t xml:space="preserve">[1、23]</w:t>
+              <w:t xml:space="preserve">[1]</w:t>
             </w:r>
           </w:p>
         </w:tc>
@@ -5069,7 +5058,7 @@
                 <w:sz w:val="18"/>
                 <w:szCs w:val="18"/>
               </w:rPr>
-              <w:t xml:space="preserve">—</w:t>
+              <w:t xml:space="preserve">古典式60公斤安排在7月24日至25日</w:t>
             </w:r>
             <w:r>
               <w:rPr>
@@ -5077,7 +5066,7 @@
                 <w:sz w:val="17"/>
                 <w:szCs w:val="17"/>
               </w:rPr>
-              <w:t xml:space="preserve">[1]</w:t>
+              <w:t xml:space="preserve">[1、43]</w:t>
             </w:r>
           </w:p>
         </w:tc>
@@ -5544,7 +5533,7 @@
                 <w:sz w:val="18"/>
                 <w:szCs w:val="18"/>
               </w:rPr>
-              <w:t xml:space="preserve">2028年1月26日</w:t>
+              <w:t xml:space="preserve">2028年3月20日</w:t>
             </w:r>
           </w:p>
         </w:tc>
@@ -5614,7 +5603,7 @@
                 <w:sz w:val="18"/>
                 <w:szCs w:val="18"/>
               </w:rPr>
-              <w:t xml:space="preserve">2028年2月9日</w:t>
+              <w:t xml:space="preserve">2028年3月23日</w:t>
             </w:r>
           </w:p>
         </w:tc>
@@ -6521,7 +6510,7 @@
                 <w:sz w:val="18"/>
                 <w:szCs w:val="18"/>
               </w:rPr>
-              <w:t xml:space="preserve">2027年2月至2028年1月</w:t>
+              <w:t xml:space="preserve">2027年2月至2028年3月；名额于2028年3月20日确认</w:t>
             </w:r>
             <w:r>
               <w:rPr>
@@ -6529,7 +6518,7 @@
                 <w:sz w:val="17"/>
                 <w:szCs w:val="17"/>
               </w:rPr>
-              <w:t xml:space="preserve">[1、23]</w:t>
+              <w:t xml:space="preserve">[1]</w:t>
             </w:r>
           </w:p>
         </w:tc>
@@ -7064,7 +7053,7 @@
           <w:sz w:val="21"/>
           <w:szCs w:val="21"/>
         </w:rPr>
-        <w:t xml:space="preserve">洛杉矶奥运会的摔跤竞赛规程和日程尚未取得</w:t>
+        <w:t xml:space="preserve">洛杉矶奥运会的摔跤竞赛规程尚未取得</w:t>
       </w:r>
       <w:r>
         <w:rPr>
@@ -7083,15 +7072,15 @@
           <w:sz w:val="21"/>
           <w:szCs w:val="21"/>
         </w:rPr>
-        <w:t xml:space="preserve">，以下依据世界摔跤联合会2026年1月版《国际摔跤规则》。</w:t>
-      </w:r>
-      <w:r>
-        <w:rPr>
-          <w:rFonts w:ascii="Calibri" w:hAnsi="Calibri" w:eastAsia="微软雅黑" w:cs="Calibri"/>
-          <w:sz w:val="21"/>
-          <w:szCs w:val="21"/>
-        </w:rPr>
-        <w:t xml:space="preserve">[22]</w:t>
+        <w:t xml:space="preserve">，以下规则依据世界摔跤联合会2026年1月版《国际摔跤规则》。日程据洛杉矶奥组委按项目排的赛程第2版：古典式60公斤7月24日进行1/8决赛、1/4决赛（11:00至13:00）和半决赛（19:00至20:00），7月25日进行复活赛、铜牌战和决赛；第4.0版（2026年7月29日）只列场次，不列具体项目。</w:t>
+      </w:r>
+      <w:r>
+        <w:rPr>
+          <w:rFonts w:ascii="Calibri" w:hAnsi="Calibri" w:eastAsia="微软雅黑" w:cs="Calibri"/>
+          <w:sz w:val="21"/>
+          <w:szCs w:val="21"/>
+        </w:rPr>
+        <w:t xml:space="preserve">[22、43]</w:t>
       </w:r>
     </w:p>
     <w:tbl>
@@ -7338,7 +7327,7 @@
                 <w:sz w:val="18"/>
                 <w:szCs w:val="18"/>
               </w:rPr>
-              <w:t xml:space="preserve">每个级别分两天：第一天资格赛和淘汰赛，打到半决赛；第二天复活赛和决赛，进入决赛和复活赛者须再次称重，第二次称重没有体重浮动；巴黎60公斤为8月5日至6日</w:t>
+              <w:t xml:space="preserve">每个级别分两天：第一天资格赛和淘汰赛，打到半决赛；第二天复活赛和决赛，进入决赛和复活赛者须再次称重，第二次称重没有体重浮动；巴黎60公斤为8月5日至6日，洛杉矶为7月24日至25日</w:t>
             </w:r>
             <w:r>
               <w:rPr>
@@ -7346,7 +7335,7 @@
                 <w:sz w:val="17"/>
                 <w:szCs w:val="17"/>
               </w:rPr>
-              <w:t xml:space="preserve">[22、38]</w:t>
+              <w:t xml:space="preserve">[22、38、43]</w:t>
             </w:r>
           </w:p>
         </w:tc>
@@ -8059,15 +8048,15 @@
           <w:sz w:val="21"/>
           <w:szCs w:val="21"/>
         </w:rPr>
-        <w:t xml:space="preserve">巴黎半决赛1∶3落后时，最后时刻在边界抱摔追成3∶3，凭最后得分晋级；2025年全运会决赛上半场1∶3落后，下半场把握跪撑机会连得5分，6∶3逆转。他的胜场多是小分差和末段逆转。</w:t>
-      </w:r>
-      <w:r>
-        <w:rPr>
-          <w:rFonts w:ascii="Calibri" w:hAnsi="Calibri" w:eastAsia="微软雅黑" w:cs="Calibri"/>
-          <w:sz w:val="21"/>
-          <w:szCs w:val="21"/>
-        </w:rPr>
-        <w:t xml:space="preserve">[12、32、33]</w:t>
+        <w:t xml:space="preserve">巴黎半决赛1∶3落后时，最后时刻在边界抱摔追成3∶3，凭最后得分晋级；2025年全运会决赛上半场1∶3落后，下半场把握跪撑机会连得5分，6∶3逆转。巴黎4场比赛中有3场第1局落后，得分集中在第2局。他的胜场多是小分差和末段逆转。</w:t>
+      </w:r>
+      <w:r>
+        <w:rPr>
+          <w:rFonts w:ascii="Calibri" w:hAnsi="Calibri" w:eastAsia="微软雅黑" w:cs="Calibri"/>
+          <w:sz w:val="21"/>
+          <w:szCs w:val="21"/>
+        </w:rPr>
+        <w:t xml:space="preserve">[12、32、33、41]</w:t>
       </w:r>
     </w:p>
     <w:p>
@@ -10922,42 +10911,23 @@
           <w:sz w:val="21"/>
           <w:szCs w:val="21"/>
         </w:rPr>
-        <w:t xml:space="preserve">2026年全国国际式摔跤锦标赛（5月，温州）：</w:t>
-      </w:r>
-      <w:r>
-        <w:rPr>
-          <w:rFonts w:ascii="Calibri" w:hAnsi="Calibri" w:eastAsia="微软雅黑" w:cs="Calibri"/>
-          <w:sz w:val="21"/>
-          <w:szCs w:val="21"/>
-        </w:rPr>
-        <w:t xml:space="preserve">曹利国爆冷止步半决赛，获古典式60公斤铜牌；该级别冠军姓名的原始报道未能打开</w:t>
-      </w:r>
-      <w:r>
-        <w:rPr>
-          <w:rFonts w:ascii="Calibri" w:hAnsi="Calibri" w:eastAsia="微软雅黑" w:cs="Calibri"/>
-          <w:b/>
-          <w:bCs/>
-          <w:color w:val="C00000"/>
-          <w:sz w:val="21"/>
-          <w:szCs w:val="21"/>
-        </w:rPr>
-        <w:t xml:space="preserve">【待核实】</w:t>
-      </w:r>
-      <w:r>
-        <w:rPr>
-          <w:rFonts w:ascii="Calibri" w:hAnsi="Calibri" w:eastAsia="微软雅黑" w:cs="Calibri"/>
-          <w:sz w:val="21"/>
-          <w:szCs w:val="21"/>
-        </w:rPr>
-        <w:t xml:space="preserve">。</w:t>
-      </w:r>
-      <w:r>
-        <w:rPr>
-          <w:rFonts w:ascii="Calibri" w:hAnsi="Calibri" w:eastAsia="微软雅黑" w:cs="Calibri"/>
-          <w:sz w:val="21"/>
-          <w:szCs w:val="21"/>
-        </w:rPr>
-        <w:t xml:space="preserve">[2]</w:t>
+        <w:t xml:space="preserve">2026年全国国际式摔跤锦标赛（5月13日至22日，温州）：</w:t>
+      </w:r>
+      <w:r>
+        <w:rPr>
+          <w:rFonts w:ascii="Calibri" w:hAnsi="Calibri" w:eastAsia="微软雅黑" w:cs="Calibri"/>
+          <w:sz w:val="21"/>
+          <w:szCs w:val="21"/>
+        </w:rPr>
+        <w:t xml:space="preserve">曹利国爆冷止步半决赛，在季军争夺战中获胜，获古典式60公斤铜牌；该级别冠军为内蒙古队宝音吉雅。</w:t>
+      </w:r>
+      <w:r>
+        <w:rPr>
+          <w:rFonts w:ascii="Calibri" w:hAnsi="Calibri" w:eastAsia="微软雅黑" w:cs="Calibri"/>
+          <w:sz w:val="21"/>
+          <w:szCs w:val="21"/>
+        </w:rPr>
+        <w:t xml:space="preserve">[2、45、46]</w:t>
       </w:r>
     </w:p>
     <w:p>
@@ -10977,23 +10947,23 @@
           <w:sz w:val="21"/>
           <w:szCs w:val="21"/>
         </w:rPr>
-        <w:t xml:space="preserve">2026年亚运会（10月1日，名古屋）：</w:t>
-      </w:r>
-      <w:r>
-        <w:rPr>
-          <w:rFonts w:ascii="Calibri" w:hAnsi="Calibri" w:eastAsia="微软雅黑" w:cs="Calibri"/>
-          <w:sz w:val="21"/>
-          <w:szCs w:val="21"/>
-        </w:rPr>
-        <w:t xml:space="preserve">古典式60公斤中国参赛者为谭浩东，1/8决赛1∶1负伊朗阿巴斯普尔（按平分判定规则判负），对手未进决赛，谭浩东无复活赛机会。</w:t>
-      </w:r>
-      <w:r>
-        <w:rPr>
-          <w:rFonts w:ascii="Calibri" w:hAnsi="Calibri" w:eastAsia="微软雅黑" w:cs="Calibri"/>
-          <w:sz w:val="21"/>
-          <w:szCs w:val="21"/>
-        </w:rPr>
-        <w:t xml:space="preserve">[27]</w:t>
+        <w:t xml:space="preserve">2026年名古屋亚运会资格公示（举摔柔字〔2026〕167号，6月24日）：</w:t>
+      </w:r>
+      <w:r>
+        <w:rPr>
+          <w:rFonts w:ascii="Calibri" w:hAnsi="Calibri" w:eastAsia="微软雅黑" w:cs="Calibri"/>
+          <w:sz w:val="21"/>
+          <w:szCs w:val="21"/>
+        </w:rPr>
+        <w:t xml:space="preserve">古典式60公斤入选谭浩东（湖北）；国家体育总局9月7日公布的亚运会代表团名单中有谭浩东，没有曹利国。两份文件都没有公布综合排名和积分；2026年世锦赛没有单独发布参赛公示。</w:t>
+      </w:r>
+      <w:r>
+        <w:rPr>
+          <w:rFonts w:ascii="Calibri" w:hAnsi="Calibri" w:eastAsia="微软雅黑" w:cs="Calibri"/>
+          <w:sz w:val="21"/>
+          <w:szCs w:val="21"/>
+        </w:rPr>
+        <w:t xml:space="preserve">[47、48]</w:t>
       </w:r>
     </w:p>
     <w:p>
@@ -11013,23 +10983,23 @@
           <w:sz w:val="21"/>
           <w:szCs w:val="21"/>
         </w:rPr>
-        <w:t xml:space="preserve">2026年世锦赛（10月24日至25日，阿斯塔纳）：</w:t>
-      </w:r>
-      <w:r>
-        <w:rPr>
-          <w:rFonts w:ascii="Calibri" w:hAnsi="Calibri" w:eastAsia="微软雅黑" w:cs="Calibri"/>
-          <w:sz w:val="21"/>
-          <w:szCs w:val="21"/>
-        </w:rPr>
-        <w:t xml:space="preserve">古典式60公斤中国参赛者为曹利国，无种子；资格赛胜乌克兰库兹科，1/8决赛3∶3胜头号种子塞尔维亚季比洛夫，1/4决赛1∶7负日本五味虹登（最终冠军），复活赛胜亚美尼亚阿加贾尼扬，铜牌战1∶5负哈萨克斯坦苏尔坦加利，第5名。</w:t>
-      </w:r>
-      <w:r>
-        <w:rPr>
-          <w:rFonts w:ascii="Calibri" w:hAnsi="Calibri" w:eastAsia="微软雅黑" w:cs="Calibri"/>
-          <w:sz w:val="21"/>
-          <w:szCs w:val="21"/>
-        </w:rPr>
-        <w:t xml:space="preserve">[26、28]</w:t>
+        <w:t xml:space="preserve">2026年亚运会（10月1日，名古屋）：</w:t>
+      </w:r>
+      <w:r>
+        <w:rPr>
+          <w:rFonts w:ascii="Calibri" w:hAnsi="Calibri" w:eastAsia="微软雅黑" w:cs="Calibri"/>
+          <w:sz w:val="21"/>
+          <w:szCs w:val="21"/>
+        </w:rPr>
+        <w:t xml:space="preserve">古典式60公斤中国参赛者为谭浩东，1/8决赛1∶1负伊朗阿巴斯普尔（按平分判定规则判负），对手未进决赛，谭浩东无复活赛机会。</w:t>
+      </w:r>
+      <w:r>
+        <w:rPr>
+          <w:rFonts w:ascii="Calibri" w:hAnsi="Calibri" w:eastAsia="微软雅黑" w:cs="Calibri"/>
+          <w:sz w:val="21"/>
+          <w:szCs w:val="21"/>
+        </w:rPr>
+        <w:t xml:space="preserve">[27]</w:t>
       </w:r>
     </w:p>
     <w:p>
@@ -11049,42 +11019,23 @@
           <w:sz w:val="21"/>
           <w:szCs w:val="21"/>
         </w:rPr>
-        <w:t xml:space="preserve">2026年选派与办法对照（分析判断）：</w:t>
-      </w:r>
-      <w:r>
-        <w:rPr>
-          <w:rFonts w:ascii="Calibri" w:hAnsi="Calibri" w:eastAsia="微软雅黑" w:cs="Calibri"/>
-          <w:sz w:val="21"/>
-          <w:szCs w:val="21"/>
-        </w:rPr>
-        <w:t xml:space="preserve">办法规定综合排名第一者原则上打亚运会和世锦赛两站，不宜连续参赛时由第二名打世锦赛；实际是谭浩东打亚运会、曹利国打世锦赛，与“第一名打亚运会、第二名打世锦赛”的安排一致，但综合排名未公布，不能确定谁排第一</w:t>
-      </w:r>
-      <w:r>
-        <w:rPr>
-          <w:rFonts w:ascii="Calibri" w:hAnsi="Calibri" w:eastAsia="微软雅黑" w:cs="Calibri"/>
-          <w:b/>
-          <w:bCs/>
-          <w:color w:val="C00000"/>
-          <w:sz w:val="21"/>
-          <w:szCs w:val="21"/>
-        </w:rPr>
-        <w:t xml:space="preserve">【待核实】</w:t>
-      </w:r>
-      <w:r>
-        <w:rPr>
-          <w:rFonts w:ascii="Calibri" w:hAnsi="Calibri" w:eastAsia="微软雅黑" w:cs="Calibri"/>
-          <w:sz w:val="21"/>
-          <w:szCs w:val="21"/>
-        </w:rPr>
-        <w:t xml:space="preserve">。</w:t>
-      </w:r>
-      <w:r>
-        <w:rPr>
-          <w:rFonts w:ascii="Calibri" w:hAnsi="Calibri" w:eastAsia="微软雅黑" w:cs="Calibri"/>
-          <w:sz w:val="21"/>
-          <w:szCs w:val="21"/>
-        </w:rPr>
-        <w:t xml:space="preserve">[17、26、27]</w:t>
+        <w:t xml:space="preserve">2026年世锦赛（10月24日至25日，阿斯塔纳）：</w:t>
+      </w:r>
+      <w:r>
+        <w:rPr>
+          <w:rFonts w:ascii="Calibri" w:hAnsi="Calibri" w:eastAsia="微软雅黑" w:cs="Calibri"/>
+          <w:sz w:val="21"/>
+          <w:szCs w:val="21"/>
+        </w:rPr>
+        <w:t xml:space="preserve">古典式60公斤中国参赛者为曹利国，无种子；资格赛胜乌克兰库兹科，1/8决赛3∶3胜头号种子塞尔维亚季比洛夫，1/4决赛1∶7负日本五味虹登（最终冠军），复活赛胜亚美尼亚阿加贾尼扬，铜牌战1∶5负哈萨克斯坦苏尔坦加利，第5名。</w:t>
+      </w:r>
+      <w:r>
+        <w:rPr>
+          <w:rFonts w:ascii="Calibri" w:hAnsi="Calibri" w:eastAsia="微软雅黑" w:cs="Calibri"/>
+          <w:sz w:val="21"/>
+          <w:szCs w:val="21"/>
+        </w:rPr>
+        <w:t xml:space="preserve">[26、28]</w:t>
       </w:r>
     </w:p>
     <w:p>
@@ -11104,6 +11055,80 @@
           <w:sz w:val="21"/>
           <w:szCs w:val="21"/>
         </w:rPr>
+        <w:t xml:space="preserve">2026年选派与办法对照（分析判断）：</w:t>
+      </w:r>
+      <w:r>
+        <w:rPr>
+          <w:rFonts w:ascii="Calibri" w:hAnsi="Calibri" w:eastAsia="微软雅黑" w:cs="Calibri"/>
+          <w:sz w:val="21"/>
+          <w:szCs w:val="21"/>
+        </w:rPr>
+        <w:t xml:space="preserve">办法规定综合排名第一者原则上打亚运会和世锦赛两站，不宜连续参赛时由第二名打世锦赛；实际是谭浩东打亚运会、曹利国打世锦赛，与“第一名打亚运会、第二名打世锦赛”的安排一致，但综合排名未公布，不能确定谁排第一</w:t>
+      </w:r>
+      <w:r>
+        <w:rPr>
+          <w:rFonts w:ascii="Calibri" w:hAnsi="Calibri" w:eastAsia="微软雅黑" w:cs="Calibri"/>
+          <w:b/>
+          <w:bCs/>
+          <w:color w:val="C00000"/>
+          <w:sz w:val="21"/>
+          <w:szCs w:val="21"/>
+        </w:rPr>
+        <w:t xml:space="preserve">【待核实】</w:t>
+      </w:r>
+      <w:r>
+        <w:rPr>
+          <w:rFonts w:ascii="Calibri" w:hAnsi="Calibri" w:eastAsia="微软雅黑" w:cs="Calibri"/>
+          <w:sz w:val="21"/>
+          <w:szCs w:val="21"/>
+        </w:rPr>
+        <w:t xml:space="preserve">。按办法的积分表，公开成绩能算出的部分是：亚锦赛谭浩东第5名不记分（只有前3名记分），曹利国未参赛；全国锦标赛曹利国第3名记12分，谭浩东名次未取得。所以谭浩东如果排第一，领先只能来自全锦赛名次、队内选拔赛和教练评分（推断）</w:t>
+      </w:r>
+      <w:r>
+        <w:rPr>
+          <w:rFonts w:ascii="Calibri" w:hAnsi="Calibri" w:eastAsia="微软雅黑" w:cs="Calibri"/>
+          <w:b/>
+          <w:bCs/>
+          <w:color w:val="C00000"/>
+          <w:sz w:val="21"/>
+          <w:szCs w:val="21"/>
+        </w:rPr>
+        <w:t xml:space="preserve">【待核实】</w:t>
+      </w:r>
+      <w:r>
+        <w:rPr>
+          <w:rFonts w:ascii="Calibri" w:hAnsi="Calibri" w:eastAsia="微软雅黑" w:cs="Calibri"/>
+          <w:sz w:val="21"/>
+          <w:szCs w:val="21"/>
+        </w:rPr>
+        <w:t xml:space="preserve">。</w:t>
+      </w:r>
+      <w:r>
+        <w:rPr>
+          <w:rFonts w:ascii="Calibri" w:hAnsi="Calibri" w:eastAsia="微软雅黑" w:cs="Calibri"/>
+          <w:sz w:val="21"/>
+          <w:szCs w:val="21"/>
+        </w:rPr>
+        <w:t xml:space="preserve">[2、17、26、27、47]</w:t>
+      </w:r>
+    </w:p>
+    <w:p>
+      <w:pPr>
+        <w:pStyle w:val="19"/>
+        <w:numPr>
+          <w:ilvl w:val="0"/>
+          <w:numId w:val="2"/>
+        </w:numPr>
+        <w:spacing w:after="60" w:line="320" w:lineRule="auto"/>
+      </w:pPr>
+      <w:r>
+        <w:rPr>
+          <w:rFonts w:ascii="Calibri" w:hAnsi="Calibri" w:eastAsia="微软雅黑" w:cs="Calibri"/>
+          <w:b/>
+          <w:bCs/>
+          <w:sz w:val="21"/>
+          <w:szCs w:val="21"/>
+        </w:rPr>
         <w:t xml:space="preserve">需要向国家举重摔跤柔道运动管理中心或广西队索取的文件：</w:t>
       </w:r>
       <w:r>
@@ -11154,7 +11179,7 @@
           <w:sz w:val="21"/>
           <w:szCs w:val="21"/>
         </w:rPr>
-        <w:t xml:space="preserve">没有任何公开资料证明家庭背景或人际关系影响了国家队选拔，本报告不作推断。从办法本身看：古典式和女子摔跤有85%的比赛成绩积分，另有15%由教练组评分，这15分是主观评分，主教练占40%；有公示、异议受理和监督小组；换人由选拔小组建议、领导小组批准。办法中古典式教练组有一名“黎淑金”（评分权重15%）；英文维基援引杭州亚运会官方运动员资料，写曹利国的教练为“Li Shujin”，与“黎淑金”拼音一致，原稿“李树金”是由拼音回译的写法，很可能是同一人，但官方原页未能打开</w:t>
+        <w:t xml:space="preserve">没有任何公开资料证明家庭背景或人际关系影响了国家队选拔，本报告不作推断。从办法本身看：古典式和女子摔跤有85%的比赛成绩积分，另有15%由教练组评分，这15分是主观评分，主教练占40%；有公示、异议受理和监督小组；换人由选拔小组建议、领导小组批准。办法中古典式教练组有一名“黎淑金”（评分权重15%）；英文维基援引杭州亚运会官方运动员资料，写曹利国的教练为“Li Shujin”，与“黎淑金”拼音一致，很可能是同一人；但另一份报告称北海、百色等地方政府报道写作“李树金（北海市体校启蒙教练）”，这些原文本次未能打开，杭州亚运会官方资料页已失效（存档为404），两种写法谁对，仍</w:t>
       </w:r>
       <w:r>
         <w:rPr>
@@ -12587,7 +12612,7 @@
                 <w:sz w:val="18"/>
                 <w:szCs w:val="18"/>
               </w:rPr>
-              <w:t xml:space="preserve">6∶2胜</w:t>
+              <w:t xml:space="preserve">6∶2胜（第1局1∶2落后，第2局5∶0）</w:t>
             </w:r>
             <w:r>
               <w:rPr>
@@ -12595,7 +12620,7 @@
                 <w:sz w:val="17"/>
                 <w:szCs w:val="17"/>
               </w:rPr>
-              <w:t xml:space="preserve">[33、34]</w:t>
+              <w:t xml:space="preserve">[41]</w:t>
             </w:r>
           </w:p>
         </w:tc>
@@ -12717,7 +12742,7 @@
                 <w:sz w:val="18"/>
                 <w:szCs w:val="18"/>
               </w:rPr>
-              <w:t xml:space="preserve">5∶3胜</w:t>
+              <w:t xml:space="preserve">5∶3胜（第1局5∶2，第2局0∶1）</w:t>
             </w:r>
             <w:r>
               <w:rPr>
@@ -12725,7 +12750,7 @@
                 <w:sz w:val="17"/>
                 <w:szCs w:val="17"/>
               </w:rPr>
-              <w:t xml:space="preserve">[33、34]</w:t>
+              <w:t xml:space="preserve">[41]</w:t>
             </w:r>
           </w:p>
         </w:tc>
@@ -12847,7 +12872,7 @@
                 <w:sz w:val="18"/>
                 <w:szCs w:val="18"/>
               </w:rPr>
-              <w:t xml:space="preserve">3∶3胜，1∶3落后时最后时刻追平，凭最后得分晋级</w:t>
+              <w:t xml:space="preserve">3∶3胜（第1局0∶3落后，第2局3∶0），凭最后得分晋级</w:t>
             </w:r>
             <w:r>
               <w:rPr>
@@ -12855,7 +12880,7 @@
                 <w:sz w:val="17"/>
                 <w:szCs w:val="17"/>
               </w:rPr>
-              <w:t xml:space="preserve">[33、34]</w:t>
+              <w:t xml:space="preserve">[33、41]</w:t>
             </w:r>
           </w:p>
         </w:tc>
@@ -12977,18 +13002,7 @@
                 <w:sz w:val="18"/>
                 <w:szCs w:val="18"/>
               </w:rPr>
-              <w:t xml:space="preserve">1∶4负（新京报、维基）；澎湃新闻作1∶3，以官方成绩为准</w:t>
-            </w:r>
-            <w:r>
-              <w:rPr>
-                <w:rFonts w:ascii="Calibri" w:hAnsi="Calibri" w:eastAsia="微软雅黑" w:cs="Calibri"/>
-                <w:b/>
-                <w:bCs/>
-                <w:color w:val="C00000"/>
-                <w:sz w:val="18"/>
-                <w:szCs w:val="18"/>
-              </w:rPr>
-              <w:t xml:space="preserve">【待核实】</w:t>
+              <w:t xml:space="preserve">1∶4负（第1局0∶3，第2局1∶1），以点数判负；澎湃新闻作1∶3有误</w:t>
             </w:r>
             <w:r>
               <w:rPr>
@@ -12996,7 +13010,7 @@
                 <w:sz w:val="17"/>
                 <w:szCs w:val="17"/>
               </w:rPr>
-              <w:t xml:space="preserve">[33、34、38]</w:t>
+              <w:t xml:space="preserve">[41、42]</w:t>
             </w:r>
           </w:p>
         </w:tc>
@@ -13268,7 +13282,7 @@
                 <w:sz w:val="18"/>
                 <w:szCs w:val="18"/>
               </w:rPr>
-              <w:t xml:space="preserve">胜（维基作2∶1）</w:t>
+              <w:t xml:space="preserve">2∶1胜</w:t>
             </w:r>
             <w:r>
               <w:rPr>
@@ -13276,7 +13290,7 @@
                 <w:sz w:val="17"/>
                 <w:szCs w:val="17"/>
               </w:rPr>
-              <w:t xml:space="preserve">[26、38]</w:t>
+              <w:t xml:space="preserve">[42]</w:t>
             </w:r>
           </w:p>
         </w:tc>
@@ -13832,7 +13846,7 @@
           <w:sz w:val="21"/>
           <w:szCs w:val="21"/>
         </w:rPr>
-        <w:t xml:space="preserve">曹利国的胜场多是小分差和末段逆转（5∶3、3∶3、6∶3）；对世界冠军级对手文田健一郎、五味虹登、苏尔坦加利4战全负，合计得4分、失19分（巴黎决赛按1∶4计）。与举重“差几公斤”相对应，摔跤的差距体现为对顶级对手的交手战绩和失分。</w:t>
+        <w:t xml:space="preserve">曹利国的胜场多是小分差和末段逆转（5∶3、3∶3、6∶3）；对世界冠军级对手文田健一郎、五味虹登、苏尔坦加利4战全负，合计得4分、失19分；巴黎4场中有3场第1局落后，得分集中在第2局。与举重“差几公斤”相对应，摔跤的差距体现为对顶级对手的交手战绩和失分。</w:t>
       </w:r>
     </w:p>
     <w:p>
@@ -13873,7 +13887,26 @@
           <w:sz w:val="21"/>
           <w:szCs w:val="21"/>
         </w:rPr>
-        <w:t xml:space="preserve">父亲曹家佩，母亲田彩珍；奶奶田桂秀，堂兄曹顺国；老家广西百色市凌云县加尤镇陇槐村。巴黎决赛时，父母在南宁江南训练基地摔跤馆与广西重竞技运动发展中心的运动员、教练员一起看直播。奶奶回忆他小时候“经常跟我上山种地、除草、打猪菜”。父母职业、家庭经济状况、亲属是否从事体育，报道没有写</w:t>
+        <w:t xml:space="preserve">父亲曹家佩，母亲田彩珍；奶奶田桂秀，堂兄曹顺国；老家广西百色市凌云县加尤镇陇槐村。巴黎决赛时，父母在南宁江南训练基地摔跤馆与广西重竞技运动发展中心的运动员、教练员一起看直播。奶奶回忆他小时候“经常跟我上山种地、除草、打猪菜”。另一份报告称（引人民网广西2024年8月7日报道）：曹利国5岁时父母到南宁务工，他随祖父母在村里生活；该原文本次未能打开</w:t>
+      </w:r>
+      <w:r>
+        <w:rPr>
+          <w:rFonts w:ascii="Calibri" w:hAnsi="Calibri" w:eastAsia="微软雅黑" w:cs="Calibri"/>
+          <w:b/>
+          <w:bCs/>
+          <w:color w:val="C00000"/>
+          <w:sz w:val="21"/>
+          <w:szCs w:val="21"/>
+        </w:rPr>
+        <w:t xml:space="preserve">【待核实】</w:t>
+      </w:r>
+      <w:r>
+        <w:rPr>
+          <w:rFonts w:ascii="Calibri" w:hAnsi="Calibri" w:eastAsia="微软雅黑" w:cs="Calibri"/>
+          <w:sz w:val="21"/>
+          <w:szCs w:val="21"/>
+        </w:rPr>
+        <w:t xml:space="preserve">。父母职业、家庭经济状况、亲属是否从事体育，可核实的报道没有写</w:t>
       </w:r>
       <w:r>
         <w:rPr>
@@ -15797,7 +15830,7 @@
                 <w:sz w:val="18"/>
                 <w:szCs w:val="18"/>
               </w:rPr>
-              <w:t xml:space="preserve">约2004年（2026年2月报道为21岁），具体日期未取得</w:t>
+              <w:t xml:space="preserve">世界摔联资料显示22岁（2026年10月），具体出生日期未取得</w:t>
             </w:r>
             <w:r>
               <w:rPr>
@@ -15816,7 +15849,7 @@
                 <w:sz w:val="17"/>
                 <w:szCs w:val="17"/>
               </w:rPr>
-              <w:t xml:space="preserve">[29]</w:t>
+              <w:t xml:space="preserve">[29、42]</w:t>
             </w:r>
           </w:p>
         </w:tc>
@@ -16073,7 +16106,7 @@
                 <w:sz w:val="18"/>
                 <w:szCs w:val="18"/>
               </w:rPr>
-              <w:t xml:space="preserve">2023年世锦赛1/4决赛3∶1胜；巴黎决赛4∶1胜（澎湃作3∶1）</w:t>
+              <w:t xml:space="preserve">2023年世锦赛1/4决赛3∶1胜；巴黎决赛4∶1胜</w:t>
             </w:r>
             <w:r>
               <w:rPr>
@@ -16081,7 +16114,7 @@
                 <w:sz w:val="17"/>
                 <w:szCs w:val="17"/>
               </w:rPr>
-              <w:t xml:space="preserve">[32、33、34]</w:t>
+              <w:t xml:space="preserve">[32、41]</w:t>
             </w:r>
           </w:p>
         </w:tc>
@@ -16245,7 +16278,7 @@
                 <w:sz w:val="18"/>
                 <w:szCs w:val="18"/>
               </w:rPr>
-              <w:t xml:space="preserve">2025年世界冠军；2026年世锦赛铜牌</w:t>
+              <w:t xml:space="preserve">2025年世界冠军（哈萨克斯坦1999年后首个古典式世界冠军，决赛快速战胜加尼耶夫）；2026年世锦赛铜牌</w:t>
             </w:r>
             <w:r>
               <w:rPr>
@@ -16253,7 +16286,7 @@
                 <w:sz w:val="17"/>
                 <w:szCs w:val="17"/>
               </w:rPr>
-              <w:t xml:space="preserve">[9、26]</w:t>
+              <w:t xml:space="preserve">[9、26、44]</w:t>
             </w:r>
           </w:p>
         </w:tc>
@@ -16754,7 +16787,7 @@
                 <w:sz w:val="18"/>
                 <w:szCs w:val="18"/>
               </w:rPr>
-              <w:t xml:space="preserve">未取得</w:t>
+              <w:t xml:space="preserve">世界摔联资料显示21岁（2026年10月），具体出生日期未取得</w:t>
             </w:r>
             <w:r>
               <w:rPr>
@@ -16767,44 +16800,52 @@
               </w:rPr>
               <w:t xml:space="preserve">【待核实】</w:t>
             </w:r>
-          </w:p>
-        </w:tc>
-        <w:tc>
-          <w:tcPr>
-            <w:tcW w:w="2600" w:type="dxa"/>
-            <w:tcBorders>
-              <w:top w:val="single" w:color="BFBFBF" w:sz="4" w:space="0"/>
-              <w:left w:val="single" w:color="BFBFBF" w:sz="4" w:space="0"/>
-              <w:bottom w:val="single" w:color="BFBFBF" w:sz="4" w:space="0"/>
-              <w:right w:val="single" w:color="BFBFBF" w:sz="4" w:space="0"/>
-            </w:tcBorders>
-            <w:tcMar>
-              <w:top w:w="60" w:type="dxa"/>
-              <w:left w:w="90" w:type="dxa"/>
-              <w:bottom w:w="60" w:type="dxa"/>
-              <w:right w:w="90" w:type="dxa"/>
-            </w:tcMar>
-            <w:vAlign w:val="center"/>
-          </w:tcPr>
-          <w:p>
-            <w:pPr>
-              <w:spacing w:after="10" w:line="270" w:lineRule="auto"/>
-            </w:pPr>
-            <w:r>
-              <w:rPr>
-                <w:rFonts w:ascii="Calibri" w:hAnsi="Calibri" w:eastAsia="微软雅黑" w:cs="Calibri"/>
-                <w:sz w:val="18"/>
-                <w:szCs w:val="18"/>
-              </w:rPr>
-              <w:t xml:space="preserve">2026年亚锦赛铜牌、世锦赛银牌（决赛7∶5领先时被压倒）</w:t>
-            </w:r>
             <w:r>
               <w:rPr>
                 <w:rFonts w:ascii="Calibri" w:hAnsi="Calibri" w:eastAsia="微软雅黑" w:cs="Calibri"/>
                 <w:sz w:val="17"/>
                 <w:szCs w:val="17"/>
               </w:rPr>
-              <w:t xml:space="preserve">[26、27]</w:t>
+              <w:t xml:space="preserve">[42]</w:t>
+            </w:r>
+          </w:p>
+        </w:tc>
+        <w:tc>
+          <w:tcPr>
+            <w:tcW w:w="2600" w:type="dxa"/>
+            <w:tcBorders>
+              <w:top w:val="single" w:color="BFBFBF" w:sz="4" w:space="0"/>
+              <w:left w:val="single" w:color="BFBFBF" w:sz="4" w:space="0"/>
+              <w:bottom w:val="single" w:color="BFBFBF" w:sz="4" w:space="0"/>
+              <w:right w:val="single" w:color="BFBFBF" w:sz="4" w:space="0"/>
+            </w:tcBorders>
+            <w:tcMar>
+              <w:top w:w="60" w:type="dxa"/>
+              <w:left w:w="90" w:type="dxa"/>
+              <w:bottom w:w="60" w:type="dxa"/>
+              <w:right w:w="90" w:type="dxa"/>
+            </w:tcMar>
+            <w:vAlign w:val="center"/>
+          </w:tcPr>
+          <w:p>
+            <w:pPr>
+              <w:spacing w:after="10" w:line="270" w:lineRule="auto"/>
+            </w:pPr>
+            <w:r>
+              <w:rPr>
+                <w:rFonts w:ascii="Calibri" w:hAnsi="Calibri" w:eastAsia="微软雅黑" w:cs="Calibri"/>
+                <w:sz w:val="18"/>
+                <w:szCs w:val="18"/>
+              </w:rPr>
+              <w:t xml:space="preserve">2026年亚锦赛铜牌（1/4决赛2∶6负李世雄）；乌兰巴托排名赛冠军；世锦赛银牌（半决赛8∶3胜加尼耶夫，决赛7∶5领先时被压倒）；世界排名第18</w:t>
+            </w:r>
+            <w:r>
+              <w:rPr>
+                <w:rFonts w:ascii="Calibri" w:hAnsi="Calibri" w:eastAsia="微软雅黑" w:cs="Calibri"/>
+                <w:sz w:val="17"/>
+                <w:szCs w:val="17"/>
+              </w:rPr>
+              <w:t xml:space="preserve">[26、27、42]</w:t>
             </w:r>
           </w:p>
         </w:tc>
@@ -16866,18 +16907,15 @@
                 <w:sz w:val="18"/>
                 <w:szCs w:val="18"/>
               </w:rPr>
-              <w:t xml:space="preserve">未取得技术资料</w:t>
-            </w:r>
-            <w:r>
-              <w:rPr>
-                <w:rFonts w:ascii="Calibri" w:hAnsi="Calibri" w:eastAsia="微软雅黑" w:cs="Calibri"/>
-                <w:b/>
-                <w:bCs/>
-                <w:color w:val="C00000"/>
-                <w:sz w:val="18"/>
-                <w:szCs w:val="18"/>
-              </w:rPr>
-              <w:t xml:space="preserve">【待核实】</w:t>
+              <w:t xml:space="preserve">2026年9场比赛8胜1负，得71分、失14分</w:t>
+            </w:r>
+            <w:r>
+              <w:rPr>
+                <w:rFonts w:ascii="Calibri" w:hAnsi="Calibri" w:eastAsia="微软雅黑" w:cs="Calibri"/>
+                <w:sz w:val="17"/>
+                <w:szCs w:val="17"/>
+              </w:rPr>
+              <w:t xml:space="preserve">[42]</w:t>
             </w:r>
           </w:p>
         </w:tc>
@@ -17652,7 +17690,7 @@
                 <w:sz w:val="18"/>
                 <w:szCs w:val="18"/>
               </w:rPr>
-              <w:t xml:space="preserve">2026年全国锦标赛冠军</w:t>
+              <w:t xml:space="preserve">宝音吉雅（内蒙古队）</w:t>
             </w:r>
           </w:p>
         </w:tc>
@@ -17683,7 +17721,15 @@
                 <w:sz w:val="18"/>
                 <w:szCs w:val="18"/>
               </w:rPr>
-              <w:t xml:space="preserve">曹利国在该赛半决赛失利</w:t>
+              <w:t xml:space="preserve">2026年全国锦标赛冠军（曹利国在该赛半决赛失利）</w:t>
+            </w:r>
+            <w:r>
+              <w:rPr>
+                <w:rFonts w:ascii="Calibri" w:hAnsi="Calibri" w:eastAsia="微软雅黑" w:cs="Calibri"/>
+                <w:sz w:val="17"/>
+                <w:szCs w:val="17"/>
+              </w:rPr>
+              <w:t xml:space="preserve">[45、46]</w:t>
             </w:r>
           </w:p>
         </w:tc>
@@ -17714,7 +17760,7 @@
                 <w:sz w:val="18"/>
                 <w:szCs w:val="18"/>
               </w:rPr>
-              <w:t xml:space="preserve">冠军姓名的原始报道未能打开</w:t>
+              <w:t xml:space="preserve">年龄、教练未取得</w:t>
             </w:r>
             <w:r>
               <w:rPr>
@@ -17730,10 +17776,21 @@
             <w:r>
               <w:rPr>
                 <w:rFonts w:ascii="Calibri" w:hAnsi="Calibri" w:eastAsia="微软雅黑" w:cs="Calibri"/>
-                <w:sz w:val="17"/>
-                <w:szCs w:val="17"/>
-              </w:rPr>
-              <w:t xml:space="preserve">[2]</w:t>
+                <w:sz w:val="18"/>
+                <w:szCs w:val="18"/>
+              </w:rPr>
+              <w:t xml:space="preserve">；另一份报告称他2026年参加过布达佩斯排名赛，原文未核实</w:t>
+            </w:r>
+            <w:r>
+              <w:rPr>
+                <w:rFonts w:ascii="Calibri" w:hAnsi="Calibri" w:eastAsia="微软雅黑" w:cs="Calibri"/>
+                <w:b/>
+                <w:bCs/>
+                <w:color w:val="C00000"/>
+                <w:sz w:val="18"/>
+                <w:szCs w:val="18"/>
+              </w:rPr>
+              <w:t xml:space="preserve">【待核实】</w:t>
             </w:r>
           </w:p>
         </w:tc>
@@ -17881,7 +17938,7 @@
           <w:sz w:val="21"/>
           <w:szCs w:val="21"/>
         </w:rPr>
-        <w:t xml:space="preserve">谭浩东、吴皇胜和2026年全国锦标赛冠军的成绩变化。</w:t>
+        <w:t xml:space="preserve">谭浩东、吴皇胜、宝音吉雅的成绩变化。</w:t>
       </w:r>
     </w:p>
     <w:p>
@@ -18160,7 +18217,15 @@
                 <w:sz w:val="18"/>
                 <w:szCs w:val="18"/>
               </w:rPr>
-              <w:t xml:space="preserve">共1银4铜：曹利国古典式60公斤银（广西）、孟令哲古典式130公斤铜、冯紫琪女50公斤铜、庞倩玉女53公斤铜、洪可新女57公斤铜；男子自由式邹万浩（广西）57公斤、陆锋（广西）74公斤、邓志伟125公斤未进入奖牌轮[4、5、6]</w:t>
+              <w:t xml:space="preserve">共1银4铜：曹利国古典式60公斤银（广西）、孟令哲古典式130公斤铜、冯紫琪女50公斤铜、庞倩玉女53公斤铜、洪可新女57公斤铜；男子自由式邹万豪（广西，原稿误作“邹万浩”）57公斤、陆锋（广西）74公斤、邓志伟125公斤未进入奖牌轮</w:t>
+            </w:r>
+            <w:r>
+              <w:rPr>
+                <w:rFonts w:ascii="Calibri" w:hAnsi="Calibri" w:eastAsia="微软雅黑" w:cs="Calibri"/>
+                <w:sz w:val="17"/>
+                <w:szCs w:val="17"/>
+              </w:rPr>
+              <w:t xml:space="preserve">[4、5、6]</w:t>
             </w:r>
           </w:p>
         </w:tc>
@@ -19717,34 +19782,15 @@
           <w:sz w:val="21"/>
           <w:szCs w:val="21"/>
         </w:rPr>
-        <w:t xml:space="preserve">巴黎奥运会18个小项中，日本夺得8金居第1（男子4金、女子4金），美国夺得女子50公斤和68公斤2金；上表只列古典式6个小项，人名采用新华网译名，决赛比分据维基百科，60公斤比分存在不同说法，见3.2</w:t>
-      </w:r>
-      <w:r>
-        <w:rPr>
-          <w:rFonts w:ascii="Calibri" w:hAnsi="Calibri" w:eastAsia="微软雅黑" w:cs="Calibri"/>
-          <w:b/>
-          <w:bCs/>
-          <w:color w:val="C00000"/>
-          <w:sz w:val="21"/>
-          <w:szCs w:val="21"/>
-        </w:rPr>
-        <w:t xml:space="preserve">【待核实】</w:t>
-      </w:r>
-      <w:r>
-        <w:rPr>
-          <w:rFonts w:ascii="Calibri" w:hAnsi="Calibri" w:eastAsia="微软雅黑" w:cs="Calibri"/>
-          <w:sz w:val="21"/>
-          <w:szCs w:val="21"/>
-        </w:rPr>
-        <w:t xml:space="preserve">。</w:t>
-      </w:r>
-      <w:r>
-        <w:rPr>
-          <w:rFonts w:ascii="Calibri" w:hAnsi="Calibri" w:eastAsia="微软雅黑" w:cs="Calibri"/>
-          <w:sz w:val="21"/>
-          <w:szCs w:val="21"/>
-        </w:rPr>
-        <w:t xml:space="preserve">[6、38]</w:t>
+        <w:t xml:space="preserve">巴黎奥运会18个小项中，日本夺得8金居第1（男子4金、女子4金），美国夺得女子50公斤和68公斤2金；上表只列古典式6个小项，人名采用新华网译名，决赛比分据维基百科，60公斤比分据奥运会官方成绩。</w:t>
+      </w:r>
+      <w:r>
+        <w:rPr>
+          <w:rFonts w:ascii="Calibri" w:hAnsi="Calibri" w:eastAsia="微软雅黑" w:cs="Calibri"/>
+          <w:sz w:val="21"/>
+          <w:szCs w:val="21"/>
+        </w:rPr>
+        <w:t xml:space="preserve">[6、38、41]</w:t>
       </w:r>
     </w:p>
     <w:p>
@@ -20264,26 +20310,29 @@
           <w:sz w:val="19"/>
           <w:szCs w:val="19"/>
         </w:rPr>
-        <w:t xml:space="preserve">  世界摔跤联合会、国际奥委会。第三十四届奥运会资格体系·摔跤（2026年6月3日版，荷兰奥委会体育联合会网站转载，已读全文）；国际奥委会官网最新版本未能打开，原稿所称“2026年8月25日版”未核对</w:t>
-      </w:r>
-      <w:r>
-        <w:rPr>
-          <w:rFonts w:ascii="Calibri" w:hAnsi="Calibri" w:eastAsia="微软雅黑" w:cs="Calibri"/>
-          <w:b/>
-          <w:bCs/>
-          <w:color w:val="C00000"/>
-          <w:sz w:val="21"/>
-          <w:szCs w:val="21"/>
-        </w:rPr>
-        <w:t xml:space="preserve">【待核实】</w:t>
-      </w:r>
+        <w:t xml:space="preserve">  世界摔跤联合会、国际奥委会。第三十四届奥运会资格体系·摔跤（2026年6月3日版，荷兰奥委会体育联合会网站转载，已读全文）；（2026年8月13日版，国际奥委会官网，经浏览器插件摘录D.1.2至D.1.4和H节原文；另读6月3日版全文）。原稿所称“2026年8月25日版”未见。</w:t>
+      </w:r>
+    </w:p>
+    <w:p>
+      <w:pPr>
+        <w:spacing w:after="40" w:line="280" w:lineRule="auto"/>
+        <w:ind w:left="420" w:hanging="420"/>
+      </w:pPr>
       <w:r>
         <w:rPr>
           <w:rFonts w:ascii="Calibri" w:hAnsi="Calibri" w:eastAsia="微软雅黑" w:cs="Calibri"/>
           <w:sz w:val="19"/>
           <w:szCs w:val="19"/>
         </w:rPr>
-        <w:t xml:space="preserve">。</w:t>
+        <w:t xml:space="preserve">[2]</w:t>
+      </w:r>
+      <w:r>
+        <w:rPr>
+          <w:rFonts w:ascii="Calibri" w:hAnsi="Calibri" w:eastAsia="微软雅黑" w:cs="Calibri"/>
+          <w:sz w:val="19"/>
+          <w:szCs w:val="19"/>
+        </w:rPr>
+        <w:t xml:space="preserve">  龙孙网。广西“跤”傲！全国锦标赛拿下4金2银6铜（2026年5月24日），已读。</w:t>
       </w:r>
     </w:p>
     <w:p>
@@ -20297,7 +20346,7 @@
           <w:sz w:val="19"/>
           <w:szCs w:val="19"/>
         </w:rPr>
-        <w:t xml:space="preserve">[2]</w:t>
+        <w:t xml:space="preserve">[3]</w:t>
       </w:r>
       <w:r>
         <w:rPr>
@@ -20305,7 +20354,7 @@
           <w:sz w:val="19"/>
           <w:szCs w:val="19"/>
         </w:rPr>
-        <w:t xml:space="preserve">  龙孙网。广西“跤”傲！全国锦标赛拿下4金2银6铜（2026年5月24日），已读。</w:t>
+        <w:t xml:space="preserve">  世界摔跤联合会。2026年世界锦标赛领队手册（阿斯塔纳，2026年10月24日至11月1日），已读；原稿“麦纳麦”有误。</w:t>
       </w:r>
     </w:p>
     <w:p>
@@ -20319,15 +20368,21 @@
           <w:sz w:val="19"/>
           <w:szCs w:val="19"/>
         </w:rPr>
-        <w:t xml:space="preserve">[3]</w:t>
-      </w:r>
+        <w:t xml:space="preserve">[4]  人民日报。中国摔跤队收获一银一铜 延续佳绩 取得突破（2024年8月8日）。</w:t>
+      </w:r>
+    </w:p>
+    <w:p>
+      <w:pPr>
+        <w:spacing w:after="40" w:line="280" w:lineRule="auto"/>
+        <w:ind w:left="420" w:hanging="420"/>
+      </w:pPr>
       <w:r>
         <w:rPr>
           <w:rFonts w:ascii="Calibri" w:hAnsi="Calibri" w:eastAsia="微软雅黑" w:cs="Calibri"/>
           <w:sz w:val="19"/>
           <w:szCs w:val="19"/>
         </w:rPr>
-        <w:t xml:space="preserve">  世界摔跤联合会。2026年世界锦标赛领队手册（阿斯塔纳，2026年10月24日至11月1日），已读；原稿“麦纳麦”有误。</w:t>
+        <w:t xml:space="preserve">[5]  新华网。巴黎奥运会摔跤：洪可新获女子自由式57公斤铜牌（2024年8月9日）。</w:t>
       </w:r>
     </w:p>
     <w:p>
@@ -20341,7 +20396,7 @@
           <w:sz w:val="19"/>
           <w:szCs w:val="19"/>
         </w:rPr>
-        <w:t xml:space="preserve">[4]  人民日报。中国摔跤队收获一银一铜 延续佳绩 取得突破（2024年8月8日）。</w:t>
+        <w:t xml:space="preserve">[6]  新华网。巴黎奥运会摔跤成绩公报（2024年8月22日）。</w:t>
       </w:r>
     </w:p>
     <w:p>
@@ -20355,7 +20410,7 @@
           <w:sz w:val="19"/>
           <w:szCs w:val="19"/>
         </w:rPr>
-        <w:t xml:space="preserve">[5]  新华网。巴黎奥运会摔跤：洪可新获女子自由式57公斤铜牌（2024年8月9日）。</w:t>
+        <w:t xml:space="preserve">[7]  凤凰网。王娇伦敦奥运会17秒落败及其奥运历史（2012年）。</w:t>
       </w:r>
     </w:p>
     <w:p>
@@ -20369,7 +20424,7 @@
           <w:sz w:val="19"/>
           <w:szCs w:val="19"/>
         </w:rPr>
-        <w:t xml:space="preserve">[6]  新华网。巴黎奥运会摔跤成绩公报（2024年8月22日）。</w:t>
+        <w:t xml:space="preserve">[8]  新浪体育。中国摔跤队奥运历史与里约备战（2016年7月14日）。</w:t>
       </w:r>
     </w:p>
     <w:p>
@@ -20383,7 +20438,7 @@
           <w:sz w:val="19"/>
           <w:szCs w:val="19"/>
         </w:rPr>
-        <w:t xml:space="preserve">[7]  凤凰网。王娇伦敦奥运会17秒落败及其奥运历史（2012年）。</w:t>
+        <w:t xml:space="preserve">[9]  维基百科“2025年世界摔跤锦标赛”及“男子古典式60公斤”词条（各级别奖牌、名次与国别，单一来源）。</w:t>
       </w:r>
     </w:p>
     <w:p>
@@ -20397,7 +20452,7 @@
           <w:sz w:val="19"/>
           <w:szCs w:val="19"/>
         </w:rPr>
-        <w:t xml:space="preserve">[8]  新浪体育。中国摔跤队奥运历史与里约备战（2016年7月14日）。</w:t>
+        <w:t xml:space="preserve">[10]  新华网。摔跤亚锦赛：中国女队5金收官 收获团体总冠军（2026年4月10日）。</w:t>
       </w:r>
     </w:p>
     <w:p>
@@ -20411,7 +20466,7 @@
           <w:sz w:val="19"/>
           <w:szCs w:val="19"/>
         </w:rPr>
-        <w:t xml:space="preserve">[9]  维基百科“2025年世界摔跤锦标赛”及“男子古典式60公斤”词条（各级别奖牌、名次与国别，单一来源）。</w:t>
+        <w:t xml:space="preserve">[11]  新华网。亚运会摔跤收官：洪可新夺金（2026年10月3日）；亚运会摔跤开赛 中国队首日摘两铜（2026年9月30日）；佈和额尔敦摘银（2026年10月2日）。</w:t>
       </w:r>
     </w:p>
     <w:p>
@@ -20425,7 +20480,15 @@
           <w:sz w:val="19"/>
           <w:szCs w:val="19"/>
         </w:rPr>
-        <w:t xml:space="preserve">[10]  新华网。摔跤亚锦赛：中国女队5金收官 收获团体总冠军（2026年4月10日）。</w:t>
+        <w:t xml:space="preserve">[12]</w:t>
+      </w:r>
+      <w:r>
+        <w:rPr>
+          <w:rFonts w:ascii="Calibri" w:hAnsi="Calibri" w:eastAsia="微软雅黑" w:cs="Calibri"/>
+          <w:sz w:val="19"/>
+          <w:szCs w:val="19"/>
+        </w:rPr>
+        <w:t xml:space="preserve">  新华网。全运会：邓志伟三连冠 奥运银牌得主曹利国圆梦全运会（2025年11月12日），已读。</w:t>
       </w:r>
     </w:p>
     <w:p>
@@ -20439,7 +20502,15 @@
           <w:sz w:val="19"/>
           <w:szCs w:val="19"/>
         </w:rPr>
-        <w:t xml:space="preserve">[11]  新华网。亚运会摔跤收官：洪可新夺金（2026年10月3日）；亚运会摔跤开赛 中国队首日摘两铜（2026年9月30日）；佈和额尔敦摘银（2026年10月2日）。</w:t>
+        <w:t xml:space="preserve">[13]</w:t>
+      </w:r>
+      <w:r>
+        <w:rPr>
+          <w:rFonts w:ascii="Calibri" w:hAnsi="Calibri" w:eastAsia="微软雅黑" w:cs="Calibri"/>
+          <w:sz w:val="19"/>
+          <w:szCs w:val="19"/>
+        </w:rPr>
+        <w:t xml:space="preserve">  维基百科“曹利国”词条（出生日期、身高、教练拼音“Li Shujin”，援引杭州亚运会官方运动员资料，单一来源；该官方页存档为404）。</w:t>
       </w:r>
     </w:p>
     <w:p>
@@ -20453,15 +20524,29 @@
           <w:sz w:val="19"/>
           <w:szCs w:val="19"/>
         </w:rPr>
-        <w:t xml:space="preserve">[12]</w:t>
-      </w:r>
+        <w:t xml:space="preserve">[14]  桂林生活网。李雨萱荣获2026年亚洲摔跤锦标赛女子自由式55公斤级亚军（2026年）。</w:t>
+      </w:r>
+    </w:p>
+    <w:p>
+      <w:pPr>
+        <w:spacing w:after="40" w:line="280" w:lineRule="auto"/>
+        <w:ind w:left="420" w:hanging="420"/>
+      </w:pPr>
       <w:r>
         <w:rPr>
           <w:rFonts w:ascii="Calibri" w:hAnsi="Calibri" w:eastAsia="微软雅黑" w:cs="Calibri"/>
           <w:sz w:val="19"/>
           <w:szCs w:val="19"/>
         </w:rPr>
-        <w:t xml:space="preserve">  新华网。全运会：邓志伟三连冠 奥运银牌得主曹利国圆梦全运会（2025年11月12日），已读。</w:t>
+        <w:t xml:space="preserve">[15]</w:t>
+      </w:r>
+      <w:r>
+        <w:rPr>
+          <w:rFonts w:ascii="Calibri" w:hAnsi="Calibri" w:eastAsia="微软雅黑" w:cs="Calibri"/>
+          <w:sz w:val="19"/>
+          <w:szCs w:val="19"/>
+        </w:rPr>
+        <w:t xml:space="preserve">  维基百科“邹万豪”词条（原稿作“邹万浩”，据中新社、南国早报等更正为“邹万豪”；出生日期、成绩，单一来源）。</w:t>
       </w:r>
     </w:p>
     <w:p>
@@ -20475,15 +20560,29 @@
           <w:sz w:val="19"/>
           <w:szCs w:val="19"/>
         </w:rPr>
-        <w:t xml:space="preserve">[13]</w:t>
-      </w:r>
+        <w:t xml:space="preserve">[16]  新华网。名将洪可新领衔 多名新人迎首秀——2025摔跤世锦赛中国队前瞻（2025年9月11日）。</w:t>
+      </w:r>
+    </w:p>
+    <w:p>
+      <w:pPr>
+        <w:spacing w:after="40" w:line="280" w:lineRule="auto"/>
+        <w:ind w:left="420" w:hanging="420"/>
+      </w:pPr>
       <w:r>
         <w:rPr>
           <w:rFonts w:ascii="Calibri" w:hAnsi="Calibri" w:eastAsia="微软雅黑" w:cs="Calibri"/>
           <w:sz w:val="19"/>
           <w:szCs w:val="19"/>
         </w:rPr>
-        <w:t xml:space="preserve">  维基百科“曹利国”词条（出生日期、身高、教练拼音“Li Shujin”，援引杭州亚运会官方运动员资料，单一来源，官方原页未能打开）。</w:t>
+        <w:t xml:space="preserve">[17]</w:t>
+      </w:r>
+      <w:r>
+        <w:rPr>
+          <w:rFonts w:ascii="Calibri" w:hAnsi="Calibri" w:eastAsia="微软雅黑" w:cs="Calibri"/>
+          <w:sz w:val="19"/>
+          <w:szCs w:val="19"/>
+        </w:rPr>
+        <w:t xml:space="preserve">  国家体育总局举重摔跤柔道运动管理中心。摔跤项目2026年名古屋亚运会及世界摔跤锦标赛参赛运动员和教练员选拔办法（征求意见稿，举摔柔字〔2026〕73号，2026年3月30日；委托方提供的文件，已读全文）。</w:t>
       </w:r>
     </w:p>
     <w:p>
@@ -20497,7 +20596,7 @@
           <w:sz w:val="19"/>
           <w:szCs w:val="19"/>
         </w:rPr>
-        <w:t xml:space="preserve">[14]  桂林生活网。李雨萱荣获2026年亚洲摔跤锦标赛女子自由式55公斤级亚军（2026年）。</w:t>
+        <w:t xml:space="preserve">[18]  国家体育总局举摔柔中心。关于征求2016年奥运会运动员选拔办法意见的通知，附国家摔跤队参加2016年奥运会运动员选拔办法（征求意见稿，2015年8月18日，委托方提供的文件，已读全文）。</w:t>
       </w:r>
     </w:p>
     <w:p>
@@ -20511,7 +20610,7 @@
           <w:sz w:val="19"/>
           <w:szCs w:val="19"/>
         </w:rPr>
-        <w:t xml:space="preserve">[15]  维基百科“邹万浩”词条（出生日期、成绩，单一来源）。</w:t>
+        <w:t xml:space="preserve">[19]  国家体育总局举摔柔中心。摔跤项目巴黎奥运会参赛选拔办法（委托方提供的文件，已读全文）。</w:t>
       </w:r>
     </w:p>
     <w:p>
@@ -20525,7 +20624,7 @@
           <w:sz w:val="19"/>
           <w:szCs w:val="19"/>
         </w:rPr>
-        <w:t xml:space="preserve">[16]  新华网。名将洪可新领衔 多名新人迎首秀——2025摔跤世锦赛中国队前瞻（2025年9月11日）。</w:t>
+        <w:t xml:space="preserve">[20]  国家体育总局举摔柔中心。中国摔跤队参加2023年世锦赛和杭州亚运会选拔办法（2022年11月28日，委托方提供的文件，已读全文）。</w:t>
       </w:r>
     </w:p>
     <w:p>
@@ -20539,7 +20638,7 @@
           <w:sz w:val="19"/>
           <w:szCs w:val="19"/>
         </w:rPr>
-        <w:t xml:space="preserve">[17]  国家体育总局举重摔跤柔道运动管理中心。摔跤项目2026年名古屋亚运会及世界摔跤锦标赛参赛运动员和教练员选拔办法（征求意见稿，委托方提供的文件，已读全文）。</w:t>
+        <w:t xml:space="preserve">[21]  国家体育总局举摔柔中心。2026年亚洲摔跤锦标赛参赛运动员选拔办法（征求意见稿，委托方提供的文件，已读全文）。</w:t>
       </w:r>
     </w:p>
     <w:p>
@@ -20553,7 +20652,15 @@
           <w:sz w:val="19"/>
           <w:szCs w:val="19"/>
         </w:rPr>
-        <w:t xml:space="preserve">[18]  国家体育总局举摔柔中心。关于征求2016年奥运会运动员选拔办法意见的通知，附国家摔跤队参加2016年奥运会运动员选拔办法（征求意见稿，2015年8月18日，委托方提供的文件，已读全文）。</w:t>
+        <w:t xml:space="preserve">[22]</w:t>
+      </w:r>
+      <w:r>
+        <w:rPr>
+          <w:rFonts w:ascii="Calibri" w:hAnsi="Calibri" w:eastAsia="微软雅黑" w:cs="Calibri"/>
+          <w:sz w:val="19"/>
+          <w:szCs w:val="19"/>
+        </w:rPr>
+        <w:t xml:space="preserve">  世界摔跤联合会。国际摔跤规则（2026年1月版），已读第7、8、11、12、22、27、29、31、38、41至46条。</w:t>
       </w:r>
     </w:p>
     <w:p>
@@ -20567,7 +20674,15 @@
           <w:sz w:val="19"/>
           <w:szCs w:val="19"/>
         </w:rPr>
-        <w:t xml:space="preserve">[19]  国家体育总局举摔柔中心。摔跤项目巴黎奥运会参赛选拔办法（委托方提供的文件，已读全文）。</w:t>
+        <w:t xml:space="preserve">[23]</w:t>
+      </w:r>
+      <w:r>
+        <w:rPr>
+          <w:rFonts w:ascii="Calibri" w:hAnsi="Calibri" w:eastAsia="微软雅黑" w:cs="Calibri"/>
+          <w:sz w:val="19"/>
+          <w:szCs w:val="19"/>
+        </w:rPr>
+        <w:t xml:space="preserve">  世界摔跤联合会。UWW Announces New Olympic Qualification Process for LA 2028（2026年2月2日），已读。</w:t>
       </w:r>
     </w:p>
     <w:p>
@@ -20581,7 +20696,15 @@
           <w:sz w:val="19"/>
           <w:szCs w:val="19"/>
         </w:rPr>
-        <w:t xml:space="preserve">[20]  国家体育总局举摔柔中心。中国摔跤队参加2023年世锦赛和杭州亚运会选拔办法（2022年11月28日，委托方提供的文件，已读全文）。</w:t>
+        <w:t xml:space="preserve">[24]</w:t>
+      </w:r>
+      <w:r>
+        <w:rPr>
+          <w:rFonts w:ascii="Calibri" w:hAnsi="Calibri" w:eastAsia="微软雅黑" w:cs="Calibri"/>
+          <w:sz w:val="19"/>
+          <w:szCs w:val="19"/>
+        </w:rPr>
+        <w:t xml:space="preserve">  世界摔跤联合会。排名规则手册（2024年版），已读。</w:t>
       </w:r>
     </w:p>
     <w:p>
@@ -20595,7 +20718,15 @@
           <w:sz w:val="19"/>
           <w:szCs w:val="19"/>
         </w:rPr>
-        <w:t xml:space="preserve">[21]  国家体育总局举摔柔中心。2026年亚洲摔跤锦标赛参赛运动员选拔办法（征求意见稿，委托方提供的文件，已读全文）。</w:t>
+        <w:t xml:space="preserve">[25]</w:t>
+      </w:r>
+      <w:r>
+        <w:rPr>
+          <w:rFonts w:ascii="Calibri" w:hAnsi="Calibri" w:eastAsia="微软雅黑" w:cs="Calibri"/>
+          <w:sz w:val="19"/>
+          <w:szCs w:val="19"/>
+        </w:rPr>
+        <w:t xml:space="preserve">  世界摔跤联合会。致各会员协会通函：奥运会资格赛与2024年排名体系（2023年11月21日），已读。</w:t>
       </w:r>
     </w:p>
     <w:p>
@@ -20609,7 +20740,7 @@
           <w:sz w:val="19"/>
           <w:szCs w:val="19"/>
         </w:rPr>
-        <w:t xml:space="preserve">[22]</w:t>
+        <w:t xml:space="preserve">[26]</w:t>
       </w:r>
       <w:r>
         <w:rPr>
@@ -20617,7 +20748,7 @@
           <w:sz w:val="19"/>
           <w:szCs w:val="19"/>
         </w:rPr>
-        <w:t xml:space="preserve">  世界摔跤联合会。国际摔跤规则（2026年1月版），已读第7、8、11、12、22、27、29、31、38、41至46条。</w:t>
+        <w:t xml:space="preserve">  世界摔跤联合会官方成绩系统。2026年世锦赛古典式60公斤签表（2026年10月25日生成），已读。</w:t>
       </w:r>
     </w:p>
     <w:p>
@@ -20631,7 +20762,7 @@
           <w:sz w:val="19"/>
           <w:szCs w:val="19"/>
         </w:rPr>
-        <w:t xml:space="preserve">[23]</w:t>
+        <w:t xml:space="preserve">[27]</w:t>
       </w:r>
       <w:r>
         <w:rPr>
@@ -20639,7 +20770,7 @@
           <w:sz w:val="19"/>
           <w:szCs w:val="19"/>
         </w:rPr>
-        <w:t xml:space="preserve">  世界摔跤联合会。UWW Announces New Olympic Qualification Process for LA 2028（2026年2月2日），已读。</w:t>
+        <w:t xml:space="preserve">  世界摔跤联合会官方成绩系统。2026年亚锦赛古典式60公斤签表；2026年亚运会古典式60公斤签表，均已读。</w:t>
       </w:r>
     </w:p>
     <w:p>
@@ -20653,7 +20784,7 @@
           <w:sz w:val="19"/>
           <w:szCs w:val="19"/>
         </w:rPr>
-        <w:t xml:space="preserve">[24]</w:t>
+        <w:t xml:space="preserve">[28]</w:t>
       </w:r>
       <w:r>
         <w:rPr>
@@ -20661,7 +20792,7 @@
           <w:sz w:val="19"/>
           <w:szCs w:val="19"/>
         </w:rPr>
-        <w:t xml:space="preserve">  世界摔跤联合会。排名规则手册（2024年版），已读。</w:t>
+        <w:t xml:space="preserve">  世界摔跤联合会。World Championships 2026: Greco-Roman Entries（2026年10月），已读。</w:t>
       </w:r>
     </w:p>
     <w:p>
@@ -20675,7 +20806,7 @@
           <w:sz w:val="19"/>
           <w:szCs w:val="19"/>
         </w:rPr>
-        <w:t xml:space="preserve">[25]</w:t>
+        <w:t xml:space="preserve">[29]</w:t>
       </w:r>
       <w:r>
         <w:rPr>
@@ -20683,7 +20814,7 @@
           <w:sz w:val="19"/>
           <w:szCs w:val="19"/>
         </w:rPr>
-        <w:t xml:space="preserve">  世界摔跤联合会。致各会员协会通函：奥运会资格赛与2024年排名体系（2023年11月21日），已读。</w:t>
+        <w:t xml:space="preserve">  世界摔跤联合会。Gomi Takes Big Strides as Japan’s Next Greco-Roman Hope（2026年2月18日），已读。</w:t>
       </w:r>
     </w:p>
     <w:p>
@@ -20697,7 +20828,7 @@
           <w:sz w:val="19"/>
           <w:szCs w:val="19"/>
         </w:rPr>
-        <w:t xml:space="preserve">[26]</w:t>
+        <w:t xml:space="preserve">[30]</w:t>
       </w:r>
       <w:r>
         <w:rPr>
@@ -20705,7 +20836,7 @@
           <w:sz w:val="19"/>
           <w:szCs w:val="19"/>
         </w:rPr>
-        <w:t xml:space="preserve">  世界摔跤联合会官方成绩系统。2026年世锦赛古典式60公斤签表（2026年10月25日生成），已读。</w:t>
+        <w:t xml:space="preserve">  世界摔跤联合会。Fumita Earns Ticket to Worlds, Higuchi Surprisingly Takes a Pass（2026年5月22日），已读。</w:t>
       </w:r>
     </w:p>
     <w:p>
@@ -20719,7 +20850,7 @@
           <w:sz w:val="19"/>
           <w:szCs w:val="19"/>
         </w:rPr>
-        <w:t xml:space="preserve">[27]</w:t>
+        <w:t xml:space="preserve">[31]</w:t>
       </w:r>
       <w:r>
         <w:rPr>
@@ -20727,7 +20858,7 @@
           <w:sz w:val="19"/>
           <w:szCs w:val="19"/>
         </w:rPr>
-        <w:t xml:space="preserve">  世界摔跤联合会官方成绩系统。2026年亚锦赛古典式60公斤签表；2026年亚运会古典式60公斤签表，均已读。</w:t>
+        <w:t xml:space="preserve">  中新社（网易转载）。曹利国奥运首战摘银：全村人都等着他回家（2024年8月7日），已读。</w:t>
       </w:r>
     </w:p>
     <w:p>
@@ -20741,7 +20872,7 @@
           <w:sz w:val="19"/>
           <w:szCs w:val="19"/>
         </w:rPr>
-        <w:t xml:space="preserve">[28]</w:t>
+        <w:t xml:space="preserve">[32]</w:t>
       </w:r>
       <w:r>
         <w:rPr>
@@ -20749,7 +20880,7 @@
           <w:sz w:val="19"/>
           <w:szCs w:val="19"/>
         </w:rPr>
-        <w:t xml:space="preserve">  世界摔跤联合会。World Championships 2026: Greco-Roman Entries（2026年10月），已读。</w:t>
+        <w:t xml:space="preserve">  南国早报。曹利国逐梦巴黎 逆转人生（2024年8月7日），已读。</w:t>
       </w:r>
     </w:p>
     <w:p>
@@ -20763,7 +20894,7 @@
           <w:sz w:val="19"/>
           <w:szCs w:val="19"/>
         </w:rPr>
-        <w:t xml:space="preserve">[29]</w:t>
+        <w:t xml:space="preserve">[33]</w:t>
       </w:r>
       <w:r>
         <w:rPr>
@@ -20771,7 +20902,7 @@
           <w:sz w:val="19"/>
           <w:szCs w:val="19"/>
         </w:rPr>
-        <w:t xml:space="preserve">  世界摔跤联合会。Gomi Takes Big Strides as Japan’s Next Greco-Roman Hope（2026年2月18日），已读。</w:t>
+        <w:t xml:space="preserve">  新京报。输给日本选手不甘心，曹利国还想为中国摔跤再创历史（2024年8月7日），已读。</w:t>
       </w:r>
     </w:p>
     <w:p>
@@ -20785,7 +20916,7 @@
           <w:sz w:val="19"/>
           <w:szCs w:val="19"/>
         </w:rPr>
-        <w:t xml:space="preserve">[30]</w:t>
+        <w:t xml:space="preserve">[34]</w:t>
       </w:r>
       <w:r>
         <w:rPr>
@@ -20793,7 +20924,7 @@
           <w:sz w:val="19"/>
           <w:szCs w:val="19"/>
         </w:rPr>
-        <w:t xml:space="preserve">  世界摔跤联合会。Fumita Earns Ticket to Worlds, Higuchi Surprisingly Takes a Pass（2026年5月22日），已读。</w:t>
+        <w:t xml:space="preserve">  澎湃新闻。曹利国摘银！追平中国古典式摔跤奥运最佳战绩（2024年8月7日），已读。</w:t>
       </w:r>
     </w:p>
     <w:p>
@@ -20807,7 +20938,7 @@
           <w:sz w:val="19"/>
           <w:szCs w:val="19"/>
         </w:rPr>
-        <w:t xml:space="preserve">[31]</w:t>
+        <w:t xml:space="preserve">[35]</w:t>
       </w:r>
       <w:r>
         <w:rPr>
@@ -20815,7 +20946,7 @@
           <w:sz w:val="19"/>
           <w:szCs w:val="19"/>
         </w:rPr>
-        <w:t xml:space="preserve">  中新社（网易转载）。曹利国奥运首战摘银：全村人都等着他回家（2024年8月7日），已读。</w:t>
+        <w:t xml:space="preserve">  广西新闻网。曹利国亚锦赛摘铜！广西古典跤运动员时隔23年再登国际领奖台（2023年4月12日），已读。</w:t>
       </w:r>
     </w:p>
     <w:p>
@@ -20829,7 +20960,7 @@
           <w:sz w:val="19"/>
           <w:szCs w:val="19"/>
         </w:rPr>
-        <w:t xml:space="preserve">[32]</w:t>
+        <w:t xml:space="preserve">[36]</w:t>
       </w:r>
       <w:r>
         <w:rPr>
@@ -20837,7 +20968,7 @@
           <w:sz w:val="19"/>
           <w:szCs w:val="19"/>
         </w:rPr>
-        <w:t xml:space="preserve">  南国早报。曹利国逐梦巴黎 逆转人生（2024年8月7日），已读。</w:t>
+        <w:t xml:space="preserve">  新华社图片（腾讯新闻转载）。全运会｜摔跤——男子古典式60公斤级赛况（2025年11月12日），已读。</w:t>
       </w:r>
     </w:p>
     <w:p>
@@ -20851,7 +20982,7 @@
           <w:sz w:val="19"/>
           <w:szCs w:val="19"/>
         </w:rPr>
-        <w:t xml:space="preserve">[33]</w:t>
+        <w:t xml:space="preserve">[37]</w:t>
       </w:r>
       <w:r>
         <w:rPr>
@@ -20859,7 +20990,7 @@
           <w:sz w:val="19"/>
           <w:szCs w:val="19"/>
         </w:rPr>
-        <w:t xml:space="preserve">  新京报。输给日本选手不甘心，曹利国还想为中国摔跤再创历史（2024年8月7日），已读。</w:t>
+        <w:t xml:space="preserve">  中国教育在线。3连冠14连胜！湖北体育职业学院输送运动员谭浩东喜佩金腰带（2024年5月16日）；中新网湖北。荆门屈家岭小伙谭浩东勇夺男子古典式60公斤级银牌（2021年9月26日），均已读。</w:t>
       </w:r>
     </w:p>
     <w:p>
@@ -20873,7 +21004,7 @@
           <w:sz w:val="19"/>
           <w:szCs w:val="19"/>
         </w:rPr>
-        <w:t xml:space="preserve">[34]</w:t>
+        <w:t xml:space="preserve">[38]</w:t>
       </w:r>
       <w:r>
         <w:rPr>
@@ -20881,7 +21012,31 @@
           <w:sz w:val="19"/>
           <w:szCs w:val="19"/>
         </w:rPr>
-        <w:t xml:space="preserve">  澎湃新闻。曹利国摘银！追平中国古典式摔跤奥运最佳战绩（2024年8月7日），已读。</w:t>
+        <w:t xml:space="preserve">  维基百科：2023年世锦赛、2024年奥运会古典式各级别、2026年世锦赛和亚运会古典式60公斤，以及文田健一郎、苏尔坦加利、加尼耶夫、李世雄、沙尔申别科夫词条（出生日期与比分，单一来源；2026年比分已与</w:t>
+      </w:r>
+      <w:r>
+        <w:rPr>
+          <w:rFonts w:ascii="Calibri" w:hAnsi="Calibri" w:eastAsia="微软雅黑" w:cs="Calibri"/>
+          <w:sz w:val="19"/>
+          <w:szCs w:val="19"/>
+        </w:rPr>
+        <w:t xml:space="preserve">[26]</w:t>
+      </w:r>
+      <w:r>
+        <w:rPr>
+          <w:rFonts w:ascii="Calibri" w:hAnsi="Calibri" w:eastAsia="微软雅黑" w:cs="Calibri"/>
+          <w:sz w:val="19"/>
+          <w:szCs w:val="19"/>
+        </w:rPr>
+        <w:t xml:space="preserve">[27]</w:t>
+      </w:r>
+      <w:r>
+        <w:rPr>
+          <w:rFonts w:ascii="Calibri" w:hAnsi="Calibri" w:eastAsia="微软雅黑" w:cs="Calibri"/>
+          <w:sz w:val="19"/>
+          <w:szCs w:val="19"/>
+        </w:rPr>
+        <w:t xml:space="preserve">核对，亚运会谭浩东一场维基作3∶5，官方签表为1∶1，以官方为准）。</w:t>
       </w:r>
     </w:p>
     <w:p>
@@ -20895,7 +21050,7 @@
           <w:sz w:val="19"/>
           <w:szCs w:val="19"/>
         </w:rPr>
-        <w:t xml:space="preserve">[35]</w:t>
+        <w:t xml:space="preserve">[39]</w:t>
       </w:r>
       <w:r>
         <w:rPr>
@@ -20903,7 +21058,7 @@
           <w:sz w:val="19"/>
           <w:szCs w:val="19"/>
         </w:rPr>
-        <w:t xml:space="preserve">  广西新闻网。曹利国亚锦赛摘铜！广西古典跤运动员时隔23年再登国际领奖台（2023年4月12日），已读。</w:t>
+        <w:t xml:space="preserve">  日本摔跤协会。2025年U23全日本选手权古典式签表（“五味虹登”写法），已读。</w:t>
       </w:r>
     </w:p>
     <w:p>
@@ -20917,7 +21072,7 @@
           <w:sz w:val="19"/>
           <w:szCs w:val="19"/>
         </w:rPr>
-        <w:t xml:space="preserve">[36]</w:t>
+        <w:t xml:space="preserve">[40]</w:t>
       </w:r>
       <w:r>
         <w:rPr>
@@ -20925,7 +21080,7 @@
           <w:sz w:val="19"/>
           <w:szCs w:val="19"/>
         </w:rPr>
-        <w:t xml:space="preserve">  新华社图片（腾讯新闻转载）。全运会｜摔跤——男子古典式60公斤级赛况（2025年11月12日），已读。</w:t>
+        <w:t xml:space="preserve">  国际在线。巴黎奥运会摔跤银牌得主曹利国：给自己表现打9分 下一个目标是全运会（2024年8月13日），已读。</w:t>
       </w:r>
     </w:p>
     <w:p>
@@ -20939,7 +21094,7 @@
           <w:sz w:val="19"/>
           <w:szCs w:val="19"/>
         </w:rPr>
-        <w:t xml:space="preserve">[37]</w:t>
+        <w:t xml:space="preserve">[41]</w:t>
       </w:r>
       <w:r>
         <w:rPr>
@@ -20947,7 +21102,7 @@
           <w:sz w:val="19"/>
           <w:szCs w:val="19"/>
         </w:rPr>
-        <w:t xml:space="preserve">  中国教育在线。3连冠14连胜！湖北体育职业学院输送运动员谭浩东喜佩金腰带（2024年5月16日）；中新网湖北。荆门屈家岭小伙谭浩东勇夺男子古典式60公斤级银牌（2021年9月26日），均已读。</w:t>
+        <w:t xml:space="preserve">  奥运会官网。巴黎2024男子古典式60公斤成绩（逐场比分和分局比分），经浏览器插件摘录原文。</w:t>
       </w:r>
     </w:p>
     <w:p>
@@ -20961,7 +21116,7 @@
           <w:sz w:val="19"/>
           <w:szCs w:val="19"/>
         </w:rPr>
-        <w:t xml:space="preserve">[38]</w:t>
+        <w:t xml:space="preserve">[42]</w:t>
       </w:r>
       <w:r>
         <w:rPr>
@@ -20969,15 +21124,21 @@
           <w:sz w:val="19"/>
           <w:szCs w:val="19"/>
         </w:rPr>
-        <w:t xml:space="preserve">  维基百科：2023年世锦赛、2024年奥运会古典式各级别、2026年世锦赛和亚运会古典式60公斤，以及文田健一郎、苏尔坦加利、加尼耶夫、李世雄、沙尔申别科夫词条（出生日期与比分，单一来源；2026年比分已与</w:t>
-      </w:r>
+        <w:t xml:space="preserve">  世界摔跤联合会运动员资料：曹利国、五味虹登、艾哈迈迪·瓦法（2026年10月），经浏览器插件摘录原文。</w:t>
+      </w:r>
+    </w:p>
+    <w:p>
+      <w:pPr>
+        <w:spacing w:after="40" w:line="280" w:lineRule="auto"/>
+        <w:ind w:left="420" w:hanging="420"/>
+      </w:pPr>
       <w:r>
         <w:rPr>
           <w:rFonts w:ascii="Calibri" w:hAnsi="Calibri" w:eastAsia="微软雅黑" w:cs="Calibri"/>
           <w:sz w:val="19"/>
           <w:szCs w:val="19"/>
         </w:rPr>
-        <w:t xml:space="preserve">[26]</w:t>
+        <w:t xml:space="preserve">[43]</w:t>
       </w:r>
       <w:r>
         <w:rPr>
@@ -20985,15 +21146,29 @@
           <w:sz w:val="19"/>
           <w:szCs w:val="19"/>
         </w:rPr>
-        <w:t xml:space="preserve">[27]</w:t>
-      </w:r>
+        <w:t xml:space="preserve">  洛杉矶奥组委。按项目排的赛程第2版（2025年11月）；按场次排的赛程第4.0版（2026年7月29日），经浏览器插件摘录原文。</w:t>
+      </w:r>
+    </w:p>
+    <w:p>
+      <w:pPr>
+        <w:spacing w:after="40" w:line="280" w:lineRule="auto"/>
+        <w:ind w:left="420" w:hanging="420"/>
+      </w:pPr>
       <w:r>
         <w:rPr>
           <w:rFonts w:ascii="Calibri" w:hAnsi="Calibri" w:eastAsia="微软雅黑" w:cs="Calibri"/>
           <w:sz w:val="19"/>
           <w:szCs w:val="19"/>
         </w:rPr>
-        <w:t xml:space="preserve">核对，亚运会谭浩东一场维基作3∶5，官方签表为1∶1，以官方为准）。</w:t>
+        <w:t xml:space="preserve">[44]</w:t>
+      </w:r>
+      <w:r>
+        <w:rPr>
+          <w:rFonts w:ascii="Calibri" w:hAnsi="Calibri" w:eastAsia="微软雅黑" w:cs="Calibri"/>
+          <w:sz w:val="19"/>
+          <w:szCs w:val="19"/>
+        </w:rPr>
+        <w:t xml:space="preserve">  世界摔跤联合会。UWW History Makers of 2025: Kougioumtsidis, Reasco, Sultangali（2025年12月23日），已读。</w:t>
       </w:r>
     </w:p>
     <w:p>
@@ -21007,7 +21182,7 @@
           <w:sz w:val="19"/>
           <w:szCs w:val="19"/>
         </w:rPr>
-        <w:t xml:space="preserve">[39]</w:t>
+        <w:t xml:space="preserve">[45]</w:t>
       </w:r>
       <w:r>
         <w:rPr>
@@ -21015,7 +21190,7 @@
           <w:sz w:val="19"/>
           <w:szCs w:val="19"/>
         </w:rPr>
-        <w:t xml:space="preserve">  日本摔跤协会。2025年U23全日本选手权古典式签表（“五味虹登”写法），已读。</w:t>
+        <w:t xml:space="preserve">  广西新闻网。时隔9年，广西女子自由跤项目再夺全国冠军（2026年5月18日），已读。</w:t>
       </w:r>
     </w:p>
     <w:p>
@@ -21029,7 +21204,7 @@
           <w:sz w:val="19"/>
           <w:szCs w:val="19"/>
         </w:rPr>
-        <w:t xml:space="preserve">[40]</w:t>
+        <w:t xml:space="preserve">[46]</w:t>
       </w:r>
       <w:r>
         <w:rPr>
@@ -21037,7 +21212,51 @@
           <w:sz w:val="19"/>
           <w:szCs w:val="19"/>
         </w:rPr>
-        <w:t xml:space="preserve">  国际在线。巴黎奥运会摔跤银牌得主曹利国：给自己表现打9分 下一个目标是全运会（2024年8月13日），已读。</w:t>
+        <w:t xml:space="preserve">  人民网内蒙古。全国国际式摔跤锦标赛内蒙古队获3金2银7铜（2026年5月24日），经浏览器插件摘录原文。</w:t>
+      </w:r>
+    </w:p>
+    <w:p>
+      <w:pPr>
+        <w:spacing w:after="40" w:line="280" w:lineRule="auto"/>
+        <w:ind w:left="420" w:hanging="420"/>
+      </w:pPr>
+      <w:r>
+        <w:rPr>
+          <w:rFonts w:ascii="Calibri" w:hAnsi="Calibri" w:eastAsia="微软雅黑" w:cs="Calibri"/>
+          <w:sz w:val="19"/>
+          <w:szCs w:val="19"/>
+        </w:rPr>
+        <w:t xml:space="preserve">[47]</w:t>
+      </w:r>
+      <w:r>
+        <w:rPr>
+          <w:rFonts w:ascii="Calibri" w:hAnsi="Calibri" w:eastAsia="微软雅黑" w:cs="Calibri"/>
+          <w:sz w:val="19"/>
+          <w:szCs w:val="19"/>
+        </w:rPr>
+        <w:t xml:space="preserve">  国家体育总局举摔柔中心。关于摔跤项目参加名古屋亚运会运动员资格公示的通知（举摔柔字〔2026〕167号，2026年6月24日），经浏览器插件摘录。</w:t>
+      </w:r>
+    </w:p>
+    <w:p>
+      <w:pPr>
+        <w:spacing w:after="40" w:line="280" w:lineRule="auto"/>
+        <w:ind w:left="420" w:hanging="420"/>
+      </w:pPr>
+      <w:r>
+        <w:rPr>
+          <w:rFonts w:ascii="Calibri" w:hAnsi="Calibri" w:eastAsia="微软雅黑" w:cs="Calibri"/>
+          <w:sz w:val="19"/>
+          <w:szCs w:val="19"/>
+        </w:rPr>
+        <w:t xml:space="preserve">[48]</w:t>
+      </w:r>
+      <w:r>
+        <w:rPr>
+          <w:rFonts w:ascii="Calibri" w:hAnsi="Calibri" w:eastAsia="微软雅黑" w:cs="Calibri"/>
+          <w:sz w:val="19"/>
+          <w:szCs w:val="19"/>
+        </w:rPr>
+        <w:t xml:space="preserve">  国家体育总局。第20届亚运会中国体育代表团名单（2026年9月7日），经浏览器插件摘录原文。</w:t>
       </w:r>
     </w:p>
     <w:sectPr>

</xml_diff>

<commit_message>
Correct coach and upbringing details from primary reports
Replace the unsupported 'Li Shujin' coach link with the coaches named in
five 2024 official/state-media reports, list conflicting start and
national-team years side by side, and add the People's Daily family
account as a single-source item.

Co-Authored-By: Claude Opus 5.5 <noreply@anthropic.com>
Claude-Session: https://claude.ai/code/session_01QJuodyHvSeVR7zYgSAMTnd
</commit_message>
<xml_diff>
--- a/广西队摔跤夺金情报研判_优化版.docx
+++ b/广西队摔跤夺金情报研判_优化版.docx
@@ -842,7 +842,7 @@
           <w:sz w:val="21"/>
           <w:szCs w:val="21"/>
         </w:rPr>
-        <w:t>15</w:t>
+        <w:t>16</w:t>
       </w:r>
     </w:p>
     <w:p>
@@ -875,7 +875,7 @@
           <w:sz w:val="21"/>
           <w:szCs w:val="21"/>
         </w:rPr>
-        <w:t>15</w:t>
+        <w:t>16</w:t>
       </w:r>
     </w:p>
     <w:p>
@@ -11179,34 +11179,15 @@
           <w:sz w:val="21"/>
           <w:szCs w:val="21"/>
         </w:rPr>
-        <w:t xml:space="preserve">没有任何公开资料证明家庭背景或人际关系影响了国家队选拔，本报告不作推断。从办法本身看：古典式和女子摔跤有85%的比赛成绩积分，另有15%由教练组评分，这15分是主观评分，主教练占40%；有公示、异议受理和监督小组；换人由选拔小组建议、领导小组批准。办法中古典式教练组有一名“黎淑金”（评分权重15%）；英文维基援引杭州亚运会官方运动员资料，写曹利国的教练为“Li Shujin”，与“黎淑金”拼音一致，很可能是同一人；但另一份报告称北海、百色等地方政府报道写作“李树金（北海市体校启蒙教练）”，这些原文本次未能打开，杭州亚运会官方资料页已失效（存档为404），两种写法谁对，仍</w:t>
-      </w:r>
-      <w:r>
-        <w:rPr>
-          <w:rFonts w:ascii="Calibri" w:hAnsi="Calibri" w:eastAsia="微软雅黑" w:cs="Calibri"/>
-          <w:b/>
-          <w:bCs/>
-          <w:color w:val="C00000"/>
-          <w:sz w:val="21"/>
-          <w:szCs w:val="21"/>
-        </w:rPr>
-        <w:t xml:space="preserve">【待核实】</w:t>
-      </w:r>
-      <w:r>
-        <w:rPr>
-          <w:rFonts w:ascii="Calibri" w:hAnsi="Calibri" w:eastAsia="微软雅黑" w:cs="Calibri"/>
-          <w:sz w:val="21"/>
-          <w:szCs w:val="21"/>
-        </w:rPr>
-        <w:t xml:space="preserve">。另据广西新闻网，曹利国在广西队的主管教练是易善军。积分、教练评分结果未公布，无法检验选拔是否受影响；建议向广西队索取。</w:t>
-      </w:r>
-      <w:r>
-        <w:rPr>
-          <w:rFonts w:ascii="Calibri" w:hAnsi="Calibri" w:eastAsia="微软雅黑" w:cs="Calibri"/>
-          <w:sz w:val="21"/>
-          <w:szCs w:val="21"/>
-        </w:rPr>
-        <w:t xml:space="preserve">[13、17、35]</w:t>
+        <w:t xml:space="preserve">没有任何公开资料证明家庭背景或人际关系影响了国家队选拔，本报告不作推断。从办法本身看：古典式和女子摔跤有85%的比赛成绩积分，另有15%由教练组评分，这15分是主观评分，主教练占40%；有公示、异议受理和监督小组；换人由选拔小组建议、领导小组批准。办法中古典式教练组有一名“黎淑金”（评分权重15%）。原稿称曹利国的启蒙教练为“李树金”，并认为可能与黎淑金是同一人；经查2024年8月7日北海市政府、百色市政府、凌云县政府、广西体育局和人民网广西的五篇报道，均未出现“李树金”或“黎淑金”：启蒙教练写作吴天应（百色市政府、人民网）或白运刚（北海市政府），在广西队的主教练为易善军。没有任何一手证据表明黎淑金与曹利国有带训关系，本报告撤回这一推测，不作推断。积分、教练评分结果未公布，无法检验选拔是否受影响；建议向广西队索取。</w:t>
+      </w:r>
+      <w:r>
+        <w:rPr>
+          <w:rFonts w:ascii="Calibri" w:hAnsi="Calibri" w:eastAsia="微软雅黑" w:cs="Calibri"/>
+          <w:sz w:val="21"/>
+          <w:szCs w:val="21"/>
+        </w:rPr>
+        <w:t xml:space="preserve">[17、49、50、51、53]</w:t>
       </w:r>
     </w:p>
     <w:p>
@@ -11624,15 +11605,72 @@
           <w:sz w:val="21"/>
           <w:szCs w:val="21"/>
         </w:rPr>
-        <w:t xml:space="preserve">1998年10月4日生（杭州亚运会官方资料，经维基转引），2028年奥运会时29岁；广西百色市凌云县加尤镇陇槐村人；身高165厘米；古典式60公斤；12岁开始练摔跤（同一来源）；由北海市体育运动学校输送广西摔跤队，2017年进入国家队；广西队主管教练易善军（2000年亚锦赛铜牌得主），广西三跤总教练李征宇；就读武汉体育学院。主要成绩：2021年全运会铜牌；2022年排名赛罗马尼亚站银牌、波兰站铜牌；2023年亚锦赛铜牌；2023年世锦赛铜牌（为中国拿到巴黎名额）；2023年杭州亚运会第7名（1/4决赛1∶3负乌兹别克斯坦巴赫罗莫夫，主管教练评价其“跪撑角度等技术细节方面稍弱于对手”）；2024年亚锦赛铜牌（维基，单一来源）；2024年巴黎奥运会银牌；2025年全运会金牌；2026年全国锦标赛铜牌、世锦赛第5名。性格与自评：易善军评价他“性格腼腆，但是领悟能力强……抗压能力非常强”；巴黎赛后他给自己打9分，称“跟对手在实力上还是有差距”。</w:t>
-      </w:r>
-      <w:r>
-        <w:rPr>
-          <w:rFonts w:ascii="Calibri" w:hAnsi="Calibri" w:eastAsia="微软雅黑" w:cs="Calibri"/>
-          <w:sz w:val="21"/>
-          <w:szCs w:val="21"/>
-        </w:rPr>
-        <w:t xml:space="preserve">[2、12、13、26、31、32、33、34、35、40]</w:t>
+        <w:t xml:space="preserve">1998年10月4日生（杭州亚运会官方资料，经维基转引；人民网、凌云县政府均写1998年出生），2028年奥运会时29岁；广西百色市凌云县加尤镇陇槐村人；身高165厘米（维基，单一来源）；古典式60公斤；就读武汉体育学院。成长路径：7岁（2005年）随父母到南宁上学；2008年在启蒙教练吴天应带领下开始古典式摔跤训练（人民网、百色市政府）；北海市政府则写他2010年被选入北海市体育运动学校，两说不一</w:t>
+      </w:r>
+      <w:r>
+        <w:rPr>
+          <w:rFonts w:ascii="Calibri" w:hAnsi="Calibri" w:eastAsia="微软雅黑" w:cs="Calibri"/>
+          <w:b/>
+          <w:bCs/>
+          <w:color w:val="C00000"/>
+          <w:sz w:val="21"/>
+          <w:szCs w:val="21"/>
+        </w:rPr>
+        <w:t xml:space="preserve">【待核实】</w:t>
+      </w:r>
+      <w:r>
+        <w:rPr>
+          <w:rFonts w:ascii="Calibri" w:hAnsi="Calibri" w:eastAsia="微软雅黑" w:cs="Calibri"/>
+          <w:sz w:val="21"/>
+          <w:szCs w:val="21"/>
+        </w:rPr>
+        <w:t xml:space="preserve">；2014年4月由北海体校输送广西重竞技运动发展中心古典式摔跤队（北海市政府）；进入国家队的时间，中新社写2017年，百色市政府写2018年首次进入国家集训队，两说不一</w:t>
+      </w:r>
+      <w:r>
+        <w:rPr>
+          <w:rFonts w:ascii="Calibri" w:hAnsi="Calibri" w:eastAsia="微软雅黑" w:cs="Calibri"/>
+          <w:b/>
+          <w:bCs/>
+          <w:color w:val="C00000"/>
+          <w:sz w:val="21"/>
+          <w:szCs w:val="21"/>
+        </w:rPr>
+        <w:t xml:space="preserve">【待核实】</w:t>
+      </w:r>
+      <w:r>
+        <w:rPr>
+          <w:rFonts w:ascii="Calibri" w:hAnsi="Calibri" w:eastAsia="微软雅黑" w:cs="Calibri"/>
+          <w:sz w:val="21"/>
+          <w:szCs w:val="21"/>
+        </w:rPr>
+        <w:t xml:space="preserve">。教练：启蒙教练有两种说法，百色市政府和人民网写吴天应（凌云人，自曹利国7岁起带训），北海市政府写白运刚；北海体校摔跤队教练李有康也受访谈及他；英文维基援引杭州亚运会官方资料写作“Li Shujin”，该官方页已失效，原稿“李树金”没有一手来源</w:t>
+      </w:r>
+      <w:r>
+        <w:rPr>
+          <w:rFonts w:ascii="Calibri" w:hAnsi="Calibri" w:eastAsia="微软雅黑" w:cs="Calibri"/>
+          <w:b/>
+          <w:bCs/>
+          <w:color w:val="C00000"/>
+          <w:sz w:val="21"/>
+          <w:szCs w:val="21"/>
+        </w:rPr>
+        <w:t xml:space="preserve">【待核实】</w:t>
+      </w:r>
+      <w:r>
+        <w:rPr>
+          <w:rFonts w:ascii="Calibri" w:hAnsi="Calibri" w:eastAsia="微软雅黑" w:cs="Calibri"/>
+          <w:sz w:val="21"/>
+          <w:szCs w:val="21"/>
+        </w:rPr>
+        <w:t xml:space="preserve">；广西古典式摔跤队主教练易善军（2000年亚锦赛铜牌得主），广西三跤总教练李征宇。主要成绩：2021年全运会铜牌；2022年排名赛罗马尼亚站银牌、波兰站铜牌；2023年亚锦赛铜牌；2023年世锦赛铜牌（为中国拿到巴黎名额）；2023年杭州亚运会第7名（1/4决赛1∶3负乌兹别克斯坦巴赫罗莫夫，主管教练评价其“跪撑角度等技术细节方面稍弱于对手”）；2024年亚锦赛铜牌（维基，单一来源）；2024年巴黎奥运会银牌；2025年全运会金牌；2026年全国锦标赛铜牌、世锦赛第5名。性格与自评：易善军评价他“性格腼腆，但是领悟能力强……抗压能力非常强”；北海体校教练李有康评价他“不畏强敌、不怕失败”；巴黎赛后他给自己打9分，称“跟对手在实力上还是有差距”。</w:t>
+      </w:r>
+      <w:r>
+        <w:rPr>
+          <w:rFonts w:ascii="Calibri" w:hAnsi="Calibri" w:eastAsia="微软雅黑" w:cs="Calibri"/>
+          <w:sz w:val="21"/>
+          <w:szCs w:val="21"/>
+        </w:rPr>
+        <w:t xml:space="preserve">[2、12、13、26、31、33、34、35、40、49、50、51、52、53]</w:t>
       </w:r>
     </w:p>
     <w:p>
@@ -13879,15 +13917,15 @@
           <w:sz w:val="21"/>
           <w:szCs w:val="21"/>
         </w:rPr>
-        <w:t xml:space="preserve">可核实部分（中新社2024年8月7日报道）：</w:t>
-      </w:r>
-      <w:r>
-        <w:rPr>
-          <w:rFonts w:ascii="Calibri" w:hAnsi="Calibri" w:eastAsia="微软雅黑" w:cs="Calibri"/>
-          <w:sz w:val="21"/>
-          <w:szCs w:val="21"/>
-        </w:rPr>
-        <w:t xml:space="preserve">父亲曹家佩，母亲田彩珍；奶奶田桂秀，堂兄曹顺国；老家广西百色市凌云县加尤镇陇槐村。巴黎决赛时，父母在南宁江南训练基地摔跤馆与广西重竞技运动发展中心的运动员、教练员一起看直播。奶奶回忆他小时候“经常跟我上山种地、除草、打猪菜”。另一份报告称（引人民网广西2024年8月7日报道）：曹利国5岁时父母到南宁务工，他随祖父母在村里生活；该原文本次未能打开</w:t>
+        <w:t xml:space="preserve">可核实部分：</w:t>
+      </w:r>
+      <w:r>
+        <w:rPr>
+          <w:rFonts w:ascii="Calibri" w:hAnsi="Calibri" w:eastAsia="微软雅黑" w:cs="Calibri"/>
+          <w:sz w:val="21"/>
+          <w:szCs w:val="21"/>
+        </w:rPr>
+        <w:t xml:space="preserve">父亲曹家佩，母亲田彩珍；奶奶田桂秀，堂兄曹顺国；老家广西百色市凌云县加尤镇陇槐村（中新社）。据人民网广西报道：受大石山区条件所限，曹利国5岁时父母到南宁务工，他与爷爷奶奶留在农村生活，农活是少年时代的日常；7岁（2005年）随父母到南宁上学，逢年过节回老家帮父母干农活；父亲一句“你这么爱运动，干脆把你送去练体育算了”成为他走上体育道路的转折；奶奶说他“一去北海体校就是三年没有回过家”（原文没有使用“留守”一词）。巴黎决赛时，父母在南宁江南训练基地摔跤馆与广西队教练员、运动员一起看直播（中新社、广西体育局）。以上5岁到7岁的经历只有人民网一个来源；父母的具体职业、家庭经济状况、亲属是否从事体育，报道没有写</w:t>
       </w:r>
       <w:r>
         <w:rPr>
@@ -13906,34 +13944,15 @@
           <w:sz w:val="21"/>
           <w:szCs w:val="21"/>
         </w:rPr>
-        <w:t xml:space="preserve">。父母职业、家庭经济状况、亲属是否从事体育，可核实的报道没有写</w:t>
-      </w:r>
-      <w:r>
-        <w:rPr>
-          <w:rFonts w:ascii="Calibri" w:hAnsi="Calibri" w:eastAsia="微软雅黑" w:cs="Calibri"/>
-          <w:b/>
-          <w:bCs/>
-          <w:color w:val="C00000"/>
-          <w:sz w:val="21"/>
-          <w:szCs w:val="21"/>
-        </w:rPr>
-        <w:t xml:space="preserve">【待核实】</w:t>
-      </w:r>
-      <w:r>
-        <w:rPr>
-          <w:rFonts w:ascii="Calibri" w:hAnsi="Calibri" w:eastAsia="微软雅黑" w:cs="Calibri"/>
-          <w:sz w:val="21"/>
-          <w:szCs w:val="21"/>
-        </w:rPr>
-        <w:t xml:space="preserve">；获取渠道：广西壮族自治区体育局、广西重竞技运动发展中心、运动员本人采访。</w:t>
-      </w:r>
-      <w:r>
-        <w:rPr>
-          <w:rFonts w:ascii="Calibri" w:hAnsi="Calibri" w:eastAsia="微软雅黑" w:cs="Calibri"/>
-          <w:sz w:val="21"/>
-          <w:szCs w:val="21"/>
-        </w:rPr>
-        <w:t xml:space="preserve">[31、32]</w:t>
+        <w:t xml:space="preserve">；获取渠道：广西重竞技运动发展中心、运动员本人或启蒙教练访谈。</w:t>
+      </w:r>
+      <w:r>
+        <w:rPr>
+          <w:rFonts w:ascii="Calibri" w:hAnsi="Calibri" w:eastAsia="微软雅黑" w:cs="Calibri"/>
+          <w:sz w:val="21"/>
+          <w:szCs w:val="21"/>
+        </w:rPr>
+        <w:t xml:space="preserve">[31、49、53]</w:t>
       </w:r>
     </w:p>
     <w:p>
@@ -20510,7 +20529,7 @@
           <w:sz w:val="19"/>
           <w:szCs w:val="19"/>
         </w:rPr>
-        <w:t xml:space="preserve">  维基百科“曹利国”词条（出生日期、身高、教练拼音“Li Shujin”，援引杭州亚运会官方运动员资料，单一来源；该官方页存档为404）。</w:t>
+        <w:t xml:space="preserve">  维基百科“曹利国”词条（出生日期、身高、教练拼音“Li Shujin”，援引杭州亚运会官方运动员资料，单一来源；该官方页存档为404，五篇国内官方或官媒报道均未出现此名）。</w:t>
       </w:r>
     </w:p>
     <w:p>
@@ -21257,6 +21276,116 @@
           <w:szCs w:val="19"/>
         </w:rPr>
         <w:t xml:space="preserve">  国家体育总局。第20届亚运会中国体育代表团名单（2026年9月7日），经浏览器插件摘录原文。</w:t>
+      </w:r>
+    </w:p>
+    <w:p>
+      <w:pPr>
+        <w:spacing w:after="40" w:line="280" w:lineRule="auto"/>
+        <w:ind w:left="420" w:hanging="420"/>
+      </w:pPr>
+      <w:r>
+        <w:rPr>
+          <w:rFonts w:ascii="Calibri" w:hAnsi="Calibri" w:eastAsia="微软雅黑" w:cs="Calibri"/>
+          <w:sz w:val="19"/>
+          <w:szCs w:val="19"/>
+        </w:rPr>
+        <w:t xml:space="preserve">[49]</w:t>
+      </w:r>
+      <w:r>
+        <w:rPr>
+          <w:rFonts w:ascii="Calibri" w:hAnsi="Calibri" w:eastAsia="微软雅黑" w:cs="Calibri"/>
+          <w:sz w:val="19"/>
+          <w:szCs w:val="19"/>
+        </w:rPr>
+        <w:t xml:space="preserve">  人民网广西频道。曹利国：从大山走向奥运会赛场（2024年8月7日），经浏览器插件摘录原文。</w:t>
+      </w:r>
+    </w:p>
+    <w:p>
+      <w:pPr>
+        <w:spacing w:after="40" w:line="280" w:lineRule="auto"/>
+        <w:ind w:left="420" w:hanging="420"/>
+      </w:pPr>
+      <w:r>
+        <w:rPr>
+          <w:rFonts w:ascii="Calibri" w:hAnsi="Calibri" w:eastAsia="微软雅黑" w:cs="Calibri"/>
+          <w:sz w:val="19"/>
+          <w:szCs w:val="19"/>
+        </w:rPr>
+        <w:t xml:space="preserve">[50]</w:t>
+      </w:r>
+      <w:r>
+        <w:rPr>
+          <w:rFonts w:ascii="Calibri" w:hAnsi="Calibri" w:eastAsia="微软雅黑" w:cs="Calibri"/>
+          <w:sz w:val="19"/>
+          <w:szCs w:val="19"/>
+        </w:rPr>
+        <w:t xml:space="preserve">  北海市融媒体中心（北海市人民政府网）。曹利国在巴黎奥运会斩获银牌（2024年8月7日），经浏览器插件摘录原文。</w:t>
+      </w:r>
+    </w:p>
+    <w:p>
+      <w:pPr>
+        <w:spacing w:after="40" w:line="280" w:lineRule="auto"/>
+        <w:ind w:left="420" w:hanging="420"/>
+      </w:pPr>
+      <w:r>
+        <w:rPr>
+          <w:rFonts w:ascii="Calibri" w:hAnsi="Calibri" w:eastAsia="微软雅黑" w:cs="Calibri"/>
+          <w:sz w:val="19"/>
+          <w:szCs w:val="19"/>
+        </w:rPr>
+        <w:t xml:space="preserve">[51]</w:t>
+      </w:r>
+      <w:r>
+        <w:rPr>
+          <w:rFonts w:ascii="Calibri" w:hAnsi="Calibri" w:eastAsia="微软雅黑" w:cs="Calibri"/>
+          <w:sz w:val="19"/>
+          <w:szCs w:val="19"/>
+        </w:rPr>
+        <w:t xml:space="preserve">  右江日报（百色市人民政府网）。百色籍选手曹利国获得巴黎奥运会男子古典式摔跤60公斤级银牌（2024年8月7日），经浏览器插件摘录原文。</w:t>
+      </w:r>
+    </w:p>
+    <w:p>
+      <w:pPr>
+        <w:spacing w:after="40" w:line="280" w:lineRule="auto"/>
+        <w:ind w:left="420" w:hanging="420"/>
+      </w:pPr>
+      <w:r>
+        <w:rPr>
+          <w:rFonts w:ascii="Calibri" w:hAnsi="Calibri" w:eastAsia="微软雅黑" w:cs="Calibri"/>
+          <w:sz w:val="19"/>
+          <w:szCs w:val="19"/>
+        </w:rPr>
+        <w:t xml:space="preserve">[52]</w:t>
+      </w:r>
+      <w:r>
+        <w:rPr>
+          <w:rFonts w:ascii="Calibri" w:hAnsi="Calibri" w:eastAsia="微软雅黑" w:cs="Calibri"/>
+          <w:sz w:val="19"/>
+          <w:szCs w:val="19"/>
+        </w:rPr>
+        <w:t xml:space="preserve">  凌云县人民政府办公室。凌云骄子曹利国：晋级巴黎奥运会决赛（2024年8月7日），经浏览器插件摘录原文。</w:t>
+      </w:r>
+    </w:p>
+    <w:p>
+      <w:pPr>
+        <w:spacing w:after="40" w:line="280" w:lineRule="auto"/>
+        <w:ind w:left="420" w:hanging="420"/>
+      </w:pPr>
+      <w:r>
+        <w:rPr>
+          <w:rFonts w:ascii="Calibri" w:hAnsi="Calibri" w:eastAsia="微软雅黑" w:cs="Calibri"/>
+          <w:sz w:val="19"/>
+          <w:szCs w:val="19"/>
+        </w:rPr>
+        <w:t xml:space="preserve">[53]</w:t>
+      </w:r>
+      <w:r>
+        <w:rPr>
+          <w:rFonts w:ascii="Calibri" w:hAnsi="Calibri" w:eastAsia="微软雅黑" w:cs="Calibri"/>
+          <w:sz w:val="19"/>
+          <w:szCs w:val="19"/>
+        </w:rPr>
+        <w:t xml:space="preserve">  广西重竞技运动发展中心（广西壮族自治区体育局网）。曹利国摘获银牌！广西摔跤项目首枚奥运奖牌诞生（2024年8月7日），经浏览器插件摘录原文。</w:t>
       </w:r>
     </w:p>
     <w:sectPr>

</xml_diff>

<commit_message>
Add 2027 observation checklist appendix to wrestling report
Lists dated checkpoints (selection rankings, 2027 ranking series, Asian
Championships, Las Vegas Worlds, quota confirmation dates) for validating
Cao Liguo's positioning as Guangxi's strongest gold contender.

Co-Authored-By: Claude Opus 5.5 <noreply@anthropic.com>
Claude-Session: https://claude.ai/code/session_01QJuodyHvSeVR7zYgSAMTnd
</commit_message>
<xml_diff>
--- a/广西队摔跤夺金情报研判_优化版.docx
+++ b/广西队摔跤夺金情报研判_优化版.docx
@@ -1296,7 +1296,7 @@
           <w:sz w:val="24"/>
           <w:szCs w:val="24"/>
         </w:rPr>
-        <w:t>参考文献</w:t>
+        <w:t>附录　2027年观察清单</w:t>
       </w:r>
       <w:r>
         <w:rPr>
@@ -1306,6 +1306,31 @@
         </w:rPr>
         <w:tab/>
         <w:t>22</w:t>
+      </w:r>
+    </w:p>
+    <w:p>
+      <w:pPr>
+        <w:tabs>
+          <w:tab w:val="right" w:leader="dot" w:pos="9638"/>
+        </w:tabs>
+        <w:spacing w:after="140"/>
+      </w:pPr>
+      <w:r>
+        <w:rPr>
+          <w:rFonts w:ascii="Calibri" w:hAnsi="Calibri" w:eastAsia="微软雅黑" w:cs="Calibri"/>
+          <w:sz w:val="24"/>
+          <w:szCs w:val="24"/>
+        </w:rPr>
+        <w:t>参考文献</w:t>
+      </w:r>
+      <w:r>
+        <w:rPr>
+          <w:rFonts w:ascii="Calibri" w:hAnsi="Calibri" w:eastAsia="微软雅黑" w:cs="Calibri"/>
+          <w:sz w:val="24"/>
+          <w:szCs w:val="24"/>
+        </w:rPr>
+        <w:tab/>
+        <w:t>23</w:t>
       </w:r>
       <w:r>
         <w:fldChar w:fldCharType="end"/>
@@ -20286,6 +20311,1610 @@
           <w:szCs w:val="21"/>
         </w:rPr>
         <w:t xml:space="preserve">。</w:t>
+      </w:r>
+    </w:p>
+    <w:p>
+      <w:pPr>
+        <w:pStyle w:val="2"/>
+        <w:keepNext/>
+        <w:pageBreakBefore/>
+        <w:pBdr>
+          <w:bottom w:val="single" w:color="1F3A5F" w:sz="6" w:space="2"/>
+        </w:pBdr>
+        <w:spacing w:before="280" w:after="120"/>
+      </w:pPr>
+      <w:r>
+        <w:rPr>
+          <w:rFonts w:ascii="Calibri" w:hAnsi="Calibri" w:eastAsia="微软雅黑" w:cs="Calibri"/>
+          <w:b/>
+          <w:bCs/>
+          <w:color w:val="1F3A5F"/>
+          <w:sz w:val="30"/>
+          <w:szCs w:val="30"/>
+        </w:rPr>
+        <w:t xml:space="preserve">附录　2027年观察清单</w:t>
+      </w:r>
+    </w:p>
+    <w:p>
+      <w:pPr>
+        <w:pStyle w:val="19"/>
+        <w:numPr>
+          <w:ilvl w:val="0"/>
+          <w:numId w:val="2"/>
+        </w:numPr>
+        <w:spacing w:after="60" w:line="320" w:lineRule="auto"/>
+      </w:pPr>
+      <w:r>
+        <w:rPr>
+          <w:rFonts w:ascii="Calibri" w:hAnsi="Calibri" w:eastAsia="微软雅黑" w:cs="Calibri"/>
+          <w:b/>
+          <w:bCs/>
+          <w:sz w:val="21"/>
+          <w:szCs w:val="21"/>
+        </w:rPr>
+        <w:t xml:space="preserve">用途：</w:t>
+      </w:r>
+      <w:r>
+        <w:rPr>
+          <w:rFonts w:ascii="Calibri" w:hAnsi="Calibri" w:eastAsia="微软雅黑" w:cs="Calibri"/>
+          <w:sz w:val="21"/>
+          <w:szCs w:val="21"/>
+        </w:rPr>
+        <w:t xml:space="preserve">本报告把曹利国定位为广西最强争金点。下表列出验证这一定位的时间节点，按时间顺序排列，每到一个节点就对照“看什么”一栏更新判断。</w:t>
+      </w:r>
+    </w:p>
+    <w:tbl>
+      <w:tblPr>
+        <w:tblStyle w:val="14"/>
+        <w:tblW w:w="9638" w:type="dxa"/>
+        <w:tblInd w:w="0" w:type="dxa"/>
+        <w:tblBorders>
+          <w:top w:val="single" w:color="auto" w:sz="4" w:space="0"/>
+          <w:left w:val="single" w:color="auto" w:sz="4" w:space="0"/>
+          <w:bottom w:val="single" w:color="auto" w:sz="4" w:space="0"/>
+          <w:right w:val="single" w:color="auto" w:sz="4" w:space="0"/>
+          <w:insideH w:val="single" w:color="auto" w:sz="4" w:space="0"/>
+          <w:insideV w:val="single" w:color="auto" w:sz="4" w:space="0"/>
+        </w:tblBorders>
+        <w:tblLayout w:type="fixed"/>
+        <w:tblCellMar>
+          <w:top w:w="0" w:type="dxa"/>
+          <w:left w:w="10" w:type="dxa"/>
+          <w:bottom w:w="0" w:type="dxa"/>
+          <w:right w:w="10" w:type="dxa"/>
+        </w:tblCellMar>
+      </w:tblPr>
+      <w:tblGrid>
+        <w:gridCol w:w="1700"/>
+        <w:gridCol w:w="2300"/>
+        <w:gridCol w:w="2900"/>
+        <w:gridCol w:w="2738"/>
+      </w:tblGrid>
+      <w:tr>
+        <w:trPr>
+          <w:cantSplit/>
+          <w:tblHeader/>
+        </w:trPr>
+        <w:tc>
+          <w:tcPr>
+            <w:tcW w:w="1700" w:type="dxa"/>
+            <w:tcBorders>
+              <w:top w:val="single" w:color="BFBFBF" w:sz="4" w:space="0"/>
+              <w:left w:val="single" w:color="BFBFBF" w:sz="4" w:space="0"/>
+              <w:bottom w:val="single" w:color="BFBFBF" w:sz="4" w:space="0"/>
+              <w:right w:val="single" w:color="BFBFBF" w:sz="4" w:space="0"/>
+            </w:tcBorders>
+            <w:shd w:val="clear" w:color="auto" w:fill="1F3A5F"/>
+            <w:tcMar>
+              <w:top w:w="60" w:type="dxa"/>
+              <w:left w:w="90" w:type="dxa"/>
+              <w:bottom w:w="60" w:type="dxa"/>
+              <w:right w:w="90" w:type="dxa"/>
+            </w:tcMar>
+            <w:vAlign w:val="center"/>
+          </w:tcPr>
+          <w:p>
+            <w:pPr>
+              <w:spacing w:after="10" w:line="270" w:lineRule="auto"/>
+            </w:pPr>
+            <w:r>
+              <w:rPr>
+                <w:rFonts w:ascii="Calibri" w:hAnsi="Calibri" w:eastAsia="微软雅黑" w:cs="Calibri"/>
+                <w:b/>
+                <w:bCs/>
+                <w:color w:val="FFFFFF"/>
+                <w:sz w:val="18"/>
+                <w:szCs w:val="18"/>
+              </w:rPr>
+              <w:t xml:space="preserve">时间</w:t>
+            </w:r>
+          </w:p>
+        </w:tc>
+        <w:tc>
+          <w:tcPr>
+            <w:tcW w:w="2300" w:type="dxa"/>
+            <w:tcBorders>
+              <w:top w:val="single" w:color="BFBFBF" w:sz="4" w:space="0"/>
+              <w:left w:val="single" w:color="BFBFBF" w:sz="4" w:space="0"/>
+              <w:bottom w:val="single" w:color="BFBFBF" w:sz="4" w:space="0"/>
+              <w:right w:val="single" w:color="BFBFBF" w:sz="4" w:space="0"/>
+            </w:tcBorders>
+            <w:shd w:val="clear" w:color="auto" w:fill="1F3A5F"/>
+            <w:tcMar>
+              <w:top w:w="60" w:type="dxa"/>
+              <w:left w:w="90" w:type="dxa"/>
+              <w:bottom w:w="60" w:type="dxa"/>
+              <w:right w:w="90" w:type="dxa"/>
+            </w:tcMar>
+            <w:vAlign w:val="center"/>
+          </w:tcPr>
+          <w:p>
+            <w:pPr>
+              <w:spacing w:after="10" w:line="270" w:lineRule="auto"/>
+            </w:pPr>
+            <w:r>
+              <w:rPr>
+                <w:rFonts w:ascii="Calibri" w:hAnsi="Calibri" w:eastAsia="微软雅黑" w:cs="Calibri"/>
+                <w:b/>
+                <w:bCs/>
+                <w:color w:val="FFFFFF"/>
+                <w:sz w:val="18"/>
+                <w:szCs w:val="18"/>
+              </w:rPr>
+              <w:t xml:space="preserve">观察节点</w:t>
+            </w:r>
+          </w:p>
+        </w:tc>
+        <w:tc>
+          <w:tcPr>
+            <w:tcW w:w="2900" w:type="dxa"/>
+            <w:tcBorders>
+              <w:top w:val="single" w:color="BFBFBF" w:sz="4" w:space="0"/>
+              <w:left w:val="single" w:color="BFBFBF" w:sz="4" w:space="0"/>
+              <w:bottom w:val="single" w:color="BFBFBF" w:sz="4" w:space="0"/>
+              <w:right w:val="single" w:color="BFBFBF" w:sz="4" w:space="0"/>
+            </w:tcBorders>
+            <w:shd w:val="clear" w:color="auto" w:fill="1F3A5F"/>
+            <w:tcMar>
+              <w:top w:w="60" w:type="dxa"/>
+              <w:left w:w="90" w:type="dxa"/>
+              <w:bottom w:w="60" w:type="dxa"/>
+              <w:right w:w="90" w:type="dxa"/>
+            </w:tcMar>
+            <w:vAlign w:val="center"/>
+          </w:tcPr>
+          <w:p>
+            <w:pPr>
+              <w:spacing w:after="10" w:line="270" w:lineRule="auto"/>
+            </w:pPr>
+            <w:r>
+              <w:rPr>
+                <w:rFonts w:ascii="Calibri" w:hAnsi="Calibri" w:eastAsia="微软雅黑" w:cs="Calibri"/>
+                <w:b/>
+                <w:bCs/>
+                <w:color w:val="FFFFFF"/>
+                <w:sz w:val="18"/>
+                <w:szCs w:val="18"/>
+              </w:rPr>
+              <w:t xml:space="preserve">看什么</w:t>
+            </w:r>
+          </w:p>
+        </w:tc>
+        <w:tc>
+          <w:tcPr>
+            <w:tcW w:w="2738" w:type="dxa"/>
+            <w:tcBorders>
+              <w:top w:val="single" w:color="BFBFBF" w:sz="4" w:space="0"/>
+              <w:left w:val="single" w:color="BFBFBF" w:sz="4" w:space="0"/>
+              <w:bottom w:val="single" w:color="BFBFBF" w:sz="4" w:space="0"/>
+              <w:right w:val="single" w:color="BFBFBF" w:sz="4" w:space="0"/>
+            </w:tcBorders>
+            <w:shd w:val="clear" w:color="auto" w:fill="1F3A5F"/>
+            <w:tcMar>
+              <w:top w:w="60" w:type="dxa"/>
+              <w:left w:w="90" w:type="dxa"/>
+              <w:bottom w:w="60" w:type="dxa"/>
+              <w:right w:w="90" w:type="dxa"/>
+            </w:tcMar>
+            <w:vAlign w:val="center"/>
+          </w:tcPr>
+          <w:p>
+            <w:pPr>
+              <w:spacing w:after="10" w:line="270" w:lineRule="auto"/>
+            </w:pPr>
+            <w:r>
+              <w:rPr>
+                <w:rFonts w:ascii="Calibri" w:hAnsi="Calibri" w:eastAsia="微软雅黑" w:cs="Calibri"/>
+                <w:b/>
+                <w:bCs/>
+                <w:color w:val="FFFFFF"/>
+                <w:sz w:val="18"/>
+                <w:szCs w:val="18"/>
+              </w:rPr>
+              <w:t xml:space="preserve">对“最强争金点”定位的含义</w:t>
+            </w:r>
+          </w:p>
+        </w:tc>
+      </w:tr>
+      <w:tr>
+        <w:trPr>
+          <w:cantSplit/>
+        </w:trPr>
+        <w:tc>
+          <w:tcPr>
+            <w:tcW w:w="1700" w:type="dxa"/>
+            <w:tcBorders>
+              <w:top w:val="single" w:color="BFBFBF" w:sz="4" w:space="0"/>
+              <w:left w:val="single" w:color="BFBFBF" w:sz="4" w:space="0"/>
+              <w:bottom w:val="single" w:color="BFBFBF" w:sz="4" w:space="0"/>
+              <w:right w:val="single" w:color="BFBFBF" w:sz="4" w:space="0"/>
+            </w:tcBorders>
+            <w:shd w:val="clear" w:color="auto" w:fill="EEF2F7"/>
+            <w:tcMar>
+              <w:top w:w="60" w:type="dxa"/>
+              <w:left w:w="90" w:type="dxa"/>
+              <w:bottom w:w="60" w:type="dxa"/>
+              <w:right w:w="90" w:type="dxa"/>
+            </w:tcMar>
+            <w:vAlign w:val="center"/>
+          </w:tcPr>
+          <w:p>
+            <w:pPr>
+              <w:spacing w:after="10" w:line="270" w:lineRule="auto"/>
+            </w:pPr>
+            <w:r>
+              <w:rPr>
+                <w:rFonts w:ascii="Calibri" w:hAnsi="Calibri" w:eastAsia="微软雅黑" w:cs="Calibri"/>
+                <w:b/>
+                <w:bCs/>
+                <w:sz w:val="18"/>
+                <w:szCs w:val="18"/>
+              </w:rPr>
+              <w:t xml:space="preserve">现在（2026年11月起）</w:t>
+            </w:r>
+          </w:p>
+        </w:tc>
+        <w:tc>
+          <w:tcPr>
+            <w:tcW w:w="2300" w:type="dxa"/>
+            <w:tcBorders>
+              <w:top w:val="single" w:color="BFBFBF" w:sz="4" w:space="0"/>
+              <w:left w:val="single" w:color="BFBFBF" w:sz="4" w:space="0"/>
+              <w:bottom w:val="single" w:color="BFBFBF" w:sz="4" w:space="0"/>
+              <w:right w:val="single" w:color="BFBFBF" w:sz="4" w:space="0"/>
+            </w:tcBorders>
+            <w:tcMar>
+              <w:top w:w="60" w:type="dxa"/>
+              <w:left w:w="90" w:type="dxa"/>
+              <w:bottom w:w="60" w:type="dxa"/>
+              <w:right w:w="90" w:type="dxa"/>
+            </w:tcMar>
+            <w:vAlign w:val="center"/>
+          </w:tcPr>
+          <w:p>
+            <w:pPr>
+              <w:spacing w:after="10" w:line="270" w:lineRule="auto"/>
+            </w:pPr>
+            <w:r>
+              <w:rPr>
+                <w:rFonts w:ascii="Calibri" w:hAnsi="Calibri" w:eastAsia="微软雅黑" w:cs="Calibri"/>
+                <w:sz w:val="18"/>
+                <w:szCs w:val="18"/>
+              </w:rPr>
+              <w:t xml:space="preserve">2026年国家队古典式选拔的三站积分和综合排名</w:t>
+            </w:r>
+          </w:p>
+        </w:tc>
+        <w:tc>
+          <w:tcPr>
+            <w:tcW w:w="2900" w:type="dxa"/>
+            <w:tcBorders>
+              <w:top w:val="single" w:color="BFBFBF" w:sz="4" w:space="0"/>
+              <w:left w:val="single" w:color="BFBFBF" w:sz="4" w:space="0"/>
+              <w:bottom w:val="single" w:color="BFBFBF" w:sz="4" w:space="0"/>
+              <w:right w:val="single" w:color="BFBFBF" w:sz="4" w:space="0"/>
+            </w:tcBorders>
+            <w:tcMar>
+              <w:top w:w="60" w:type="dxa"/>
+              <w:left w:w="90" w:type="dxa"/>
+              <w:bottom w:w="60" w:type="dxa"/>
+              <w:right w:w="90" w:type="dxa"/>
+            </w:tcMar>
+            <w:vAlign w:val="center"/>
+          </w:tcPr>
+          <w:p>
+            <w:pPr>
+              <w:spacing w:after="10" w:line="270" w:lineRule="auto"/>
+            </w:pPr>
+            <w:r>
+              <w:rPr>
+                <w:rFonts w:ascii="Calibri" w:hAnsi="Calibri" w:eastAsia="微软雅黑" w:cs="Calibri"/>
+                <w:sz w:val="18"/>
+                <w:szCs w:val="18"/>
+              </w:rPr>
+              <w:t xml:space="preserve">曹利国与谭浩东谁排第一；教练组15分评分怎么打</w:t>
+            </w:r>
+          </w:p>
+        </w:tc>
+        <w:tc>
+          <w:tcPr>
+            <w:tcW w:w="2738" w:type="dxa"/>
+            <w:tcBorders>
+              <w:top w:val="single" w:color="BFBFBF" w:sz="4" w:space="0"/>
+              <w:left w:val="single" w:color="BFBFBF" w:sz="4" w:space="0"/>
+              <w:bottom w:val="single" w:color="BFBFBF" w:sz="4" w:space="0"/>
+              <w:right w:val="single" w:color="BFBFBF" w:sz="4" w:space="0"/>
+            </w:tcBorders>
+            <w:tcMar>
+              <w:top w:w="60" w:type="dxa"/>
+              <w:left w:w="90" w:type="dxa"/>
+              <w:bottom w:w="60" w:type="dxa"/>
+              <w:right w:w="90" w:type="dxa"/>
+            </w:tcMar>
+            <w:vAlign w:val="center"/>
+          </w:tcPr>
+          <w:p>
+            <w:pPr>
+              <w:spacing w:after="10" w:line="270" w:lineRule="auto"/>
+            </w:pPr>
+            <w:r>
+              <w:rPr>
+                <w:rFonts w:ascii="Calibri" w:hAnsi="Calibri" w:eastAsia="微软雅黑" w:cs="Calibri"/>
+                <w:sz w:val="18"/>
+                <w:szCs w:val="18"/>
+              </w:rPr>
+              <w:t xml:space="preserve">曹利国若排第二，定位需附条件“先夺回国内第一人选”；向举摔柔中心或广西队索取</w:t>
+            </w:r>
+            <w:r>
+              <w:rPr>
+                <w:rFonts w:ascii="Calibri" w:hAnsi="Calibri" w:eastAsia="微软雅黑" w:cs="Calibri"/>
+                <w:sz w:val="17"/>
+                <w:szCs w:val="17"/>
+              </w:rPr>
+              <w:t xml:space="preserve">[17、47]</w:t>
+            </w:r>
+          </w:p>
+        </w:tc>
+      </w:tr>
+      <w:tr>
+        <w:trPr>
+          <w:cantSplit/>
+        </w:trPr>
+        <w:tc>
+          <w:tcPr>
+            <w:tcW w:w="1700" w:type="dxa"/>
+            <w:tcBorders>
+              <w:top w:val="single" w:color="BFBFBF" w:sz="4" w:space="0"/>
+              <w:left w:val="single" w:color="BFBFBF" w:sz="4" w:space="0"/>
+              <w:bottom w:val="single" w:color="BFBFBF" w:sz="4" w:space="0"/>
+              <w:right w:val="single" w:color="BFBFBF" w:sz="4" w:space="0"/>
+            </w:tcBorders>
+            <w:shd w:val="clear" w:color="auto" w:fill="EEF2F7"/>
+            <w:tcMar>
+              <w:top w:w="60" w:type="dxa"/>
+              <w:left w:w="90" w:type="dxa"/>
+              <w:bottom w:w="60" w:type="dxa"/>
+              <w:right w:w="90" w:type="dxa"/>
+            </w:tcMar>
+            <w:vAlign w:val="center"/>
+          </w:tcPr>
+          <w:p>
+            <w:pPr>
+              <w:spacing w:after="10" w:line="270" w:lineRule="auto"/>
+            </w:pPr>
+            <w:r>
+              <w:rPr>
+                <w:rFonts w:ascii="Calibri" w:hAnsi="Calibri" w:eastAsia="微软雅黑" w:cs="Calibri"/>
+                <w:b/>
+                <w:bCs/>
+                <w:sz w:val="18"/>
+                <w:szCs w:val="18"/>
+              </w:rPr>
+              <w:t xml:space="preserve">持续关注</w:t>
+            </w:r>
+          </w:p>
+        </w:tc>
+        <w:tc>
+          <w:tcPr>
+            <w:tcW w:w="2300" w:type="dxa"/>
+            <w:tcBorders>
+              <w:top w:val="single" w:color="BFBFBF" w:sz="4" w:space="0"/>
+              <w:left w:val="single" w:color="BFBFBF" w:sz="4" w:space="0"/>
+              <w:bottom w:val="single" w:color="BFBFBF" w:sz="4" w:space="0"/>
+              <w:right w:val="single" w:color="BFBFBF" w:sz="4" w:space="0"/>
+            </w:tcBorders>
+            <w:tcMar>
+              <w:top w:w="60" w:type="dxa"/>
+              <w:left w:w="90" w:type="dxa"/>
+              <w:bottom w:w="60" w:type="dxa"/>
+              <w:right w:w="90" w:type="dxa"/>
+            </w:tcMar>
+            <w:vAlign w:val="center"/>
+          </w:tcPr>
+          <w:p>
+            <w:pPr>
+              <w:spacing w:after="10" w:line="270" w:lineRule="auto"/>
+            </w:pPr>
+            <w:r>
+              <w:rPr>
+                <w:rFonts w:ascii="Calibri" w:hAnsi="Calibri" w:eastAsia="微软雅黑" w:cs="Calibri"/>
+                <w:sz w:val="18"/>
+                <w:szCs w:val="18"/>
+              </w:rPr>
+              <w:t xml:space="preserve">洛杉矶周期国内选拔办法公布</w:t>
+            </w:r>
+          </w:p>
+        </w:tc>
+        <w:tc>
+          <w:tcPr>
+            <w:tcW w:w="2900" w:type="dxa"/>
+            <w:tcBorders>
+              <w:top w:val="single" w:color="BFBFBF" w:sz="4" w:space="0"/>
+              <w:left w:val="single" w:color="BFBFBF" w:sz="4" w:space="0"/>
+              <w:bottom w:val="single" w:color="BFBFBF" w:sz="4" w:space="0"/>
+              <w:right w:val="single" w:color="BFBFBF" w:sz="4" w:space="0"/>
+            </w:tcBorders>
+            <w:tcMar>
+              <w:top w:w="60" w:type="dxa"/>
+              <w:left w:w="90" w:type="dxa"/>
+              <w:bottom w:w="60" w:type="dxa"/>
+              <w:right w:w="90" w:type="dxa"/>
+            </w:tcMar>
+            <w:vAlign w:val="center"/>
+          </w:tcPr>
+          <w:p>
+            <w:pPr>
+              <w:spacing w:after="10" w:line="270" w:lineRule="auto"/>
+            </w:pPr>
+            <w:r>
+              <w:rPr>
+                <w:rFonts w:ascii="Calibri" w:hAnsi="Calibri" w:eastAsia="微软雅黑" w:cs="Calibri"/>
+                <w:sz w:val="18"/>
+                <w:szCs w:val="18"/>
+              </w:rPr>
+              <w:t xml:space="preserve">沿用“世锦赛成绩直接认定”还是“积分加教练评估”；教练评分权重</w:t>
+            </w:r>
+          </w:p>
+        </w:tc>
+        <w:tc>
+          <w:tcPr>
+            <w:tcW w:w="2738" w:type="dxa"/>
+            <w:tcBorders>
+              <w:top w:val="single" w:color="BFBFBF" w:sz="4" w:space="0"/>
+              <w:left w:val="single" w:color="BFBFBF" w:sz="4" w:space="0"/>
+              <w:bottom w:val="single" w:color="BFBFBF" w:sz="4" w:space="0"/>
+              <w:right w:val="single" w:color="BFBFBF" w:sz="4" w:space="0"/>
+            </w:tcBorders>
+            <w:tcMar>
+              <w:top w:w="60" w:type="dxa"/>
+              <w:left w:w="90" w:type="dxa"/>
+              <w:bottom w:w="60" w:type="dxa"/>
+              <w:right w:w="90" w:type="dxa"/>
+            </w:tcMar>
+            <w:vAlign w:val="center"/>
+          </w:tcPr>
+          <w:p>
+            <w:pPr>
+              <w:spacing w:after="10" w:line="270" w:lineRule="auto"/>
+            </w:pPr>
+            <w:r>
+              <w:rPr>
+                <w:rFonts w:ascii="Calibri" w:hAnsi="Calibri" w:eastAsia="微软雅黑" w:cs="Calibri"/>
+                <w:sz w:val="18"/>
+                <w:szCs w:val="18"/>
+              </w:rPr>
+              <w:t xml:space="preserve">决定曹利国能否靠国际成绩直接拿到出赛资格；发布时间未见官方说明</w:t>
+            </w:r>
+            <w:r>
+              <w:rPr>
+                <w:rFonts w:ascii="Calibri" w:hAnsi="Calibri" w:eastAsia="微软雅黑" w:cs="Calibri"/>
+                <w:b/>
+                <w:bCs/>
+                <w:color w:val="C00000"/>
+                <w:sz w:val="18"/>
+                <w:szCs w:val="18"/>
+              </w:rPr>
+              <w:t xml:space="preserve">【待核实】</w:t>
+            </w:r>
+          </w:p>
+        </w:tc>
+      </w:tr>
+      <w:tr>
+        <w:trPr>
+          <w:cantSplit/>
+        </w:trPr>
+        <w:tc>
+          <w:tcPr>
+            <w:tcW w:w="1700" w:type="dxa"/>
+            <w:tcBorders>
+              <w:top w:val="single" w:color="BFBFBF" w:sz="4" w:space="0"/>
+              <w:left w:val="single" w:color="BFBFBF" w:sz="4" w:space="0"/>
+              <w:bottom w:val="single" w:color="BFBFBF" w:sz="4" w:space="0"/>
+              <w:right w:val="single" w:color="BFBFBF" w:sz="4" w:space="0"/>
+            </w:tcBorders>
+            <w:shd w:val="clear" w:color="auto" w:fill="EEF2F7"/>
+            <w:tcMar>
+              <w:top w:w="60" w:type="dxa"/>
+              <w:left w:w="90" w:type="dxa"/>
+              <w:bottom w:w="60" w:type="dxa"/>
+              <w:right w:w="90" w:type="dxa"/>
+            </w:tcMar>
+            <w:vAlign w:val="center"/>
+          </w:tcPr>
+          <w:p>
+            <w:pPr>
+              <w:spacing w:after="10" w:line="270" w:lineRule="auto"/>
+            </w:pPr>
+            <w:r>
+              <w:rPr>
+                <w:rFonts w:ascii="Calibri" w:hAnsi="Calibri" w:eastAsia="微软雅黑" w:cs="Calibri"/>
+                <w:b/>
+                <w:bCs/>
+                <w:sz w:val="18"/>
+                <w:szCs w:val="18"/>
+              </w:rPr>
+              <w:t xml:space="preserve">2027年2月15日至21日</w:t>
+            </w:r>
+          </w:p>
+        </w:tc>
+        <w:tc>
+          <w:tcPr>
+            <w:tcW w:w="2300" w:type="dxa"/>
+            <w:tcBorders>
+              <w:top w:val="single" w:color="BFBFBF" w:sz="4" w:space="0"/>
+              <w:left w:val="single" w:color="BFBFBF" w:sz="4" w:space="0"/>
+              <w:bottom w:val="single" w:color="BFBFBF" w:sz="4" w:space="0"/>
+              <w:right w:val="single" w:color="BFBFBF" w:sz="4" w:space="0"/>
+            </w:tcBorders>
+            <w:tcMar>
+              <w:top w:w="60" w:type="dxa"/>
+              <w:left w:w="90" w:type="dxa"/>
+              <w:bottom w:w="60" w:type="dxa"/>
+              <w:right w:w="90" w:type="dxa"/>
+            </w:tcMar>
+            <w:vAlign w:val="center"/>
+          </w:tcPr>
+          <w:p>
+            <w:pPr>
+              <w:spacing w:after="10" w:line="270" w:lineRule="auto"/>
+            </w:pPr>
+            <w:r>
+              <w:rPr>
+                <w:rFonts w:ascii="Calibri" w:hAnsi="Calibri" w:eastAsia="微软雅黑" w:cs="Calibri"/>
+                <w:sz w:val="18"/>
+                <w:szCs w:val="18"/>
+              </w:rPr>
+              <w:t xml:space="preserve">第1站排名赛</w:t>
+            </w:r>
+          </w:p>
+        </w:tc>
+        <w:tc>
+          <w:tcPr>
+            <w:tcW w:w="2900" w:type="dxa"/>
+            <w:tcBorders>
+              <w:top w:val="single" w:color="BFBFBF" w:sz="4" w:space="0"/>
+              <w:left w:val="single" w:color="BFBFBF" w:sz="4" w:space="0"/>
+              <w:bottom w:val="single" w:color="BFBFBF" w:sz="4" w:space="0"/>
+              <w:right w:val="single" w:color="BFBFBF" w:sz="4" w:space="0"/>
+            </w:tcBorders>
+            <w:tcMar>
+              <w:top w:w="60" w:type="dxa"/>
+              <w:left w:w="90" w:type="dxa"/>
+              <w:bottom w:w="60" w:type="dxa"/>
+              <w:right w:w="90" w:type="dxa"/>
+            </w:tcMar>
+            <w:vAlign w:val="center"/>
+          </w:tcPr>
+          <w:p>
+            <w:pPr>
+              <w:spacing w:after="10" w:line="270" w:lineRule="auto"/>
+            </w:pPr>
+            <w:r>
+              <w:rPr>
+                <w:rFonts w:ascii="Calibri" w:hAnsi="Calibri" w:eastAsia="微软雅黑" w:cs="Calibri"/>
+                <w:sz w:val="18"/>
+                <w:szCs w:val="18"/>
+              </w:rPr>
+              <w:t xml:space="preserve">中国古典式60公斤派谁（每国每级别最多2人）；名次和积分</w:t>
+            </w:r>
+          </w:p>
+        </w:tc>
+        <w:tc>
+          <w:tcPr>
+            <w:tcW w:w="2738" w:type="dxa"/>
+            <w:tcBorders>
+              <w:top w:val="single" w:color="BFBFBF" w:sz="4" w:space="0"/>
+              <w:left w:val="single" w:color="BFBFBF" w:sz="4" w:space="0"/>
+              <w:bottom w:val="single" w:color="BFBFBF" w:sz="4" w:space="0"/>
+              <w:right w:val="single" w:color="BFBFBF" w:sz="4" w:space="0"/>
+            </w:tcBorders>
+            <w:tcMar>
+              <w:top w:w="60" w:type="dxa"/>
+              <w:left w:w="90" w:type="dxa"/>
+              <w:bottom w:w="60" w:type="dxa"/>
+              <w:right w:w="90" w:type="dxa"/>
+            </w:tcMar>
+            <w:vAlign w:val="center"/>
+          </w:tcPr>
+          <w:p>
+            <w:pPr>
+              <w:spacing w:after="10" w:line="270" w:lineRule="auto"/>
+            </w:pPr>
+            <w:r>
+              <w:rPr>
+                <w:rFonts w:ascii="Calibri" w:hAnsi="Calibri" w:eastAsia="微软雅黑" w:cs="Calibri"/>
+                <w:sz w:val="18"/>
+                <w:szCs w:val="18"/>
+              </w:rPr>
+              <w:t xml:space="preserve">国内排序的第一个信号：曹利国未被派出，说明排在别人之后</w:t>
+            </w:r>
+            <w:r>
+              <w:rPr>
+                <w:rFonts w:ascii="Calibri" w:hAnsi="Calibri" w:eastAsia="微软雅黑" w:cs="Calibri"/>
+                <w:sz w:val="17"/>
+                <w:szCs w:val="17"/>
+              </w:rPr>
+              <w:t xml:space="preserve">[1、23]</w:t>
+            </w:r>
+          </w:p>
+        </w:tc>
+      </w:tr>
+      <w:tr>
+        <w:trPr>
+          <w:cantSplit/>
+        </w:trPr>
+        <w:tc>
+          <w:tcPr>
+            <w:tcW w:w="1700" w:type="dxa"/>
+            <w:tcBorders>
+              <w:top w:val="single" w:color="BFBFBF" w:sz="4" w:space="0"/>
+              <w:left w:val="single" w:color="BFBFBF" w:sz="4" w:space="0"/>
+              <w:bottom w:val="single" w:color="BFBFBF" w:sz="4" w:space="0"/>
+              <w:right w:val="single" w:color="BFBFBF" w:sz="4" w:space="0"/>
+            </w:tcBorders>
+            <w:shd w:val="clear" w:color="auto" w:fill="EEF2F7"/>
+            <w:tcMar>
+              <w:top w:w="60" w:type="dxa"/>
+              <w:left w:w="90" w:type="dxa"/>
+              <w:bottom w:w="60" w:type="dxa"/>
+              <w:right w:w="90" w:type="dxa"/>
+            </w:tcMar>
+            <w:vAlign w:val="center"/>
+          </w:tcPr>
+          <w:p>
+            <w:pPr>
+              <w:spacing w:after="10" w:line="270" w:lineRule="auto"/>
+            </w:pPr>
+            <w:r>
+              <w:rPr>
+                <w:rFonts w:ascii="Calibri" w:hAnsi="Calibri" w:eastAsia="微软雅黑" w:cs="Calibri"/>
+                <w:b/>
+                <w:bCs/>
+                <w:sz w:val="18"/>
+                <w:szCs w:val="18"/>
+              </w:rPr>
+              <w:t xml:space="preserve">2027年3月30日至4月4日</w:t>
+            </w:r>
+          </w:p>
+        </w:tc>
+        <w:tc>
+          <w:tcPr>
+            <w:tcW w:w="2300" w:type="dxa"/>
+            <w:tcBorders>
+              <w:top w:val="single" w:color="BFBFBF" w:sz="4" w:space="0"/>
+              <w:left w:val="single" w:color="BFBFBF" w:sz="4" w:space="0"/>
+              <w:bottom w:val="single" w:color="BFBFBF" w:sz="4" w:space="0"/>
+              <w:right w:val="single" w:color="BFBFBF" w:sz="4" w:space="0"/>
+            </w:tcBorders>
+            <w:tcMar>
+              <w:top w:w="60" w:type="dxa"/>
+              <w:left w:w="90" w:type="dxa"/>
+              <w:bottom w:w="60" w:type="dxa"/>
+              <w:right w:w="90" w:type="dxa"/>
+            </w:tcMar>
+            <w:vAlign w:val="center"/>
+          </w:tcPr>
+          <w:p>
+            <w:pPr>
+              <w:spacing w:after="10" w:line="270" w:lineRule="auto"/>
+            </w:pPr>
+            <w:r>
+              <w:rPr>
+                <w:rFonts w:ascii="Calibri" w:hAnsi="Calibri" w:eastAsia="微软雅黑" w:cs="Calibri"/>
+                <w:sz w:val="18"/>
+                <w:szCs w:val="18"/>
+              </w:rPr>
+              <w:t xml:space="preserve">2027年亚锦赛</w:t>
+            </w:r>
+          </w:p>
+        </w:tc>
+        <w:tc>
+          <w:tcPr>
+            <w:tcW w:w="2900" w:type="dxa"/>
+            <w:tcBorders>
+              <w:top w:val="single" w:color="BFBFBF" w:sz="4" w:space="0"/>
+              <w:left w:val="single" w:color="BFBFBF" w:sz="4" w:space="0"/>
+              <w:bottom w:val="single" w:color="BFBFBF" w:sz="4" w:space="0"/>
+              <w:right w:val="single" w:color="BFBFBF" w:sz="4" w:space="0"/>
+            </w:tcBorders>
+            <w:tcMar>
+              <w:top w:w="60" w:type="dxa"/>
+              <w:left w:w="90" w:type="dxa"/>
+              <w:bottom w:w="60" w:type="dxa"/>
+              <w:right w:w="90" w:type="dxa"/>
+            </w:tcMar>
+            <w:vAlign w:val="center"/>
+          </w:tcPr>
+          <w:p>
+            <w:pPr>
+              <w:spacing w:after="10" w:line="270" w:lineRule="auto"/>
+            </w:pPr>
+            <w:r>
+              <w:rPr>
+                <w:rFonts w:ascii="Calibri" w:hAnsi="Calibri" w:eastAsia="微软雅黑" w:cs="Calibri"/>
+                <w:sz w:val="18"/>
+                <w:szCs w:val="18"/>
+              </w:rPr>
+              <w:t xml:space="preserve">中国派谁；名次</w:t>
+            </w:r>
+          </w:p>
+        </w:tc>
+        <w:tc>
+          <w:tcPr>
+            <w:tcW w:w="2738" w:type="dxa"/>
+            <w:tcBorders>
+              <w:top w:val="single" w:color="BFBFBF" w:sz="4" w:space="0"/>
+              <w:left w:val="single" w:color="BFBFBF" w:sz="4" w:space="0"/>
+              <w:bottom w:val="single" w:color="BFBFBF" w:sz="4" w:space="0"/>
+              <w:right w:val="single" w:color="BFBFBF" w:sz="4" w:space="0"/>
+            </w:tcBorders>
+            <w:tcMar>
+              <w:top w:w="60" w:type="dxa"/>
+              <w:left w:w="90" w:type="dxa"/>
+              <w:bottom w:w="60" w:type="dxa"/>
+              <w:right w:w="90" w:type="dxa"/>
+            </w:tcMar>
+            <w:vAlign w:val="center"/>
+          </w:tcPr>
+          <w:p>
+            <w:pPr>
+              <w:spacing w:after="10" w:line="270" w:lineRule="auto"/>
+            </w:pPr>
+            <w:r>
+              <w:rPr>
+                <w:rFonts w:ascii="Calibri" w:hAnsi="Calibri" w:eastAsia="微软雅黑" w:cs="Calibri"/>
+                <w:sz w:val="18"/>
+                <w:szCs w:val="18"/>
+              </w:rPr>
+              <w:t xml:space="preserve">本国参加洲际锦标赛是报名2027年世锦赛的前提；人选很可能就是世锦赛人选（推断）</w:t>
+            </w:r>
+            <w:r>
+              <w:rPr>
+                <w:rFonts w:ascii="Calibri" w:hAnsi="Calibri" w:eastAsia="微软雅黑" w:cs="Calibri"/>
+                <w:sz w:val="17"/>
+                <w:szCs w:val="17"/>
+              </w:rPr>
+              <w:t xml:space="preserve">[1]</w:t>
+            </w:r>
+          </w:p>
+        </w:tc>
+      </w:tr>
+      <w:tr>
+        <w:trPr>
+          <w:cantSplit/>
+        </w:trPr>
+        <w:tc>
+          <w:tcPr>
+            <w:tcW w:w="1700" w:type="dxa"/>
+            <w:tcBorders>
+              <w:top w:val="single" w:color="BFBFBF" w:sz="4" w:space="0"/>
+              <w:left w:val="single" w:color="BFBFBF" w:sz="4" w:space="0"/>
+              <w:bottom w:val="single" w:color="BFBFBF" w:sz="4" w:space="0"/>
+              <w:right w:val="single" w:color="BFBFBF" w:sz="4" w:space="0"/>
+            </w:tcBorders>
+            <w:shd w:val="clear" w:color="auto" w:fill="EEF2F7"/>
+            <w:tcMar>
+              <w:top w:w="60" w:type="dxa"/>
+              <w:left w:w="90" w:type="dxa"/>
+              <w:bottom w:w="60" w:type="dxa"/>
+              <w:right w:w="90" w:type="dxa"/>
+            </w:tcMar>
+            <w:vAlign w:val="center"/>
+          </w:tcPr>
+          <w:p>
+            <w:pPr>
+              <w:spacing w:after="10" w:line="270" w:lineRule="auto"/>
+            </w:pPr>
+            <w:r>
+              <w:rPr>
+                <w:rFonts w:ascii="Calibri" w:hAnsi="Calibri" w:eastAsia="微软雅黑" w:cs="Calibri"/>
+                <w:b/>
+                <w:bCs/>
+                <w:sz w:val="18"/>
+                <w:szCs w:val="18"/>
+              </w:rPr>
+              <w:t xml:space="preserve">2027年全国锦标赛（日期未公布）</w:t>
+            </w:r>
+          </w:p>
+        </w:tc>
+        <w:tc>
+          <w:tcPr>
+            <w:tcW w:w="2300" w:type="dxa"/>
+            <w:tcBorders>
+              <w:top w:val="single" w:color="BFBFBF" w:sz="4" w:space="0"/>
+              <w:left w:val="single" w:color="BFBFBF" w:sz="4" w:space="0"/>
+              <w:bottom w:val="single" w:color="BFBFBF" w:sz="4" w:space="0"/>
+              <w:right w:val="single" w:color="BFBFBF" w:sz="4" w:space="0"/>
+            </w:tcBorders>
+            <w:tcMar>
+              <w:top w:w="60" w:type="dxa"/>
+              <w:left w:w="90" w:type="dxa"/>
+              <w:bottom w:w="60" w:type="dxa"/>
+              <w:right w:w="90" w:type="dxa"/>
+            </w:tcMar>
+            <w:vAlign w:val="center"/>
+          </w:tcPr>
+          <w:p>
+            <w:pPr>
+              <w:spacing w:after="10" w:line="270" w:lineRule="auto"/>
+            </w:pPr>
+            <w:r>
+              <w:rPr>
+                <w:rFonts w:ascii="Calibri" w:hAnsi="Calibri" w:eastAsia="微软雅黑" w:cs="Calibri"/>
+                <w:sz w:val="18"/>
+                <w:szCs w:val="18"/>
+              </w:rPr>
+              <w:t xml:space="preserve">全国国际式摔跤锦标赛</w:t>
+            </w:r>
+          </w:p>
+        </w:tc>
+        <w:tc>
+          <w:tcPr>
+            <w:tcW w:w="2900" w:type="dxa"/>
+            <w:tcBorders>
+              <w:top w:val="single" w:color="BFBFBF" w:sz="4" w:space="0"/>
+              <w:left w:val="single" w:color="BFBFBF" w:sz="4" w:space="0"/>
+              <w:bottom w:val="single" w:color="BFBFBF" w:sz="4" w:space="0"/>
+              <w:right w:val="single" w:color="BFBFBF" w:sz="4" w:space="0"/>
+            </w:tcBorders>
+            <w:tcMar>
+              <w:top w:w="60" w:type="dxa"/>
+              <w:left w:w="90" w:type="dxa"/>
+              <w:bottom w:w="60" w:type="dxa"/>
+              <w:right w:w="90" w:type="dxa"/>
+            </w:tcMar>
+            <w:vAlign w:val="center"/>
+          </w:tcPr>
+          <w:p>
+            <w:pPr>
+              <w:spacing w:after="10" w:line="270" w:lineRule="auto"/>
+            </w:pPr>
+            <w:r>
+              <w:rPr>
+                <w:rFonts w:ascii="Calibri" w:hAnsi="Calibri" w:eastAsia="微软雅黑" w:cs="Calibri"/>
+                <w:sz w:val="18"/>
+                <w:szCs w:val="18"/>
+              </w:rPr>
+              <w:t xml:space="preserve">曹利国、谭浩东、宝音吉雅的名次</w:t>
+            </w:r>
+          </w:p>
+        </w:tc>
+        <w:tc>
+          <w:tcPr>
+            <w:tcW w:w="2738" w:type="dxa"/>
+            <w:tcBorders>
+              <w:top w:val="single" w:color="BFBFBF" w:sz="4" w:space="0"/>
+              <w:left w:val="single" w:color="BFBFBF" w:sz="4" w:space="0"/>
+              <w:bottom w:val="single" w:color="BFBFBF" w:sz="4" w:space="0"/>
+              <w:right w:val="single" w:color="BFBFBF" w:sz="4" w:space="0"/>
+            </w:tcBorders>
+            <w:tcMar>
+              <w:top w:w="60" w:type="dxa"/>
+              <w:left w:w="90" w:type="dxa"/>
+              <w:bottom w:w="60" w:type="dxa"/>
+              <w:right w:w="90" w:type="dxa"/>
+            </w:tcMar>
+            <w:vAlign w:val="center"/>
+          </w:tcPr>
+          <w:p>
+            <w:pPr>
+              <w:spacing w:after="10" w:line="270" w:lineRule="auto"/>
+            </w:pPr>
+            <w:r>
+              <w:rPr>
+                <w:rFonts w:ascii="Calibri" w:hAnsi="Calibri" w:eastAsia="微软雅黑" w:cs="Calibri"/>
+                <w:sz w:val="18"/>
+                <w:szCs w:val="18"/>
+              </w:rPr>
+              <w:t xml:space="preserve">2026年曹利国在此赛半决赛失利；名次是国内积分的硬指标</w:t>
+            </w:r>
+            <w:r>
+              <w:rPr>
+                <w:rFonts w:ascii="Calibri" w:hAnsi="Calibri" w:eastAsia="微软雅黑" w:cs="Calibri"/>
+                <w:b/>
+                <w:bCs/>
+                <w:color w:val="C00000"/>
+                <w:sz w:val="18"/>
+                <w:szCs w:val="18"/>
+              </w:rPr>
+              <w:t xml:space="preserve">【待核实】</w:t>
+            </w:r>
+            <w:r>
+              <w:rPr>
+                <w:rFonts w:ascii="Calibri" w:hAnsi="Calibri" w:eastAsia="微软雅黑" w:cs="Calibri"/>
+                <w:sz w:val="17"/>
+                <w:szCs w:val="17"/>
+              </w:rPr>
+              <w:t xml:space="preserve">[2、17]</w:t>
+            </w:r>
+          </w:p>
+        </w:tc>
+      </w:tr>
+      <w:tr>
+        <w:trPr>
+          <w:cantSplit/>
+        </w:trPr>
+        <w:tc>
+          <w:tcPr>
+            <w:tcW w:w="1700" w:type="dxa"/>
+            <w:tcBorders>
+              <w:top w:val="single" w:color="BFBFBF" w:sz="4" w:space="0"/>
+              <w:left w:val="single" w:color="BFBFBF" w:sz="4" w:space="0"/>
+              <w:bottom w:val="single" w:color="BFBFBF" w:sz="4" w:space="0"/>
+              <w:right w:val="single" w:color="BFBFBF" w:sz="4" w:space="0"/>
+            </w:tcBorders>
+            <w:shd w:val="clear" w:color="auto" w:fill="EEF2F7"/>
+            <w:tcMar>
+              <w:top w:w="60" w:type="dxa"/>
+              <w:left w:w="90" w:type="dxa"/>
+              <w:bottom w:w="60" w:type="dxa"/>
+              <w:right w:w="90" w:type="dxa"/>
+            </w:tcMar>
+            <w:vAlign w:val="center"/>
+          </w:tcPr>
+          <w:p>
+            <w:pPr>
+              <w:spacing w:after="10" w:line="270" w:lineRule="auto"/>
+            </w:pPr>
+            <w:r>
+              <w:rPr>
+                <w:rFonts w:ascii="Calibri" w:hAnsi="Calibri" w:eastAsia="微软雅黑" w:cs="Calibri"/>
+                <w:b/>
+                <w:bCs/>
+                <w:sz w:val="18"/>
+                <w:szCs w:val="18"/>
+              </w:rPr>
+              <w:t xml:space="preserve">2027年5月31日至6月6日、7月19日至25日</w:t>
+            </w:r>
+          </w:p>
+        </w:tc>
+        <w:tc>
+          <w:tcPr>
+            <w:tcW w:w="2300" w:type="dxa"/>
+            <w:tcBorders>
+              <w:top w:val="single" w:color="BFBFBF" w:sz="4" w:space="0"/>
+              <w:left w:val="single" w:color="BFBFBF" w:sz="4" w:space="0"/>
+              <w:bottom w:val="single" w:color="BFBFBF" w:sz="4" w:space="0"/>
+              <w:right w:val="single" w:color="BFBFBF" w:sz="4" w:space="0"/>
+            </w:tcBorders>
+            <w:tcMar>
+              <w:top w:w="60" w:type="dxa"/>
+              <w:left w:w="90" w:type="dxa"/>
+              <w:bottom w:w="60" w:type="dxa"/>
+              <w:right w:w="90" w:type="dxa"/>
+            </w:tcMar>
+            <w:vAlign w:val="center"/>
+          </w:tcPr>
+          <w:p>
+            <w:pPr>
+              <w:spacing w:after="10" w:line="270" w:lineRule="auto"/>
+            </w:pPr>
+            <w:r>
+              <w:rPr>
+                <w:rFonts w:ascii="Calibri" w:hAnsi="Calibri" w:eastAsia="微软雅黑" w:cs="Calibri"/>
+                <w:sz w:val="18"/>
+                <w:szCs w:val="18"/>
+              </w:rPr>
+              <w:t xml:space="preserve">第2、3站排名赛</w:t>
+            </w:r>
+          </w:p>
+        </w:tc>
+        <w:tc>
+          <w:tcPr>
+            <w:tcW w:w="2900" w:type="dxa"/>
+            <w:tcBorders>
+              <w:top w:val="single" w:color="BFBFBF" w:sz="4" w:space="0"/>
+              <w:left w:val="single" w:color="BFBFBF" w:sz="4" w:space="0"/>
+              <w:bottom w:val="single" w:color="BFBFBF" w:sz="4" w:space="0"/>
+              <w:right w:val="single" w:color="BFBFBF" w:sz="4" w:space="0"/>
+            </w:tcBorders>
+            <w:tcMar>
+              <w:top w:w="60" w:type="dxa"/>
+              <w:left w:w="90" w:type="dxa"/>
+              <w:bottom w:w="60" w:type="dxa"/>
+              <w:right w:w="90" w:type="dxa"/>
+            </w:tcMar>
+            <w:vAlign w:val="center"/>
+          </w:tcPr>
+          <w:p>
+            <w:pPr>
+              <w:spacing w:after="10" w:line="270" w:lineRule="auto"/>
+            </w:pPr>
+            <w:r>
+              <w:rPr>
+                <w:rFonts w:ascii="Calibri" w:hAnsi="Calibri" w:eastAsia="微软雅黑" w:cs="Calibri"/>
+                <w:sz w:val="18"/>
+                <w:szCs w:val="18"/>
+              </w:rPr>
+              <w:t xml:space="preserve">积分累积；与五味虹登、艾哈迈迪·瓦法、加尼耶夫、苏尔坦加利的交手结果</w:t>
+            </w:r>
+          </w:p>
+        </w:tc>
+        <w:tc>
+          <w:tcPr>
+            <w:tcW w:w="2738" w:type="dxa"/>
+            <w:tcBorders>
+              <w:top w:val="single" w:color="BFBFBF" w:sz="4" w:space="0"/>
+              <w:left w:val="single" w:color="BFBFBF" w:sz="4" w:space="0"/>
+              <w:bottom w:val="single" w:color="BFBFBF" w:sz="4" w:space="0"/>
+              <w:right w:val="single" w:color="BFBFBF" w:sz="4" w:space="0"/>
+            </w:tcBorders>
+            <w:tcMar>
+              <w:top w:w="60" w:type="dxa"/>
+              <w:left w:w="90" w:type="dxa"/>
+              <w:bottom w:w="60" w:type="dxa"/>
+              <w:right w:w="90" w:type="dxa"/>
+            </w:tcMar>
+            <w:vAlign w:val="center"/>
+          </w:tcPr>
+          <w:p>
+            <w:pPr>
+              <w:spacing w:after="10" w:line="270" w:lineRule="auto"/>
+            </w:pPr>
+            <w:r>
+              <w:rPr>
+                <w:rFonts w:ascii="Calibri" w:hAnsi="Calibri" w:eastAsia="微软雅黑" w:cs="Calibri"/>
+                <w:sz w:val="18"/>
+                <w:szCs w:val="18"/>
+              </w:rPr>
+              <w:t xml:space="preserve">对世界冠军级对手目前4战全负；赢下其中一人，是冲金差距缩小的直接证据</w:t>
+            </w:r>
+            <w:r>
+              <w:rPr>
+                <w:rFonts w:ascii="Calibri" w:hAnsi="Calibri" w:eastAsia="微软雅黑" w:cs="Calibri"/>
+                <w:sz w:val="17"/>
+                <w:szCs w:val="17"/>
+              </w:rPr>
+              <w:t xml:space="preserve">[1、26]</w:t>
+            </w:r>
+          </w:p>
+        </w:tc>
+      </w:tr>
+      <w:tr>
+        <w:trPr>
+          <w:cantSplit/>
+        </w:trPr>
+        <w:tc>
+          <w:tcPr>
+            <w:tcW w:w="1700" w:type="dxa"/>
+            <w:tcBorders>
+              <w:top w:val="single" w:color="BFBFBF" w:sz="4" w:space="0"/>
+              <w:left w:val="single" w:color="BFBFBF" w:sz="4" w:space="0"/>
+              <w:bottom w:val="single" w:color="BFBFBF" w:sz="4" w:space="0"/>
+              <w:right w:val="single" w:color="BFBFBF" w:sz="4" w:space="0"/>
+            </w:tcBorders>
+            <w:shd w:val="clear" w:color="auto" w:fill="EEF2F7"/>
+            <w:tcMar>
+              <w:top w:w="60" w:type="dxa"/>
+              <w:left w:w="90" w:type="dxa"/>
+              <w:bottom w:w="60" w:type="dxa"/>
+              <w:right w:w="90" w:type="dxa"/>
+            </w:tcMar>
+            <w:vAlign w:val="center"/>
+          </w:tcPr>
+          <w:p>
+            <w:pPr>
+              <w:spacing w:after="10" w:line="270" w:lineRule="auto"/>
+            </w:pPr>
+            <w:r>
+              <w:rPr>
+                <w:rFonts w:ascii="Calibri" w:hAnsi="Calibri" w:eastAsia="微软雅黑" w:cs="Calibri"/>
+                <w:b/>
+                <w:bCs/>
+                <w:sz w:val="18"/>
+                <w:szCs w:val="18"/>
+              </w:rPr>
+              <w:t xml:space="preserve">2027年9月11日至19日</w:t>
+            </w:r>
+          </w:p>
+        </w:tc>
+        <w:tc>
+          <w:tcPr>
+            <w:tcW w:w="2300" w:type="dxa"/>
+            <w:tcBorders>
+              <w:top w:val="single" w:color="BFBFBF" w:sz="4" w:space="0"/>
+              <w:left w:val="single" w:color="BFBFBF" w:sz="4" w:space="0"/>
+              <w:bottom w:val="single" w:color="BFBFBF" w:sz="4" w:space="0"/>
+              <w:right w:val="single" w:color="BFBFBF" w:sz="4" w:space="0"/>
+            </w:tcBorders>
+            <w:tcMar>
+              <w:top w:w="60" w:type="dxa"/>
+              <w:left w:w="90" w:type="dxa"/>
+              <w:bottom w:w="60" w:type="dxa"/>
+              <w:right w:w="90" w:type="dxa"/>
+            </w:tcMar>
+            <w:vAlign w:val="center"/>
+          </w:tcPr>
+          <w:p>
+            <w:pPr>
+              <w:spacing w:after="10" w:line="270" w:lineRule="auto"/>
+            </w:pPr>
+            <w:r>
+              <w:rPr>
+                <w:rFonts w:ascii="Calibri" w:hAnsi="Calibri" w:eastAsia="微软雅黑" w:cs="Calibri"/>
+                <w:sz w:val="18"/>
+                <w:szCs w:val="18"/>
+              </w:rPr>
+              <w:t xml:space="preserve">拉斯维加斯世锦赛</w:t>
+            </w:r>
+          </w:p>
+        </w:tc>
+        <w:tc>
+          <w:tcPr>
+            <w:tcW w:w="2900" w:type="dxa"/>
+            <w:tcBorders>
+              <w:top w:val="single" w:color="BFBFBF" w:sz="4" w:space="0"/>
+              <w:left w:val="single" w:color="BFBFBF" w:sz="4" w:space="0"/>
+              <w:bottom w:val="single" w:color="BFBFBF" w:sz="4" w:space="0"/>
+              <w:right w:val="single" w:color="BFBFBF" w:sz="4" w:space="0"/>
+            </w:tcBorders>
+            <w:tcMar>
+              <w:top w:w="60" w:type="dxa"/>
+              <w:left w:w="90" w:type="dxa"/>
+              <w:bottom w:w="60" w:type="dxa"/>
+              <w:right w:w="90" w:type="dxa"/>
+            </w:tcMar>
+            <w:vAlign w:val="center"/>
+          </w:tcPr>
+          <w:p>
+            <w:pPr>
+              <w:spacing w:after="10" w:line="270" w:lineRule="auto"/>
+            </w:pPr>
+            <w:r>
+              <w:rPr>
+                <w:rFonts w:ascii="Calibri" w:hAnsi="Calibri" w:eastAsia="微软雅黑" w:cs="Calibri"/>
+                <w:sz w:val="18"/>
+                <w:szCs w:val="18"/>
+              </w:rPr>
+              <w:t xml:space="preserve">是否入选；是否进入前4</w:t>
+            </w:r>
+          </w:p>
+        </w:tc>
+        <w:tc>
+          <w:tcPr>
+            <w:tcW w:w="2738" w:type="dxa"/>
+            <w:tcBorders>
+              <w:top w:val="single" w:color="BFBFBF" w:sz="4" w:space="0"/>
+              <w:left w:val="single" w:color="BFBFBF" w:sz="4" w:space="0"/>
+              <w:bottom w:val="single" w:color="BFBFBF" w:sz="4" w:space="0"/>
+              <w:right w:val="single" w:color="BFBFBF" w:sz="4" w:space="0"/>
+            </w:tcBorders>
+            <w:tcMar>
+              <w:top w:w="60" w:type="dxa"/>
+              <w:left w:w="90" w:type="dxa"/>
+              <w:bottom w:w="60" w:type="dxa"/>
+              <w:right w:w="90" w:type="dxa"/>
+            </w:tcMar>
+            <w:vAlign w:val="center"/>
+          </w:tcPr>
+          <w:p>
+            <w:pPr>
+              <w:spacing w:after="10" w:line="270" w:lineRule="auto"/>
+            </w:pPr>
+            <w:r>
+              <w:rPr>
+                <w:rFonts w:ascii="Calibri" w:hAnsi="Calibri" w:eastAsia="微软雅黑" w:cs="Calibri"/>
+                <w:sz w:val="18"/>
+                <w:szCs w:val="18"/>
+              </w:rPr>
+              <w:t xml:space="preserve">进前4即为国家拿到奥运名额，是定位成立的最强证据；未进前4，只剩排名前3和2028年亚洲资格赛两条路</w:t>
+            </w:r>
+            <w:r>
+              <w:rPr>
+                <w:rFonts w:ascii="Calibri" w:hAnsi="Calibri" w:eastAsia="微软雅黑" w:cs="Calibri"/>
+                <w:sz w:val="17"/>
+                <w:szCs w:val="17"/>
+              </w:rPr>
+              <w:t xml:space="preserve">[1]</w:t>
+            </w:r>
+          </w:p>
+        </w:tc>
+      </w:tr>
+      <w:tr>
+        <w:trPr>
+          <w:cantSplit/>
+        </w:trPr>
+        <w:tc>
+          <w:tcPr>
+            <w:tcW w:w="1700" w:type="dxa"/>
+            <w:tcBorders>
+              <w:top w:val="single" w:color="BFBFBF" w:sz="4" w:space="0"/>
+              <w:left w:val="single" w:color="BFBFBF" w:sz="4" w:space="0"/>
+              <w:bottom w:val="single" w:color="BFBFBF" w:sz="4" w:space="0"/>
+              <w:right w:val="single" w:color="BFBFBF" w:sz="4" w:space="0"/>
+            </w:tcBorders>
+            <w:shd w:val="clear" w:color="auto" w:fill="EEF2F7"/>
+            <w:tcMar>
+              <w:top w:w="60" w:type="dxa"/>
+              <w:left w:w="90" w:type="dxa"/>
+              <w:bottom w:w="60" w:type="dxa"/>
+              <w:right w:w="90" w:type="dxa"/>
+            </w:tcMar>
+            <w:vAlign w:val="center"/>
+          </w:tcPr>
+          <w:p>
+            <w:pPr>
+              <w:spacing w:after="10" w:line="270" w:lineRule="auto"/>
+            </w:pPr>
+            <w:r>
+              <w:rPr>
+                <w:rFonts w:ascii="Calibri" w:hAnsi="Calibri" w:eastAsia="微软雅黑" w:cs="Calibri"/>
+                <w:b/>
+                <w:bCs/>
+                <w:sz w:val="18"/>
+                <w:szCs w:val="18"/>
+              </w:rPr>
+              <w:t xml:space="preserve">2027年10月6日</w:t>
+            </w:r>
+          </w:p>
+        </w:tc>
+        <w:tc>
+          <w:tcPr>
+            <w:tcW w:w="2300" w:type="dxa"/>
+            <w:tcBorders>
+              <w:top w:val="single" w:color="BFBFBF" w:sz="4" w:space="0"/>
+              <w:left w:val="single" w:color="BFBFBF" w:sz="4" w:space="0"/>
+              <w:bottom w:val="single" w:color="BFBFBF" w:sz="4" w:space="0"/>
+              <w:right w:val="single" w:color="BFBFBF" w:sz="4" w:space="0"/>
+            </w:tcBorders>
+            <w:tcMar>
+              <w:top w:w="60" w:type="dxa"/>
+              <w:left w:w="90" w:type="dxa"/>
+              <w:bottom w:w="60" w:type="dxa"/>
+              <w:right w:w="90" w:type="dxa"/>
+            </w:tcMar>
+            <w:vAlign w:val="center"/>
+          </w:tcPr>
+          <w:p>
+            <w:pPr>
+              <w:spacing w:after="10" w:line="270" w:lineRule="auto"/>
+            </w:pPr>
+            <w:r>
+              <w:rPr>
+                <w:rFonts w:ascii="Calibri" w:hAnsi="Calibri" w:eastAsia="微软雅黑" w:cs="Calibri"/>
+                <w:sz w:val="18"/>
+                <w:szCs w:val="18"/>
+              </w:rPr>
+              <w:t xml:space="preserve">国家确认世锦赛名额的截止日</w:t>
+            </w:r>
+          </w:p>
+        </w:tc>
+        <w:tc>
+          <w:tcPr>
+            <w:tcW w:w="2900" w:type="dxa"/>
+            <w:tcBorders>
+              <w:top w:val="single" w:color="BFBFBF" w:sz="4" w:space="0"/>
+              <w:left w:val="single" w:color="BFBFBF" w:sz="4" w:space="0"/>
+              <w:bottom w:val="single" w:color="BFBFBF" w:sz="4" w:space="0"/>
+              <w:right w:val="single" w:color="BFBFBF" w:sz="4" w:space="0"/>
+            </w:tcBorders>
+            <w:tcMar>
+              <w:top w:w="60" w:type="dxa"/>
+              <w:left w:w="90" w:type="dxa"/>
+              <w:bottom w:w="60" w:type="dxa"/>
+              <w:right w:w="90" w:type="dxa"/>
+            </w:tcMar>
+            <w:vAlign w:val="center"/>
+          </w:tcPr>
+          <w:p>
+            <w:pPr>
+              <w:spacing w:after="10" w:line="270" w:lineRule="auto"/>
+            </w:pPr>
+            <w:r>
+              <w:rPr>
+                <w:rFonts w:ascii="Calibri" w:hAnsi="Calibri" w:eastAsia="微软雅黑" w:cs="Calibri"/>
+                <w:sz w:val="18"/>
+                <w:szCs w:val="18"/>
+              </w:rPr>
+              <w:t xml:space="preserve">中国古典式60公斤是否已有名额</w:t>
+            </w:r>
+          </w:p>
+        </w:tc>
+        <w:tc>
+          <w:tcPr>
+            <w:tcW w:w="2738" w:type="dxa"/>
+            <w:tcBorders>
+              <w:top w:val="single" w:color="BFBFBF" w:sz="4" w:space="0"/>
+              <w:left w:val="single" w:color="BFBFBF" w:sz="4" w:space="0"/>
+              <w:bottom w:val="single" w:color="BFBFBF" w:sz="4" w:space="0"/>
+              <w:right w:val="single" w:color="BFBFBF" w:sz="4" w:space="0"/>
+            </w:tcBorders>
+            <w:tcMar>
+              <w:top w:w="60" w:type="dxa"/>
+              <w:left w:w="90" w:type="dxa"/>
+              <w:bottom w:w="60" w:type="dxa"/>
+              <w:right w:w="90" w:type="dxa"/>
+            </w:tcMar>
+            <w:vAlign w:val="center"/>
+          </w:tcPr>
+          <w:p>
+            <w:pPr>
+              <w:spacing w:after="10" w:line="270" w:lineRule="auto"/>
+            </w:pPr>
+            <w:r>
+              <w:rPr>
+                <w:rFonts w:ascii="Calibri" w:hAnsi="Calibri" w:eastAsia="微软雅黑" w:cs="Calibri"/>
+                <w:sz w:val="18"/>
+                <w:szCs w:val="18"/>
+              </w:rPr>
+              <w:t xml:space="preserve">已有名额，2028年的竞争就只剩国内选拔</w:t>
+            </w:r>
+            <w:r>
+              <w:rPr>
+                <w:rFonts w:ascii="Calibri" w:hAnsi="Calibri" w:eastAsia="微软雅黑" w:cs="Calibri"/>
+                <w:sz w:val="17"/>
+                <w:szCs w:val="17"/>
+              </w:rPr>
+              <w:t xml:space="preserve">[1]</w:t>
+            </w:r>
+          </w:p>
+        </w:tc>
+      </w:tr>
+      <w:tr>
+        <w:trPr>
+          <w:cantSplit/>
+        </w:trPr>
+        <w:tc>
+          <w:tcPr>
+            <w:tcW w:w="1700" w:type="dxa"/>
+            <w:tcBorders>
+              <w:top w:val="single" w:color="BFBFBF" w:sz="4" w:space="0"/>
+              <w:left w:val="single" w:color="BFBFBF" w:sz="4" w:space="0"/>
+              <w:bottom w:val="single" w:color="BFBFBF" w:sz="4" w:space="0"/>
+              <w:right w:val="single" w:color="BFBFBF" w:sz="4" w:space="0"/>
+            </w:tcBorders>
+            <w:shd w:val="clear" w:color="auto" w:fill="EEF2F7"/>
+            <w:tcMar>
+              <w:top w:w="60" w:type="dxa"/>
+              <w:left w:w="90" w:type="dxa"/>
+              <w:bottom w:w="60" w:type="dxa"/>
+              <w:right w:w="90" w:type="dxa"/>
+            </w:tcMar>
+            <w:vAlign w:val="center"/>
+          </w:tcPr>
+          <w:p>
+            <w:pPr>
+              <w:spacing w:after="10" w:line="270" w:lineRule="auto"/>
+            </w:pPr>
+            <w:r>
+              <w:rPr>
+                <w:rFonts w:ascii="Calibri" w:hAnsi="Calibri" w:eastAsia="微软雅黑" w:cs="Calibri"/>
+                <w:b/>
+                <w:bCs/>
+                <w:sz w:val="18"/>
+                <w:szCs w:val="18"/>
+              </w:rPr>
+              <w:t xml:space="preserve">2028年3月20日</w:t>
+            </w:r>
+          </w:p>
+        </w:tc>
+        <w:tc>
+          <w:tcPr>
+            <w:tcW w:w="2300" w:type="dxa"/>
+            <w:tcBorders>
+              <w:top w:val="single" w:color="BFBFBF" w:sz="4" w:space="0"/>
+              <w:left w:val="single" w:color="BFBFBF" w:sz="4" w:space="0"/>
+              <w:bottom w:val="single" w:color="BFBFBF" w:sz="4" w:space="0"/>
+              <w:right w:val="single" w:color="BFBFBF" w:sz="4" w:space="0"/>
+            </w:tcBorders>
+            <w:tcMar>
+              <w:top w:w="60" w:type="dxa"/>
+              <w:left w:w="90" w:type="dxa"/>
+              <w:bottom w:w="60" w:type="dxa"/>
+              <w:right w:w="90" w:type="dxa"/>
+            </w:tcMar>
+            <w:vAlign w:val="center"/>
+          </w:tcPr>
+          <w:p>
+            <w:pPr>
+              <w:spacing w:after="10" w:line="270" w:lineRule="auto"/>
+            </w:pPr>
+            <w:r>
+              <w:rPr>
+                <w:rFonts w:ascii="Calibri" w:hAnsi="Calibri" w:eastAsia="微软雅黑" w:cs="Calibri"/>
+                <w:sz w:val="18"/>
+                <w:szCs w:val="18"/>
+              </w:rPr>
+              <w:t xml:space="preserve">排名名额书面确认</w:t>
+            </w:r>
+          </w:p>
+        </w:tc>
+        <w:tc>
+          <w:tcPr>
+            <w:tcW w:w="2900" w:type="dxa"/>
+            <w:tcBorders>
+              <w:top w:val="single" w:color="BFBFBF" w:sz="4" w:space="0"/>
+              <w:left w:val="single" w:color="BFBFBF" w:sz="4" w:space="0"/>
+              <w:bottom w:val="single" w:color="BFBFBF" w:sz="4" w:space="0"/>
+              <w:right w:val="single" w:color="BFBFBF" w:sz="4" w:space="0"/>
+            </w:tcBorders>
+            <w:tcMar>
+              <w:top w:w="60" w:type="dxa"/>
+              <w:left w:w="90" w:type="dxa"/>
+              <w:bottom w:w="60" w:type="dxa"/>
+              <w:right w:w="90" w:type="dxa"/>
+            </w:tcMar>
+            <w:vAlign w:val="center"/>
+          </w:tcPr>
+          <w:p>
+            <w:pPr>
+              <w:spacing w:after="10" w:line="270" w:lineRule="auto"/>
+            </w:pPr>
+            <w:r>
+              <w:rPr>
+                <w:rFonts w:ascii="Calibri" w:hAnsi="Calibri" w:eastAsia="微软雅黑" w:cs="Calibri"/>
+                <w:sz w:val="18"/>
+                <w:szCs w:val="18"/>
+              </w:rPr>
+              <w:t xml:space="preserve">曹利国世界排名是否进入前3（第一阶段未获名额者中）</w:t>
+            </w:r>
+          </w:p>
+        </w:tc>
+        <w:tc>
+          <w:tcPr>
+            <w:tcW w:w="2738" w:type="dxa"/>
+            <w:tcBorders>
+              <w:top w:val="single" w:color="BFBFBF" w:sz="4" w:space="0"/>
+              <w:left w:val="single" w:color="BFBFBF" w:sz="4" w:space="0"/>
+              <w:bottom w:val="single" w:color="BFBFBF" w:sz="4" w:space="0"/>
+              <w:right w:val="single" w:color="BFBFBF" w:sz="4" w:space="0"/>
+            </w:tcBorders>
+            <w:tcMar>
+              <w:top w:w="60" w:type="dxa"/>
+              <w:left w:w="90" w:type="dxa"/>
+              <w:bottom w:w="60" w:type="dxa"/>
+              <w:right w:w="90" w:type="dxa"/>
+            </w:tcMar>
+            <w:vAlign w:val="center"/>
+          </w:tcPr>
+          <w:p>
+            <w:pPr>
+              <w:spacing w:after="10" w:line="270" w:lineRule="auto"/>
+            </w:pPr>
+            <w:r>
+              <w:rPr>
+                <w:rFonts w:ascii="Calibri" w:hAnsi="Calibri" w:eastAsia="微软雅黑" w:cs="Calibri"/>
+                <w:sz w:val="18"/>
+                <w:szCs w:val="18"/>
+              </w:rPr>
+              <w:t xml:space="preserve">这是世锦赛之后的第二条路径</w:t>
+            </w:r>
+            <w:r>
+              <w:rPr>
+                <w:rFonts w:ascii="Calibri" w:hAnsi="Calibri" w:eastAsia="微软雅黑" w:cs="Calibri"/>
+                <w:sz w:val="17"/>
+                <w:szCs w:val="17"/>
+              </w:rPr>
+              <w:t xml:space="preserve">[1]</w:t>
+            </w:r>
+          </w:p>
+        </w:tc>
+      </w:tr>
+    </w:tbl>
+    <w:p>
+      <w:pPr>
+        <w:spacing w:after="60"/>
+      </w:pPr>
+    </w:p>
+    <w:p>
+      <w:pPr>
+        <w:keepNext/>
+        <w:spacing w:before="100" w:after="60"/>
+      </w:pPr>
+      <w:r>
+        <w:rPr>
+          <w:rFonts w:ascii="Calibri" w:hAnsi="Calibri" w:eastAsia="微软雅黑" w:cs="Calibri"/>
+          <w:b/>
+          <w:bCs/>
+          <w:color w:val="1F3A5F"/>
+          <w:sz w:val="22"/>
+          <w:szCs w:val="22"/>
+        </w:rPr>
+        <w:t xml:space="preserve">判读规则（分析判断）</w:t>
+      </w:r>
+    </w:p>
+    <w:p>
+      <w:pPr>
+        <w:pStyle w:val="19"/>
+        <w:numPr>
+          <w:ilvl w:val="0"/>
+          <w:numId w:val="2"/>
+        </w:numPr>
+        <w:spacing w:after="60" w:line="320" w:lineRule="auto"/>
+      </w:pPr>
+      <w:r>
+        <w:rPr>
+          <w:rFonts w:ascii="Calibri" w:hAnsi="Calibri" w:eastAsia="微软雅黑" w:cs="Calibri"/>
+          <w:b/>
+          <w:bCs/>
+          <w:sz w:val="21"/>
+          <w:szCs w:val="21"/>
+        </w:rPr>
+        <w:t xml:space="preserve">定位成立的信号：</w:t>
+      </w:r>
+      <w:r>
+        <w:rPr>
+          <w:rFonts w:ascii="Calibri" w:hAnsi="Calibri" w:eastAsia="微软雅黑" w:cs="Calibri"/>
+          <w:sz w:val="21"/>
+          <w:szCs w:val="21"/>
+        </w:rPr>
+        <w:t xml:space="preserve">2027年排名赛和亚锦赛由曹利国出战；2027年世锦赛进入前4；至少战胜一名世界冠军级对手（五味虹登、文田健一郎、苏尔坦加利、沙尔申别科夫）。</w:t>
+      </w:r>
+    </w:p>
+    <w:p>
+      <w:pPr>
+        <w:pStyle w:val="19"/>
+        <w:numPr>
+          <w:ilvl w:val="0"/>
+          <w:numId w:val="2"/>
+        </w:numPr>
+        <w:spacing w:after="60" w:line="320" w:lineRule="auto"/>
+      </w:pPr>
+      <w:r>
+        <w:rPr>
+          <w:rFonts w:ascii="Calibri" w:hAnsi="Calibri" w:eastAsia="微软雅黑" w:cs="Calibri"/>
+          <w:b/>
+          <w:bCs/>
+          <w:sz w:val="21"/>
+          <w:szCs w:val="21"/>
+        </w:rPr>
+        <w:t xml:space="preserve">定位需要附加条件的信号：</w:t>
+      </w:r>
+      <w:r>
+        <w:rPr>
+          <w:rFonts w:ascii="Calibri" w:hAnsi="Calibri" w:eastAsia="微软雅黑" w:cs="Calibri"/>
+          <w:sz w:val="21"/>
+          <w:szCs w:val="21"/>
+        </w:rPr>
+        <w:t xml:space="preserve">2027年上半年国际赛事由谭浩东或宝音吉雅出战；曹利国未入选2027年世锦赛；对世界冠军级对手继续全负。</w:t>
+      </w:r>
+    </w:p>
+    <w:p>
+      <w:pPr>
+        <w:pStyle w:val="19"/>
+        <w:numPr>
+          <w:ilvl w:val="0"/>
+          <w:numId w:val="2"/>
+        </w:numPr>
+        <w:spacing w:after="60" w:line="320" w:lineRule="auto"/>
+      </w:pPr>
+      <w:r>
+        <w:rPr>
+          <w:rFonts w:ascii="Calibri" w:hAnsi="Calibri" w:eastAsia="微软雅黑" w:cs="Calibri"/>
+          <w:b/>
+          <w:bCs/>
+          <w:sz w:val="21"/>
+          <w:szCs w:val="21"/>
+        </w:rPr>
+        <w:t xml:space="preserve">需要委托方提供的材料：</w:t>
+      </w:r>
+      <w:r>
+        <w:rPr>
+          <w:rFonts w:ascii="Calibri" w:hAnsi="Calibri" w:eastAsia="微软雅黑" w:cs="Calibri"/>
+          <w:sz w:val="21"/>
+          <w:szCs w:val="21"/>
+        </w:rPr>
+        <w:t xml:space="preserve">2026年三站积分和综合排名；洛杉矶周期选拔办法（公布后）；2027年各站出赛名单的确定依据。</w:t>
       </w:r>
     </w:p>
     <w:p>

</xml_diff>

<commit_message>
Add Japan wrestling sports-science support evidence to report
Add a verified table of Japan's training facilities, in-Games video
analysis, federation science outreach, weight-management practices and
JISS research, plus derived lessons for Cao Liguo in section 6.5.

Co-Authored-By: Claude Opus 5.5 <noreply@anthropic.com>
Claude-Session: https://claude.ai/code/session_01QJuodyHvSeVR7zYgSAMTnd
</commit_message>
<xml_diff>
--- a/广西队摔跤夺金情报研判_优化版.docx
+++ b/广西队摔跤夺金情报研判_优化版.docx
@@ -1280,7 +1280,7 @@
           <w:sz w:val="21"/>
           <w:szCs w:val="21"/>
         </w:rPr>
-        <w:t>21</w:t>
+        <w:t>22</w:t>
       </w:r>
     </w:p>
     <w:p>
@@ -1305,7 +1305,7 @@
           <w:szCs w:val="24"/>
         </w:rPr>
         <w:tab/>
-        <w:t>22</w:t>
+        <w:t>23</w:t>
       </w:r>
     </w:p>
     <w:p>
@@ -1330,7 +1330,7 @@
           <w:szCs w:val="24"/>
         </w:rPr>
         <w:tab/>
-        <w:t>23</w:t>
+        <w:t>24</w:t>
       </w:r>
       <w:r>
         <w:fldChar w:fldCharType="end"/>
@@ -1651,7 +1651,7 @@
           <w:sz w:val="21"/>
           <w:szCs w:val="21"/>
         </w:rPr>
-        <w:t xml:space="preserve">巴黎18个小项日本夺得8金居第1，古典式60公斤冠军也是日本选手；中国摔跤奥运金牌只有女子72公斤的两枚（王旭2004年、王娇2008年），该级别在洛杉矶取消，男子古典式和自由式从未夺金，最好成绩是银牌（常永祥2008年、曹利国2024年）。2016年里约备战时国家队在秦皇岛集训，赛前在圣保罗设适应营。外国强队和中国冠军的科研、医疗、营养保障没有可靠公开资料</w:t>
+        <w:t xml:space="preserve">巴黎18个小项日本夺得8金居第1，古典式60公斤冠军也是日本选手；中国摔跤奥运金牌只有女子72公斤的两枚（王旭2004年、王娇2008年），该级别在洛杉矶取消，男子古典式和自由式从未夺金，最好成绩是银牌（常永祥2008年、曹利国2024年）。日本的保障可核实部分包括：国家训练中心专用摔跤馆配录像分析系统，巴黎赛时国立体育科学中心远程录像分析，协会医科学委员会每年发布科学通讯；其研究建议赛前快速减重不超过体重的5%；古典式选手选择海外训练。中国冠军的科研、医疗、营养保障没有可靠公开资料</w:t>
       </w:r>
       <w:r>
         <w:rPr>
@@ -1670,7 +1670,15 @@
           <w:sz w:val="21"/>
           <w:szCs w:val="21"/>
         </w:rPr>
-        <w:t xml:space="preserve">。[6、7、8]</w:t>
+        <w:t xml:space="preserve">。</w:t>
+      </w:r>
+      <w:r>
+        <w:rPr>
+          <w:rFonts w:ascii="Calibri" w:hAnsi="Calibri" w:eastAsia="微软雅黑" w:cs="Calibri"/>
+          <w:sz w:val="21"/>
+          <w:szCs w:val="21"/>
+        </w:rPr>
+        <w:t xml:space="preserve">[6、7、8、54、56、58、59]</w:t>
       </w:r>
     </w:p>
     <w:p>
@@ -20054,15 +20062,15 @@
           <w:sz w:val="21"/>
           <w:szCs w:val="21"/>
         </w:rPr>
-        <w:t xml:space="preserve">历届外国冠军和中国冠军的科研、医疗、营养、经费保障</w:t>
-      </w:r>
-      <w:r>
-        <w:rPr>
-          <w:rFonts w:ascii="Calibri" w:hAnsi="Calibri" w:eastAsia="微软雅黑" w:cs="Calibri"/>
-          <w:sz w:val="21"/>
-          <w:szCs w:val="21"/>
-        </w:rPr>
-        <w:t xml:space="preserve">：未取得可靠公开资料</w:t>
+        <w:t xml:space="preserve">历届冠军的科研、医疗、营养、经费保障：</w:t>
+      </w:r>
+      <w:r>
+        <w:rPr>
+          <w:rFonts w:ascii="Calibri" w:hAnsi="Calibri" w:eastAsia="微软雅黑" w:cs="Calibri"/>
+          <w:sz w:val="21"/>
+          <w:szCs w:val="21"/>
+        </w:rPr>
+        <w:t xml:space="preserve">中国冠军的相关保障未取得可靠公开资料</w:t>
       </w:r>
       <w:r>
         <w:rPr>
@@ -20081,14 +20089,13 @@
           <w:sz w:val="21"/>
           <w:szCs w:val="21"/>
         </w:rPr>
-        <w:t xml:space="preserve">；建议途径：国家体育总局官方采访、世界摔跤联合会官方报道、日本、伊朗等国摔跤协会官方介绍。</w:t>
-      </w:r>
-    </w:p>
-    <w:p>
-      <w:pPr>
-        <w:pStyle w:val="3"/>
+        <w:t xml:space="preserve">；日本的可核实部分见下表，资料以日本官方机构年报、协会刊物和同行评议论文为主。</w:t>
+      </w:r>
+    </w:p>
+    <w:p>
+      <w:pPr>
         <w:keepNext/>
-        <w:spacing w:before="180" w:after="80"/>
+        <w:spacing w:before="100" w:after="60"/>
       </w:pPr>
       <w:r>
         <w:rPr>
@@ -20096,11 +20103,1265 @@
           <w:b/>
           <w:bCs/>
           <w:color w:val="1F3A5F"/>
-          <w:sz w:val="24"/>
-          <w:szCs w:val="24"/>
-        </w:rPr>
-        <w:t xml:space="preserve">6.5 对曹利国的启示（分析判断，不是公开资料结论）</w:t>
-      </w:r>
+          <w:sz w:val="22"/>
+          <w:szCs w:val="22"/>
+        </w:rPr>
+        <w:t xml:space="preserve">日本摔跤的科研与保障（可核实部分）</w:t>
+      </w:r>
+    </w:p>
+    <w:tbl>
+      <w:tblPr>
+        <w:tblStyle w:val="14"/>
+        <w:tblW w:w="9638" w:type="dxa"/>
+        <w:tblInd w:w="0" w:type="dxa"/>
+        <w:tblBorders>
+          <w:top w:val="single" w:color="auto" w:sz="4" w:space="0"/>
+          <w:left w:val="single" w:color="auto" w:sz="4" w:space="0"/>
+          <w:bottom w:val="single" w:color="auto" w:sz="4" w:space="0"/>
+          <w:right w:val="single" w:color="auto" w:sz="4" w:space="0"/>
+          <w:insideH w:val="single" w:color="auto" w:sz="4" w:space="0"/>
+          <w:insideV w:val="single" w:color="auto" w:sz="4" w:space="0"/>
+        </w:tblBorders>
+        <w:tblLayout w:type="fixed"/>
+        <w:tblCellMar>
+          <w:top w:w="0" w:type="dxa"/>
+          <w:left w:w="10" w:type="dxa"/>
+          <w:bottom w:w="0" w:type="dxa"/>
+          <w:right w:w="10" w:type="dxa"/>
+        </w:tblCellMar>
+      </w:tblPr>
+      <w:tblGrid>
+        <w:gridCol w:w="1600"/>
+        <w:gridCol w:w="6838"/>
+        <w:gridCol w:w="1200"/>
+      </w:tblGrid>
+      <w:tr>
+        <w:trPr>
+          <w:cantSplit/>
+          <w:tblHeader/>
+        </w:trPr>
+        <w:tc>
+          <w:tcPr>
+            <w:tcW w:w="1600" w:type="dxa"/>
+            <w:tcBorders>
+              <w:top w:val="single" w:color="BFBFBF" w:sz="4" w:space="0"/>
+              <w:left w:val="single" w:color="BFBFBF" w:sz="4" w:space="0"/>
+              <w:bottom w:val="single" w:color="BFBFBF" w:sz="4" w:space="0"/>
+              <w:right w:val="single" w:color="BFBFBF" w:sz="4" w:space="0"/>
+            </w:tcBorders>
+            <w:shd w:val="clear" w:color="auto" w:fill="1F3A5F"/>
+            <w:tcMar>
+              <w:top w:w="60" w:type="dxa"/>
+              <w:left w:w="90" w:type="dxa"/>
+              <w:bottom w:w="60" w:type="dxa"/>
+              <w:right w:w="90" w:type="dxa"/>
+            </w:tcMar>
+            <w:vAlign w:val="center"/>
+          </w:tcPr>
+          <w:p>
+            <w:pPr>
+              <w:spacing w:after="10" w:line="270" w:lineRule="auto"/>
+            </w:pPr>
+            <w:r>
+              <w:rPr>
+                <w:rFonts w:ascii="Calibri" w:hAnsi="Calibri" w:eastAsia="微软雅黑" w:cs="Calibri"/>
+                <w:b/>
+                <w:bCs/>
+                <w:color w:val="FFFFFF"/>
+                <w:sz w:val="18"/>
+                <w:szCs w:val="18"/>
+              </w:rPr>
+              <w:t xml:space="preserve">要素</w:t>
+            </w:r>
+          </w:p>
+        </w:tc>
+        <w:tc>
+          <w:tcPr>
+            <w:tcW w:w="6838" w:type="dxa"/>
+            <w:tcBorders>
+              <w:top w:val="single" w:color="BFBFBF" w:sz="4" w:space="0"/>
+              <w:left w:val="single" w:color="BFBFBF" w:sz="4" w:space="0"/>
+              <w:bottom w:val="single" w:color="BFBFBF" w:sz="4" w:space="0"/>
+              <w:right w:val="single" w:color="BFBFBF" w:sz="4" w:space="0"/>
+            </w:tcBorders>
+            <w:shd w:val="clear" w:color="auto" w:fill="1F3A5F"/>
+            <w:tcMar>
+              <w:top w:w="60" w:type="dxa"/>
+              <w:left w:w="90" w:type="dxa"/>
+              <w:bottom w:w="60" w:type="dxa"/>
+              <w:right w:w="90" w:type="dxa"/>
+            </w:tcMar>
+            <w:vAlign w:val="center"/>
+          </w:tcPr>
+          <w:p>
+            <w:pPr>
+              <w:spacing w:after="10" w:line="270" w:lineRule="auto"/>
+            </w:pPr>
+            <w:r>
+              <w:rPr>
+                <w:rFonts w:ascii="Calibri" w:hAnsi="Calibri" w:eastAsia="微软雅黑" w:cs="Calibri"/>
+                <w:b/>
+                <w:bCs/>
+                <w:color w:val="FFFFFF"/>
+                <w:sz w:val="18"/>
+                <w:szCs w:val="18"/>
+              </w:rPr>
+              <w:t xml:space="preserve">做法（据原文）</w:t>
+            </w:r>
+          </w:p>
+        </w:tc>
+        <w:tc>
+          <w:tcPr>
+            <w:tcW w:w="1200" w:type="dxa"/>
+            <w:tcBorders>
+              <w:top w:val="single" w:color="BFBFBF" w:sz="4" w:space="0"/>
+              <w:left w:val="single" w:color="BFBFBF" w:sz="4" w:space="0"/>
+              <w:bottom w:val="single" w:color="BFBFBF" w:sz="4" w:space="0"/>
+              <w:right w:val="single" w:color="BFBFBF" w:sz="4" w:space="0"/>
+            </w:tcBorders>
+            <w:shd w:val="clear" w:color="auto" w:fill="1F3A5F"/>
+            <w:tcMar>
+              <w:top w:w="60" w:type="dxa"/>
+              <w:left w:w="90" w:type="dxa"/>
+              <w:bottom w:w="60" w:type="dxa"/>
+              <w:right w:w="90" w:type="dxa"/>
+            </w:tcMar>
+            <w:vAlign w:val="center"/>
+          </w:tcPr>
+          <w:p>
+            <w:pPr>
+              <w:spacing w:after="10" w:line="270" w:lineRule="auto"/>
+            </w:pPr>
+            <w:r>
+              <w:rPr>
+                <w:rFonts w:ascii="Calibri" w:hAnsi="Calibri" w:eastAsia="微软雅黑" w:cs="Calibri"/>
+                <w:b/>
+                <w:bCs/>
+                <w:color w:val="FFFFFF"/>
+                <w:sz w:val="18"/>
+                <w:szCs w:val="18"/>
+              </w:rPr>
+              <w:t xml:space="preserve">来源</w:t>
+            </w:r>
+          </w:p>
+        </w:tc>
+      </w:tr>
+      <w:tr>
+        <w:trPr>
+          <w:cantSplit/>
+        </w:trPr>
+        <w:tc>
+          <w:tcPr>
+            <w:tcW w:w="1600" w:type="dxa"/>
+            <w:tcBorders>
+              <w:top w:val="single" w:color="BFBFBF" w:sz="4" w:space="0"/>
+              <w:left w:val="single" w:color="BFBFBF" w:sz="4" w:space="0"/>
+              <w:bottom w:val="single" w:color="BFBFBF" w:sz="4" w:space="0"/>
+              <w:right w:val="single" w:color="BFBFBF" w:sz="4" w:space="0"/>
+            </w:tcBorders>
+            <w:shd w:val="clear" w:color="auto" w:fill="EEF2F7"/>
+            <w:tcMar>
+              <w:top w:w="60" w:type="dxa"/>
+              <w:left w:w="90" w:type="dxa"/>
+              <w:bottom w:w="60" w:type="dxa"/>
+              <w:right w:w="90" w:type="dxa"/>
+            </w:tcMar>
+            <w:vAlign w:val="center"/>
+          </w:tcPr>
+          <w:p>
+            <w:pPr>
+              <w:spacing w:after="10" w:line="270" w:lineRule="auto"/>
+            </w:pPr>
+            <w:r>
+              <w:rPr>
+                <w:rFonts w:ascii="Calibri" w:hAnsi="Calibri" w:eastAsia="微软雅黑" w:cs="Calibri"/>
+                <w:b/>
+                <w:bCs/>
+                <w:sz w:val="18"/>
+                <w:szCs w:val="18"/>
+              </w:rPr>
+              <w:t xml:space="preserve">训练场馆</w:t>
+            </w:r>
+          </w:p>
+        </w:tc>
+        <w:tc>
+          <w:tcPr>
+            <w:tcW w:w="6838" w:type="dxa"/>
+            <w:tcBorders>
+              <w:top w:val="single" w:color="BFBFBF" w:sz="4" w:space="0"/>
+              <w:left w:val="single" w:color="BFBFBF" w:sz="4" w:space="0"/>
+              <w:bottom w:val="single" w:color="BFBFBF" w:sz="4" w:space="0"/>
+              <w:right w:val="single" w:color="BFBFBF" w:sz="4" w:space="0"/>
+            </w:tcBorders>
+            <w:tcMar>
+              <w:top w:w="60" w:type="dxa"/>
+              <w:left w:w="90" w:type="dxa"/>
+              <w:bottom w:w="60" w:type="dxa"/>
+              <w:right w:w="90" w:type="dxa"/>
+            </w:tcMar>
+            <w:vAlign w:val="center"/>
+          </w:tcPr>
+          <w:p>
+            <w:pPr>
+              <w:spacing w:after="10" w:line="270" w:lineRule="auto"/>
+            </w:pPr>
+            <w:r>
+              <w:rPr>
+                <w:rFonts w:ascii="Calibri" w:hAnsi="Calibri" w:eastAsia="微软雅黑" w:cs="Calibri"/>
+                <w:sz w:val="18"/>
+                <w:szCs w:val="18"/>
+              </w:rPr>
+              <w:t xml:space="preserve">国家训练中心西馆地下1层设6块摔跤垫，墙面和天花板装高清摄像机，配技术分析室，可现场做录像分析</w:t>
+            </w:r>
+          </w:p>
+        </w:tc>
+        <w:tc>
+          <w:tcPr>
+            <w:tcW w:w="1200" w:type="dxa"/>
+            <w:tcBorders>
+              <w:top w:val="single" w:color="BFBFBF" w:sz="4" w:space="0"/>
+              <w:left w:val="single" w:color="BFBFBF" w:sz="4" w:space="0"/>
+              <w:bottom w:val="single" w:color="BFBFBF" w:sz="4" w:space="0"/>
+              <w:right w:val="single" w:color="BFBFBF" w:sz="4" w:space="0"/>
+            </w:tcBorders>
+            <w:tcMar>
+              <w:top w:w="60" w:type="dxa"/>
+              <w:left w:w="90" w:type="dxa"/>
+              <w:bottom w:w="60" w:type="dxa"/>
+              <w:right w:w="90" w:type="dxa"/>
+            </w:tcMar>
+            <w:vAlign w:val="center"/>
+          </w:tcPr>
+          <w:p>
+            <w:pPr>
+              <w:spacing w:after="10" w:line="270" w:lineRule="auto"/>
+            </w:pPr>
+            <w:r>
+              <w:rPr>
+                <w:rFonts w:ascii="Calibri" w:hAnsi="Calibri" w:eastAsia="微软雅黑" w:cs="Calibri"/>
+                <w:sz w:val="17"/>
+                <w:szCs w:val="17"/>
+              </w:rPr>
+              <w:t xml:space="preserve">[54]</w:t>
+            </w:r>
+          </w:p>
+        </w:tc>
+      </w:tr>
+      <w:tr>
+        <w:trPr>
+          <w:cantSplit/>
+        </w:trPr>
+        <w:tc>
+          <w:tcPr>
+            <w:tcW w:w="1600" w:type="dxa"/>
+            <w:tcBorders>
+              <w:top w:val="single" w:color="BFBFBF" w:sz="4" w:space="0"/>
+              <w:left w:val="single" w:color="BFBFBF" w:sz="4" w:space="0"/>
+              <w:bottom w:val="single" w:color="BFBFBF" w:sz="4" w:space="0"/>
+              <w:right w:val="single" w:color="BFBFBF" w:sz="4" w:space="0"/>
+            </w:tcBorders>
+            <w:shd w:val="clear" w:color="auto" w:fill="EEF2F7"/>
+            <w:tcMar>
+              <w:top w:w="60" w:type="dxa"/>
+              <w:left w:w="90" w:type="dxa"/>
+              <w:bottom w:w="60" w:type="dxa"/>
+              <w:right w:w="90" w:type="dxa"/>
+            </w:tcMar>
+            <w:vAlign w:val="center"/>
+          </w:tcPr>
+          <w:p>
+            <w:pPr>
+              <w:spacing w:after="10" w:line="270" w:lineRule="auto"/>
+            </w:pPr>
+            <w:r>
+              <w:rPr>
+                <w:rFonts w:ascii="Calibri" w:hAnsi="Calibri" w:eastAsia="微软雅黑" w:cs="Calibri"/>
+                <w:b/>
+                <w:bCs/>
+                <w:sz w:val="18"/>
+                <w:szCs w:val="18"/>
+              </w:rPr>
+              <w:t xml:space="preserve">赛时远程分析</w:t>
+            </w:r>
+          </w:p>
+        </w:tc>
+        <w:tc>
+          <w:tcPr>
+            <w:tcW w:w="6838" w:type="dxa"/>
+            <w:tcBorders>
+              <w:top w:val="single" w:color="BFBFBF" w:sz="4" w:space="0"/>
+              <w:left w:val="single" w:color="BFBFBF" w:sz="4" w:space="0"/>
+              <w:bottom w:val="single" w:color="BFBFBF" w:sz="4" w:space="0"/>
+              <w:right w:val="single" w:color="BFBFBF" w:sz="4" w:space="0"/>
+            </w:tcBorders>
+            <w:tcMar>
+              <w:top w:w="60" w:type="dxa"/>
+              <w:left w:w="90" w:type="dxa"/>
+              <w:bottom w:w="60" w:type="dxa"/>
+              <w:right w:w="90" w:type="dxa"/>
+            </w:tcMar>
+            <w:vAlign w:val="center"/>
+          </w:tcPr>
+          <w:p>
+            <w:pPr>
+              <w:spacing w:after="10" w:line="270" w:lineRule="auto"/>
+            </w:pPr>
+            <w:r>
+              <w:rPr>
+                <w:rFonts w:ascii="Calibri" w:hAnsi="Calibri" w:eastAsia="微软雅黑" w:cs="Calibri"/>
+                <w:sz w:val="18"/>
+                <w:szCs w:val="18"/>
+              </w:rPr>
+              <w:t xml:space="preserve">巴黎奥运会期间，国立体育科学中心开设远程录像分析席，边看官方转播边为现场做分析；摔跤是使用的6个项目之一（6个项目共103人次）</w:t>
+            </w:r>
+          </w:p>
+        </w:tc>
+        <w:tc>
+          <w:tcPr>
+            <w:tcW w:w="1200" w:type="dxa"/>
+            <w:tcBorders>
+              <w:top w:val="single" w:color="BFBFBF" w:sz="4" w:space="0"/>
+              <w:left w:val="single" w:color="BFBFBF" w:sz="4" w:space="0"/>
+              <w:bottom w:val="single" w:color="BFBFBF" w:sz="4" w:space="0"/>
+              <w:right w:val="single" w:color="BFBFBF" w:sz="4" w:space="0"/>
+            </w:tcBorders>
+            <w:tcMar>
+              <w:top w:w="60" w:type="dxa"/>
+              <w:left w:w="90" w:type="dxa"/>
+              <w:bottom w:w="60" w:type="dxa"/>
+              <w:right w:w="90" w:type="dxa"/>
+            </w:tcMar>
+            <w:vAlign w:val="center"/>
+          </w:tcPr>
+          <w:p>
+            <w:pPr>
+              <w:spacing w:after="10" w:line="270" w:lineRule="auto"/>
+            </w:pPr>
+            <w:r>
+              <w:rPr>
+                <w:rFonts w:ascii="Calibri" w:hAnsi="Calibri" w:eastAsia="微软雅黑" w:cs="Calibri"/>
+                <w:sz w:val="17"/>
+                <w:szCs w:val="17"/>
+              </w:rPr>
+              <w:t xml:space="preserve">[54]</w:t>
+            </w:r>
+          </w:p>
+        </w:tc>
+      </w:tr>
+      <w:tr>
+        <w:trPr>
+          <w:cantSplit/>
+        </w:trPr>
+        <w:tc>
+          <w:tcPr>
+            <w:tcW w:w="1600" w:type="dxa"/>
+            <w:tcBorders>
+              <w:top w:val="single" w:color="BFBFBF" w:sz="4" w:space="0"/>
+              <w:left w:val="single" w:color="BFBFBF" w:sz="4" w:space="0"/>
+              <w:bottom w:val="single" w:color="BFBFBF" w:sz="4" w:space="0"/>
+              <w:right w:val="single" w:color="BFBFBF" w:sz="4" w:space="0"/>
+            </w:tcBorders>
+            <w:shd w:val="clear" w:color="auto" w:fill="EEF2F7"/>
+            <w:tcMar>
+              <w:top w:w="60" w:type="dxa"/>
+              <w:left w:w="90" w:type="dxa"/>
+              <w:bottom w:w="60" w:type="dxa"/>
+              <w:right w:w="90" w:type="dxa"/>
+            </w:tcMar>
+            <w:vAlign w:val="center"/>
+          </w:tcPr>
+          <w:p>
+            <w:pPr>
+              <w:spacing w:after="10" w:line="270" w:lineRule="auto"/>
+            </w:pPr>
+            <w:r>
+              <w:rPr>
+                <w:rFonts w:ascii="Calibri" w:hAnsi="Calibri" w:eastAsia="微软雅黑" w:cs="Calibri"/>
+                <w:b/>
+                <w:bCs/>
+                <w:sz w:val="18"/>
+                <w:szCs w:val="18"/>
+              </w:rPr>
+              <w:t xml:space="preserve">医疗康复</w:t>
+            </w:r>
+          </w:p>
+        </w:tc>
+        <w:tc>
+          <w:tcPr>
+            <w:tcW w:w="6838" w:type="dxa"/>
+            <w:tcBorders>
+              <w:top w:val="single" w:color="BFBFBF" w:sz="4" w:space="0"/>
+              <w:left w:val="single" w:color="BFBFBF" w:sz="4" w:space="0"/>
+              <w:bottom w:val="single" w:color="BFBFBF" w:sz="4" w:space="0"/>
+              <w:right w:val="single" w:color="BFBFBF" w:sz="4" w:space="0"/>
+            </w:tcBorders>
+            <w:tcMar>
+              <w:top w:w="60" w:type="dxa"/>
+              <w:left w:w="90" w:type="dxa"/>
+              <w:bottom w:w="60" w:type="dxa"/>
+              <w:right w:w="90" w:type="dxa"/>
+            </w:tcMar>
+            <w:vAlign w:val="center"/>
+          </w:tcPr>
+          <w:p>
+            <w:pPr>
+              <w:spacing w:after="10" w:line="270" w:lineRule="auto"/>
+            </w:pPr>
+            <w:r>
+              <w:rPr>
+                <w:rFonts w:ascii="Calibri" w:hAnsi="Calibri" w:eastAsia="微软雅黑" w:cs="Calibri"/>
+                <w:sz w:val="18"/>
+                <w:szCs w:val="18"/>
+              </w:rPr>
+              <w:t xml:space="preserve">2024年度体育科学中心运动员康复，摔跤为554人次；中心医生持续研究摔跤比赛中按站姿分类的伤病（已发表第5报）</w:t>
+            </w:r>
+          </w:p>
+        </w:tc>
+        <w:tc>
+          <w:tcPr>
+            <w:tcW w:w="1200" w:type="dxa"/>
+            <w:tcBorders>
+              <w:top w:val="single" w:color="BFBFBF" w:sz="4" w:space="0"/>
+              <w:left w:val="single" w:color="BFBFBF" w:sz="4" w:space="0"/>
+              <w:bottom w:val="single" w:color="BFBFBF" w:sz="4" w:space="0"/>
+              <w:right w:val="single" w:color="BFBFBF" w:sz="4" w:space="0"/>
+            </w:tcBorders>
+            <w:tcMar>
+              <w:top w:w="60" w:type="dxa"/>
+              <w:left w:w="90" w:type="dxa"/>
+              <w:bottom w:w="60" w:type="dxa"/>
+              <w:right w:w="90" w:type="dxa"/>
+            </w:tcMar>
+            <w:vAlign w:val="center"/>
+          </w:tcPr>
+          <w:p>
+            <w:pPr>
+              <w:spacing w:after="10" w:line="270" w:lineRule="auto"/>
+            </w:pPr>
+            <w:r>
+              <w:rPr>
+                <w:rFonts w:ascii="Calibri" w:hAnsi="Calibri" w:eastAsia="微软雅黑" w:cs="Calibri"/>
+                <w:sz w:val="17"/>
+                <w:szCs w:val="17"/>
+              </w:rPr>
+              <w:t xml:space="preserve">[54]</w:t>
+            </w:r>
+          </w:p>
+        </w:tc>
+      </w:tr>
+      <w:tr>
+        <w:trPr>
+          <w:cantSplit/>
+        </w:trPr>
+        <w:tc>
+          <w:tcPr>
+            <w:tcW w:w="1600" w:type="dxa"/>
+            <w:tcBorders>
+              <w:top w:val="single" w:color="BFBFBF" w:sz="4" w:space="0"/>
+              <w:left w:val="single" w:color="BFBFBF" w:sz="4" w:space="0"/>
+              <w:bottom w:val="single" w:color="BFBFBF" w:sz="4" w:space="0"/>
+              <w:right w:val="single" w:color="BFBFBF" w:sz="4" w:space="0"/>
+            </w:tcBorders>
+            <w:shd w:val="clear" w:color="auto" w:fill="EEF2F7"/>
+            <w:tcMar>
+              <w:top w:w="60" w:type="dxa"/>
+              <w:left w:w="90" w:type="dxa"/>
+              <w:bottom w:w="60" w:type="dxa"/>
+              <w:right w:w="90" w:type="dxa"/>
+            </w:tcMar>
+            <w:vAlign w:val="center"/>
+          </w:tcPr>
+          <w:p>
+            <w:pPr>
+              <w:spacing w:after="10" w:line="270" w:lineRule="auto"/>
+            </w:pPr>
+            <w:r>
+              <w:rPr>
+                <w:rFonts w:ascii="Calibri" w:hAnsi="Calibri" w:eastAsia="微软雅黑" w:cs="Calibri"/>
+                <w:b/>
+                <w:bCs/>
+                <w:sz w:val="18"/>
+                <w:szCs w:val="18"/>
+              </w:rPr>
+              <w:t xml:space="preserve">协会医科学委员会</w:t>
+            </w:r>
+          </w:p>
+        </w:tc>
+        <w:tc>
+          <w:tcPr>
+            <w:tcW w:w="6838" w:type="dxa"/>
+            <w:tcBorders>
+              <w:top w:val="single" w:color="BFBFBF" w:sz="4" w:space="0"/>
+              <w:left w:val="single" w:color="BFBFBF" w:sz="4" w:space="0"/>
+              <w:bottom w:val="single" w:color="BFBFBF" w:sz="4" w:space="0"/>
+              <w:right w:val="single" w:color="BFBFBF" w:sz="4" w:space="0"/>
+            </w:tcBorders>
+            <w:tcMar>
+              <w:top w:w="60" w:type="dxa"/>
+              <w:left w:w="90" w:type="dxa"/>
+              <w:bottom w:w="60" w:type="dxa"/>
+              <w:right w:w="90" w:type="dxa"/>
+            </w:tcMar>
+            <w:vAlign w:val="center"/>
+          </w:tcPr>
+          <w:p>
+            <w:pPr>
+              <w:spacing w:after="10" w:line="270" w:lineRule="auto"/>
+            </w:pPr>
+            <w:r>
+              <w:rPr>
+                <w:rFonts w:ascii="Calibri" w:hAnsi="Calibri" w:eastAsia="微软雅黑" w:cs="Calibri"/>
+                <w:sz w:val="18"/>
+                <w:szCs w:val="18"/>
+              </w:rPr>
+              <w:t xml:space="preserve">每年出版《摔跤科学通讯》；2025年12月在天皇杯全日本锦标赛现场首次举办“摔跤科学枢纽”，展示研究海报和影像，主题包括竞技能力、状态调整和伤病预防</w:t>
+            </w:r>
+          </w:p>
+        </w:tc>
+        <w:tc>
+          <w:tcPr>
+            <w:tcW w:w="1200" w:type="dxa"/>
+            <w:tcBorders>
+              <w:top w:val="single" w:color="BFBFBF" w:sz="4" w:space="0"/>
+              <w:left w:val="single" w:color="BFBFBF" w:sz="4" w:space="0"/>
+              <w:bottom w:val="single" w:color="BFBFBF" w:sz="4" w:space="0"/>
+              <w:right w:val="single" w:color="BFBFBF" w:sz="4" w:space="0"/>
+            </w:tcBorders>
+            <w:tcMar>
+              <w:top w:w="60" w:type="dxa"/>
+              <w:left w:w="90" w:type="dxa"/>
+              <w:bottom w:w="60" w:type="dxa"/>
+              <w:right w:w="90" w:type="dxa"/>
+            </w:tcMar>
+            <w:vAlign w:val="center"/>
+          </w:tcPr>
+          <w:p>
+            <w:pPr>
+              <w:spacing w:after="10" w:line="270" w:lineRule="auto"/>
+            </w:pPr>
+            <w:r>
+              <w:rPr>
+                <w:rFonts w:ascii="Calibri" w:hAnsi="Calibri" w:eastAsia="微软雅黑" w:cs="Calibri"/>
+                <w:sz w:val="17"/>
+                <w:szCs w:val="17"/>
+              </w:rPr>
+              <w:t xml:space="preserve">[55、56]</w:t>
+            </w:r>
+          </w:p>
+        </w:tc>
+      </w:tr>
+      <w:tr>
+        <w:trPr>
+          <w:cantSplit/>
+        </w:trPr>
+        <w:tc>
+          <w:tcPr>
+            <w:tcW w:w="1600" w:type="dxa"/>
+            <w:tcBorders>
+              <w:top w:val="single" w:color="BFBFBF" w:sz="4" w:space="0"/>
+              <w:left w:val="single" w:color="BFBFBF" w:sz="4" w:space="0"/>
+              <w:bottom w:val="single" w:color="BFBFBF" w:sz="4" w:space="0"/>
+              <w:right w:val="single" w:color="BFBFBF" w:sz="4" w:space="0"/>
+            </w:tcBorders>
+            <w:shd w:val="clear" w:color="auto" w:fill="EEF2F7"/>
+            <w:tcMar>
+              <w:top w:w="60" w:type="dxa"/>
+              <w:left w:w="90" w:type="dxa"/>
+              <w:bottom w:w="60" w:type="dxa"/>
+              <w:right w:w="90" w:type="dxa"/>
+            </w:tcMar>
+            <w:vAlign w:val="center"/>
+          </w:tcPr>
+          <w:p>
+            <w:pPr>
+              <w:spacing w:after="10" w:line="270" w:lineRule="auto"/>
+            </w:pPr>
+            <w:r>
+              <w:rPr>
+                <w:rFonts w:ascii="Calibri" w:hAnsi="Calibri" w:eastAsia="微软雅黑" w:cs="Calibri"/>
+                <w:b/>
+                <w:bCs/>
+                <w:sz w:val="18"/>
+                <w:szCs w:val="18"/>
+              </w:rPr>
+              <w:t xml:space="preserve">体能训练</w:t>
+            </w:r>
+          </w:p>
+        </w:tc>
+        <w:tc>
+          <w:tcPr>
+            <w:tcW w:w="6838" w:type="dxa"/>
+            <w:tcBorders>
+              <w:top w:val="single" w:color="BFBFBF" w:sz="4" w:space="0"/>
+              <w:left w:val="single" w:color="BFBFBF" w:sz="4" w:space="0"/>
+              <w:bottom w:val="single" w:color="BFBFBF" w:sz="4" w:space="0"/>
+              <w:right w:val="single" w:color="BFBFBF" w:sz="4" w:space="0"/>
+            </w:tcBorders>
+            <w:tcMar>
+              <w:top w:w="60" w:type="dxa"/>
+              <w:left w:w="90" w:type="dxa"/>
+              <w:bottom w:w="60" w:type="dxa"/>
+              <w:right w:w="90" w:type="dxa"/>
+            </w:tcMar>
+            <w:vAlign w:val="center"/>
+          </w:tcPr>
+          <w:p>
+            <w:pPr>
+              <w:spacing w:after="10" w:line="270" w:lineRule="auto"/>
+            </w:pPr>
+            <w:r>
+              <w:rPr>
+                <w:rFonts w:ascii="Calibri" w:hAnsi="Calibri" w:eastAsia="微软雅黑" w:cs="Calibri"/>
+                <w:sz w:val="18"/>
+                <w:szCs w:val="18"/>
+              </w:rPr>
+              <w:t xml:space="preserve">樋口黎和镜优翔在国立体育科学中心的低氧舱做功率车训练；樋口以高强度、低次数力量训练保肌降脂；镜优翔每周3至5次力量训练，3年去脂体重增加3公斤，体脂率低于20%</w:t>
+            </w:r>
+          </w:p>
+        </w:tc>
+        <w:tc>
+          <w:tcPr>
+            <w:tcW w:w="1200" w:type="dxa"/>
+            <w:tcBorders>
+              <w:top w:val="single" w:color="BFBFBF" w:sz="4" w:space="0"/>
+              <w:left w:val="single" w:color="BFBFBF" w:sz="4" w:space="0"/>
+              <w:bottom w:val="single" w:color="BFBFBF" w:sz="4" w:space="0"/>
+              <w:right w:val="single" w:color="BFBFBF" w:sz="4" w:space="0"/>
+            </w:tcBorders>
+            <w:tcMar>
+              <w:top w:w="60" w:type="dxa"/>
+              <w:left w:w="90" w:type="dxa"/>
+              <w:bottom w:w="60" w:type="dxa"/>
+              <w:right w:w="90" w:type="dxa"/>
+            </w:tcMar>
+            <w:vAlign w:val="center"/>
+          </w:tcPr>
+          <w:p>
+            <w:pPr>
+              <w:spacing w:after="10" w:line="270" w:lineRule="auto"/>
+            </w:pPr>
+            <w:r>
+              <w:rPr>
+                <w:rFonts w:ascii="Calibri" w:hAnsi="Calibri" w:eastAsia="微软雅黑" w:cs="Calibri"/>
+                <w:sz w:val="17"/>
+                <w:szCs w:val="17"/>
+              </w:rPr>
+              <w:t xml:space="preserve">[56]</w:t>
+            </w:r>
+          </w:p>
+        </w:tc>
+      </w:tr>
+      <w:tr>
+        <w:trPr>
+          <w:cantSplit/>
+        </w:trPr>
+        <w:tc>
+          <w:tcPr>
+            <w:tcW w:w="1600" w:type="dxa"/>
+            <w:tcBorders>
+              <w:top w:val="single" w:color="BFBFBF" w:sz="4" w:space="0"/>
+              <w:left w:val="single" w:color="BFBFBF" w:sz="4" w:space="0"/>
+              <w:bottom w:val="single" w:color="BFBFBF" w:sz="4" w:space="0"/>
+              <w:right w:val="single" w:color="BFBFBF" w:sz="4" w:space="0"/>
+            </w:tcBorders>
+            <w:shd w:val="clear" w:color="auto" w:fill="EEF2F7"/>
+            <w:tcMar>
+              <w:top w:w="60" w:type="dxa"/>
+              <w:left w:w="90" w:type="dxa"/>
+              <w:bottom w:w="60" w:type="dxa"/>
+              <w:right w:w="90" w:type="dxa"/>
+            </w:tcMar>
+            <w:vAlign w:val="center"/>
+          </w:tcPr>
+          <w:p>
+            <w:pPr>
+              <w:spacing w:after="10" w:line="270" w:lineRule="auto"/>
+            </w:pPr>
+            <w:r>
+              <w:rPr>
+                <w:rFonts w:ascii="Calibri" w:hAnsi="Calibri" w:eastAsia="微软雅黑" w:cs="Calibri"/>
+                <w:b/>
+                <w:bCs/>
+                <w:sz w:val="18"/>
+                <w:szCs w:val="18"/>
+              </w:rPr>
+              <w:t xml:space="preserve">减重方法</w:t>
+            </w:r>
+          </w:p>
+        </w:tc>
+        <w:tc>
+          <w:tcPr>
+            <w:tcW w:w="6838" w:type="dxa"/>
+            <w:tcBorders>
+              <w:top w:val="single" w:color="BFBFBF" w:sz="4" w:space="0"/>
+              <w:left w:val="single" w:color="BFBFBF" w:sz="4" w:space="0"/>
+              <w:bottom w:val="single" w:color="BFBFBF" w:sz="4" w:space="0"/>
+              <w:right w:val="single" w:color="BFBFBF" w:sz="4" w:space="0"/>
+            </w:tcBorders>
+            <w:tcMar>
+              <w:top w:w="60" w:type="dxa"/>
+              <w:left w:w="90" w:type="dxa"/>
+              <w:bottom w:w="60" w:type="dxa"/>
+              <w:right w:w="90" w:type="dxa"/>
+            </w:tcMar>
+            <w:vAlign w:val="center"/>
+          </w:tcPr>
+          <w:p>
+            <w:pPr>
+              <w:spacing w:after="10" w:line="270" w:lineRule="auto"/>
+            </w:pPr>
+            <w:r>
+              <w:rPr>
+                <w:rFonts w:ascii="Calibri" w:hAnsi="Calibri" w:eastAsia="微软雅黑" w:cs="Calibri"/>
+                <w:sz w:val="18"/>
+                <w:szCs w:val="18"/>
+              </w:rPr>
+              <w:t xml:space="preserve">樋口约3个月，每天少摄入500千卡，约2周减1公斤，低脂期和低糖（生酮）期交替，赛前约2天脱水；藤波朱理约2个月，主要调整碳水，巴黎未做脱水减重</w:t>
+            </w:r>
+          </w:p>
+        </w:tc>
+        <w:tc>
+          <w:tcPr>
+            <w:tcW w:w="1200" w:type="dxa"/>
+            <w:tcBorders>
+              <w:top w:val="single" w:color="BFBFBF" w:sz="4" w:space="0"/>
+              <w:left w:val="single" w:color="BFBFBF" w:sz="4" w:space="0"/>
+              <w:bottom w:val="single" w:color="BFBFBF" w:sz="4" w:space="0"/>
+              <w:right w:val="single" w:color="BFBFBF" w:sz="4" w:space="0"/>
+            </w:tcBorders>
+            <w:tcMar>
+              <w:top w:w="60" w:type="dxa"/>
+              <w:left w:w="90" w:type="dxa"/>
+              <w:bottom w:w="60" w:type="dxa"/>
+              <w:right w:w="90" w:type="dxa"/>
+            </w:tcMar>
+            <w:vAlign w:val="center"/>
+          </w:tcPr>
+          <w:p>
+            <w:pPr>
+              <w:spacing w:after="10" w:line="270" w:lineRule="auto"/>
+            </w:pPr>
+            <w:r>
+              <w:rPr>
+                <w:rFonts w:ascii="Calibri" w:hAnsi="Calibri" w:eastAsia="微软雅黑" w:cs="Calibri"/>
+                <w:sz w:val="17"/>
+                <w:szCs w:val="17"/>
+              </w:rPr>
+              <w:t xml:space="preserve">[56]</w:t>
+            </w:r>
+          </w:p>
+        </w:tc>
+      </w:tr>
+      <w:tr>
+        <w:trPr>
+          <w:cantSplit/>
+        </w:trPr>
+        <w:tc>
+          <w:tcPr>
+            <w:tcW w:w="1600" w:type="dxa"/>
+            <w:tcBorders>
+              <w:top w:val="single" w:color="BFBFBF" w:sz="4" w:space="0"/>
+              <w:left w:val="single" w:color="BFBFBF" w:sz="4" w:space="0"/>
+              <w:bottom w:val="single" w:color="BFBFBF" w:sz="4" w:space="0"/>
+              <w:right w:val="single" w:color="BFBFBF" w:sz="4" w:space="0"/>
+            </w:tcBorders>
+            <w:shd w:val="clear" w:color="auto" w:fill="EEF2F7"/>
+            <w:tcMar>
+              <w:top w:w="60" w:type="dxa"/>
+              <w:left w:w="90" w:type="dxa"/>
+              <w:bottom w:w="60" w:type="dxa"/>
+              <w:right w:w="90" w:type="dxa"/>
+            </w:tcMar>
+            <w:vAlign w:val="center"/>
+          </w:tcPr>
+          <w:p>
+            <w:pPr>
+              <w:spacing w:after="10" w:line="270" w:lineRule="auto"/>
+            </w:pPr>
+            <w:r>
+              <w:rPr>
+                <w:rFonts w:ascii="Calibri" w:hAnsi="Calibri" w:eastAsia="微软雅黑" w:cs="Calibri"/>
+                <w:b/>
+                <w:bCs/>
+                <w:sz w:val="18"/>
+                <w:szCs w:val="18"/>
+              </w:rPr>
+              <w:t xml:space="preserve">营养与补剂</w:t>
+            </w:r>
+          </w:p>
+        </w:tc>
+        <w:tc>
+          <w:tcPr>
+            <w:tcW w:w="6838" w:type="dxa"/>
+            <w:tcBorders>
+              <w:top w:val="single" w:color="BFBFBF" w:sz="4" w:space="0"/>
+              <w:left w:val="single" w:color="BFBFBF" w:sz="4" w:space="0"/>
+              <w:bottom w:val="single" w:color="BFBFBF" w:sz="4" w:space="0"/>
+              <w:right w:val="single" w:color="BFBFBF" w:sz="4" w:space="0"/>
+            </w:tcBorders>
+            <w:tcMar>
+              <w:top w:w="60" w:type="dxa"/>
+              <w:left w:w="90" w:type="dxa"/>
+              <w:bottom w:w="60" w:type="dxa"/>
+              <w:right w:w="90" w:type="dxa"/>
+            </w:tcMar>
+            <w:vAlign w:val="center"/>
+          </w:tcPr>
+          <w:p>
+            <w:pPr>
+              <w:spacing w:after="10" w:line="270" w:lineRule="auto"/>
+            </w:pPr>
+            <w:r>
+              <w:rPr>
+                <w:rFonts w:ascii="Calibri" w:hAnsi="Calibri" w:eastAsia="微软雅黑" w:cs="Calibri"/>
+                <w:sz w:val="18"/>
+                <w:szCs w:val="18"/>
+              </w:rPr>
+              <w:t xml:space="preserve">樋口使用肌酸、咖啡因、硝酸盐、碳酸氢钠、β-丙氨酸；藤波减重期使用中链甘油三酯油；巴黎现场有日本体育振兴中心和味之素的日式餐食支持点</w:t>
+            </w:r>
+          </w:p>
+        </w:tc>
+        <w:tc>
+          <w:tcPr>
+            <w:tcW w:w="1200" w:type="dxa"/>
+            <w:tcBorders>
+              <w:top w:val="single" w:color="BFBFBF" w:sz="4" w:space="0"/>
+              <w:left w:val="single" w:color="BFBFBF" w:sz="4" w:space="0"/>
+              <w:bottom w:val="single" w:color="BFBFBF" w:sz="4" w:space="0"/>
+              <w:right w:val="single" w:color="BFBFBF" w:sz="4" w:space="0"/>
+            </w:tcBorders>
+            <w:tcMar>
+              <w:top w:w="60" w:type="dxa"/>
+              <w:left w:w="90" w:type="dxa"/>
+              <w:bottom w:w="60" w:type="dxa"/>
+              <w:right w:w="90" w:type="dxa"/>
+            </w:tcMar>
+            <w:vAlign w:val="center"/>
+          </w:tcPr>
+          <w:p>
+            <w:pPr>
+              <w:spacing w:after="10" w:line="270" w:lineRule="auto"/>
+            </w:pPr>
+            <w:r>
+              <w:rPr>
+                <w:rFonts w:ascii="Calibri" w:hAnsi="Calibri" w:eastAsia="微软雅黑" w:cs="Calibri"/>
+                <w:sz w:val="17"/>
+                <w:szCs w:val="17"/>
+              </w:rPr>
+              <w:t xml:space="preserve">[56]</w:t>
+            </w:r>
+          </w:p>
+        </w:tc>
+      </w:tr>
+      <w:tr>
+        <w:trPr>
+          <w:cantSplit/>
+        </w:trPr>
+        <w:tc>
+          <w:tcPr>
+            <w:tcW w:w="1600" w:type="dxa"/>
+            <w:tcBorders>
+              <w:top w:val="single" w:color="BFBFBF" w:sz="4" w:space="0"/>
+              <w:left w:val="single" w:color="BFBFBF" w:sz="4" w:space="0"/>
+              <w:bottom w:val="single" w:color="BFBFBF" w:sz="4" w:space="0"/>
+              <w:right w:val="single" w:color="BFBFBF" w:sz="4" w:space="0"/>
+            </w:tcBorders>
+            <w:shd w:val="clear" w:color="auto" w:fill="EEF2F7"/>
+            <w:tcMar>
+              <w:top w:w="60" w:type="dxa"/>
+              <w:left w:w="90" w:type="dxa"/>
+              <w:bottom w:w="60" w:type="dxa"/>
+              <w:right w:w="90" w:type="dxa"/>
+            </w:tcMar>
+            <w:vAlign w:val="center"/>
+          </w:tcPr>
+          <w:p>
+            <w:pPr>
+              <w:spacing w:after="10" w:line="270" w:lineRule="auto"/>
+            </w:pPr>
+            <w:r>
+              <w:rPr>
+                <w:rFonts w:ascii="Calibri" w:hAnsi="Calibri" w:eastAsia="微软雅黑" w:cs="Calibri"/>
+                <w:b/>
+                <w:bCs/>
+                <w:sz w:val="18"/>
+                <w:szCs w:val="18"/>
+              </w:rPr>
+              <w:t xml:space="preserve">减重研究证据</w:t>
+            </w:r>
+          </w:p>
+        </w:tc>
+        <w:tc>
+          <w:tcPr>
+            <w:tcW w:w="6838" w:type="dxa"/>
+            <w:tcBorders>
+              <w:top w:val="single" w:color="BFBFBF" w:sz="4" w:space="0"/>
+              <w:left w:val="single" w:color="BFBFBF" w:sz="4" w:space="0"/>
+              <w:bottom w:val="single" w:color="BFBFBF" w:sz="4" w:space="0"/>
+              <w:right w:val="single" w:color="BFBFBF" w:sz="4" w:space="0"/>
+            </w:tcBorders>
+            <w:tcMar>
+              <w:top w:w="60" w:type="dxa"/>
+              <w:left w:w="90" w:type="dxa"/>
+              <w:bottom w:w="60" w:type="dxa"/>
+              <w:right w:w="90" w:type="dxa"/>
+            </w:tcMar>
+            <w:vAlign w:val="center"/>
+          </w:tcPr>
+          <w:p>
+            <w:pPr>
+              <w:spacing w:after="10" w:line="270" w:lineRule="auto"/>
+            </w:pPr>
+            <w:r>
+              <w:rPr>
+                <w:rFonts w:ascii="Calibri" w:hAnsi="Calibri" w:eastAsia="微软雅黑" w:cs="Calibri"/>
+                <w:sz w:val="18"/>
+                <w:szCs w:val="18"/>
+              </w:rPr>
+              <w:t xml:space="preserve">体育科学中心团队研究：大学精英摔跤手53小时快速减重6.4%，其中71%是水分，能量密度约1507千卡/千克，远低于常用的7400至7700千卡/千克；2018年改为赛日早晨称重后，对全国锦标赛254名运动员的调查显示，男子减重达4.9%以上者比赛日身体状态明显更差，研究建议快速减重不超过体重的5%</w:t>
+            </w:r>
+          </w:p>
+        </w:tc>
+        <w:tc>
+          <w:tcPr>
+            <w:tcW w:w="1200" w:type="dxa"/>
+            <w:tcBorders>
+              <w:top w:val="single" w:color="BFBFBF" w:sz="4" w:space="0"/>
+              <w:left w:val="single" w:color="BFBFBF" w:sz="4" w:space="0"/>
+              <w:bottom w:val="single" w:color="BFBFBF" w:sz="4" w:space="0"/>
+              <w:right w:val="single" w:color="BFBFBF" w:sz="4" w:space="0"/>
+            </w:tcBorders>
+            <w:tcMar>
+              <w:top w:w="60" w:type="dxa"/>
+              <w:left w:w="90" w:type="dxa"/>
+              <w:bottom w:w="60" w:type="dxa"/>
+              <w:right w:w="90" w:type="dxa"/>
+            </w:tcMar>
+            <w:vAlign w:val="center"/>
+          </w:tcPr>
+          <w:p>
+            <w:pPr>
+              <w:spacing w:after="10" w:line="270" w:lineRule="auto"/>
+            </w:pPr>
+            <w:r>
+              <w:rPr>
+                <w:rFonts w:ascii="Calibri" w:hAnsi="Calibri" w:eastAsia="微软雅黑" w:cs="Calibri"/>
+                <w:sz w:val="17"/>
+                <w:szCs w:val="17"/>
+              </w:rPr>
+              <w:t xml:space="preserve">[57、58]</w:t>
+            </w:r>
+          </w:p>
+        </w:tc>
+      </w:tr>
+      <w:tr>
+        <w:trPr>
+          <w:cantSplit/>
+        </w:trPr>
+        <w:tc>
+          <w:tcPr>
+            <w:tcW w:w="1600" w:type="dxa"/>
+            <w:tcBorders>
+              <w:top w:val="single" w:color="BFBFBF" w:sz="4" w:space="0"/>
+              <w:left w:val="single" w:color="BFBFBF" w:sz="4" w:space="0"/>
+              <w:bottom w:val="single" w:color="BFBFBF" w:sz="4" w:space="0"/>
+              <w:right w:val="single" w:color="BFBFBF" w:sz="4" w:space="0"/>
+            </w:tcBorders>
+            <w:shd w:val="clear" w:color="auto" w:fill="EEF2F7"/>
+            <w:tcMar>
+              <w:top w:w="60" w:type="dxa"/>
+              <w:left w:w="90" w:type="dxa"/>
+              <w:bottom w:w="60" w:type="dxa"/>
+              <w:right w:w="90" w:type="dxa"/>
+            </w:tcMar>
+            <w:vAlign w:val="center"/>
+          </w:tcPr>
+          <w:p>
+            <w:pPr>
+              <w:spacing w:after="10" w:line="270" w:lineRule="auto"/>
+            </w:pPr>
+            <w:r>
+              <w:rPr>
+                <w:rFonts w:ascii="Calibri" w:hAnsi="Calibri" w:eastAsia="微软雅黑" w:cs="Calibri"/>
+                <w:b/>
+                <w:bCs/>
+                <w:sz w:val="18"/>
+                <w:szCs w:val="18"/>
+              </w:rPr>
+              <w:t xml:space="preserve">古典式路径</w:t>
+            </w:r>
+          </w:p>
+        </w:tc>
+        <w:tc>
+          <w:tcPr>
+            <w:tcW w:w="6838" w:type="dxa"/>
+            <w:tcBorders>
+              <w:top w:val="single" w:color="BFBFBF" w:sz="4" w:space="0"/>
+              <w:left w:val="single" w:color="BFBFBF" w:sz="4" w:space="0"/>
+              <w:bottom w:val="single" w:color="BFBFBF" w:sz="4" w:space="0"/>
+              <w:right w:val="single" w:color="BFBFBF" w:sz="4" w:space="0"/>
+            </w:tcBorders>
+            <w:tcMar>
+              <w:top w:w="60" w:type="dxa"/>
+              <w:left w:w="90" w:type="dxa"/>
+              <w:bottom w:w="60" w:type="dxa"/>
+              <w:right w:w="90" w:type="dxa"/>
+            </w:tcMar>
+            <w:vAlign w:val="center"/>
+          </w:tcPr>
+          <w:p>
+            <w:pPr>
+              <w:spacing w:after="10" w:line="270" w:lineRule="auto"/>
+            </w:pPr>
+            <w:r>
+              <w:rPr>
+                <w:rFonts w:ascii="Calibri" w:hAnsi="Calibri" w:eastAsia="微软雅黑" w:cs="Calibri"/>
+                <w:sz w:val="18"/>
+                <w:szCs w:val="18"/>
+              </w:rPr>
+              <w:t xml:space="preserve">国家队强化负责人赤石光生：自由式在国内的训练水平很高，古典式选手选择到海外训练，奖牌证明了这一策略；日本体育大学重点强化古典式，巴黎古典式3名代表都出自该校；文田初中转练古典式，高中由父亲执教</w:t>
+            </w:r>
+          </w:p>
+        </w:tc>
+        <w:tc>
+          <w:tcPr>
+            <w:tcW w:w="1200" w:type="dxa"/>
+            <w:tcBorders>
+              <w:top w:val="single" w:color="BFBFBF" w:sz="4" w:space="0"/>
+              <w:left w:val="single" w:color="BFBFBF" w:sz="4" w:space="0"/>
+              <w:bottom w:val="single" w:color="BFBFBF" w:sz="4" w:space="0"/>
+              <w:right w:val="single" w:color="BFBFBF" w:sz="4" w:space="0"/>
+            </w:tcBorders>
+            <w:tcMar>
+              <w:top w:w="60" w:type="dxa"/>
+              <w:left w:w="90" w:type="dxa"/>
+              <w:bottom w:w="60" w:type="dxa"/>
+              <w:right w:w="90" w:type="dxa"/>
+            </w:tcMar>
+            <w:vAlign w:val="center"/>
+          </w:tcPr>
+          <w:p>
+            <w:pPr>
+              <w:spacing w:after="10" w:line="270" w:lineRule="auto"/>
+            </w:pPr>
+            <w:r>
+              <w:rPr>
+                <w:rFonts w:ascii="Calibri" w:hAnsi="Calibri" w:eastAsia="微软雅黑" w:cs="Calibri"/>
+                <w:sz w:val="17"/>
+                <w:szCs w:val="17"/>
+              </w:rPr>
+              <w:t xml:space="preserve">[59、60、61]</w:t>
+            </w:r>
+          </w:p>
+        </w:tc>
+      </w:tr>
+      <w:tr>
+        <w:trPr>
+          <w:cantSplit/>
+        </w:trPr>
+        <w:tc>
+          <w:tcPr>
+            <w:tcW w:w="1600" w:type="dxa"/>
+            <w:tcBorders>
+              <w:top w:val="single" w:color="BFBFBF" w:sz="4" w:space="0"/>
+              <w:left w:val="single" w:color="BFBFBF" w:sz="4" w:space="0"/>
+              <w:bottom w:val="single" w:color="BFBFBF" w:sz="4" w:space="0"/>
+              <w:right w:val="single" w:color="BFBFBF" w:sz="4" w:space="0"/>
+            </w:tcBorders>
+            <w:shd w:val="clear" w:color="auto" w:fill="EEF2F7"/>
+            <w:tcMar>
+              <w:top w:w="60" w:type="dxa"/>
+              <w:left w:w="90" w:type="dxa"/>
+              <w:bottom w:w="60" w:type="dxa"/>
+              <w:right w:w="90" w:type="dxa"/>
+            </w:tcMar>
+            <w:vAlign w:val="center"/>
+          </w:tcPr>
+          <w:p>
+            <w:pPr>
+              <w:spacing w:after="10" w:line="270" w:lineRule="auto"/>
+            </w:pPr>
+            <w:r>
+              <w:rPr>
+                <w:rFonts w:ascii="Calibri" w:hAnsi="Calibri" w:eastAsia="微软雅黑" w:cs="Calibri"/>
+                <w:b/>
+                <w:bCs/>
+                <w:sz w:val="18"/>
+                <w:szCs w:val="18"/>
+              </w:rPr>
+              <w:t xml:space="preserve">国家队集训</w:t>
+            </w:r>
+          </w:p>
+        </w:tc>
+        <w:tc>
+          <w:tcPr>
+            <w:tcW w:w="6838" w:type="dxa"/>
+            <w:tcBorders>
+              <w:top w:val="single" w:color="BFBFBF" w:sz="4" w:space="0"/>
+              <w:left w:val="single" w:color="BFBFBF" w:sz="4" w:space="0"/>
+              <w:bottom w:val="single" w:color="BFBFBF" w:sz="4" w:space="0"/>
+              <w:right w:val="single" w:color="BFBFBF" w:sz="4" w:space="0"/>
+            </w:tcBorders>
+            <w:tcMar>
+              <w:top w:w="60" w:type="dxa"/>
+              <w:left w:w="90" w:type="dxa"/>
+              <w:bottom w:w="60" w:type="dxa"/>
+              <w:right w:w="90" w:type="dxa"/>
+            </w:tcMar>
+            <w:vAlign w:val="center"/>
+          </w:tcPr>
+          <w:p>
+            <w:pPr>
+              <w:spacing w:after="10" w:line="270" w:lineRule="auto"/>
+            </w:pPr>
+            <w:r>
+              <w:rPr>
+                <w:rFonts w:ascii="Calibri" w:hAnsi="Calibri" w:eastAsia="微软雅黑" w:cs="Calibri"/>
+                <w:sz w:val="18"/>
+                <w:szCs w:val="18"/>
+              </w:rPr>
+              <w:t xml:space="preserve">2026年8月古典式国家队先后在群马县草津、东京国家训练中心集训；日下尚把自己的弱点“跪撑攻防”作为集训主题，称“外国选手也盯着这一点”</w:t>
+            </w:r>
+          </w:p>
+        </w:tc>
+        <w:tc>
+          <w:tcPr>
+            <w:tcW w:w="1200" w:type="dxa"/>
+            <w:tcBorders>
+              <w:top w:val="single" w:color="BFBFBF" w:sz="4" w:space="0"/>
+              <w:left w:val="single" w:color="BFBFBF" w:sz="4" w:space="0"/>
+              <w:bottom w:val="single" w:color="BFBFBF" w:sz="4" w:space="0"/>
+              <w:right w:val="single" w:color="BFBFBF" w:sz="4" w:space="0"/>
+            </w:tcBorders>
+            <w:tcMar>
+              <w:top w:w="60" w:type="dxa"/>
+              <w:left w:w="90" w:type="dxa"/>
+              <w:bottom w:w="60" w:type="dxa"/>
+              <w:right w:w="90" w:type="dxa"/>
+            </w:tcMar>
+            <w:vAlign w:val="center"/>
+          </w:tcPr>
+          <w:p>
+            <w:pPr>
+              <w:spacing w:after="10" w:line="270" w:lineRule="auto"/>
+            </w:pPr>
+            <w:r>
+              <w:rPr>
+                <w:rFonts w:ascii="Calibri" w:hAnsi="Calibri" w:eastAsia="微软雅黑" w:cs="Calibri"/>
+                <w:sz w:val="17"/>
+                <w:szCs w:val="17"/>
+              </w:rPr>
+              <w:t xml:space="preserve">[62]</w:t>
+            </w:r>
+          </w:p>
+        </w:tc>
+      </w:tr>
+      <w:tr>
+        <w:trPr>
+          <w:cantSplit/>
+        </w:trPr>
+        <w:tc>
+          <w:tcPr>
+            <w:tcW w:w="1600" w:type="dxa"/>
+            <w:tcBorders>
+              <w:top w:val="single" w:color="BFBFBF" w:sz="4" w:space="0"/>
+              <w:left w:val="single" w:color="BFBFBF" w:sz="4" w:space="0"/>
+              <w:bottom w:val="single" w:color="BFBFBF" w:sz="4" w:space="0"/>
+              <w:right w:val="single" w:color="BFBFBF" w:sz="4" w:space="0"/>
+            </w:tcBorders>
+            <w:shd w:val="clear" w:color="auto" w:fill="EEF2F7"/>
+            <w:tcMar>
+              <w:top w:w="60" w:type="dxa"/>
+              <w:left w:w="90" w:type="dxa"/>
+              <w:bottom w:w="60" w:type="dxa"/>
+              <w:right w:w="90" w:type="dxa"/>
+            </w:tcMar>
+            <w:vAlign w:val="center"/>
+          </w:tcPr>
+          <w:p>
+            <w:pPr>
+              <w:spacing w:after="10" w:line="270" w:lineRule="auto"/>
+            </w:pPr>
+            <w:r>
+              <w:rPr>
+                <w:rFonts w:ascii="Calibri" w:hAnsi="Calibri" w:eastAsia="微软雅黑" w:cs="Calibri"/>
+                <w:b/>
+                <w:bCs/>
+                <w:sz w:val="18"/>
+                <w:szCs w:val="18"/>
+              </w:rPr>
+              <w:t xml:space="preserve">隐忧</w:t>
+            </w:r>
+          </w:p>
+        </w:tc>
+        <w:tc>
+          <w:tcPr>
+            <w:tcW w:w="6838" w:type="dxa"/>
+            <w:tcBorders>
+              <w:top w:val="single" w:color="BFBFBF" w:sz="4" w:space="0"/>
+              <w:left w:val="single" w:color="BFBFBF" w:sz="4" w:space="0"/>
+              <w:bottom w:val="single" w:color="BFBFBF" w:sz="4" w:space="0"/>
+              <w:right w:val="single" w:color="BFBFBF" w:sz="4" w:space="0"/>
+            </w:tcBorders>
+            <w:tcMar>
+              <w:top w:w="60" w:type="dxa"/>
+              <w:left w:w="90" w:type="dxa"/>
+              <w:bottom w:w="60" w:type="dxa"/>
+              <w:right w:w="90" w:type="dxa"/>
+            </w:tcMar>
+            <w:vAlign w:val="center"/>
+          </w:tcPr>
+          <w:p>
+            <w:pPr>
+              <w:spacing w:after="10" w:line="270" w:lineRule="auto"/>
+            </w:pPr>
+            <w:r>
+              <w:rPr>
+                <w:rFonts w:ascii="Calibri" w:hAnsi="Calibri" w:eastAsia="微软雅黑" w:cs="Calibri"/>
+                <w:sz w:val="18"/>
+                <w:szCs w:val="18"/>
+              </w:rPr>
+              <w:t xml:space="preserve">日本高中男子摔跤社团人数2013至2023年下降约30%</w:t>
+            </w:r>
+          </w:p>
+        </w:tc>
+        <w:tc>
+          <w:tcPr>
+            <w:tcW w:w="1200" w:type="dxa"/>
+            <w:tcBorders>
+              <w:top w:val="single" w:color="BFBFBF" w:sz="4" w:space="0"/>
+              <w:left w:val="single" w:color="BFBFBF" w:sz="4" w:space="0"/>
+              <w:bottom w:val="single" w:color="BFBFBF" w:sz="4" w:space="0"/>
+              <w:right w:val="single" w:color="BFBFBF" w:sz="4" w:space="0"/>
+            </w:tcBorders>
+            <w:tcMar>
+              <w:top w:w="60" w:type="dxa"/>
+              <w:left w:w="90" w:type="dxa"/>
+              <w:bottom w:w="60" w:type="dxa"/>
+              <w:right w:w="90" w:type="dxa"/>
+            </w:tcMar>
+            <w:vAlign w:val="center"/>
+          </w:tcPr>
+          <w:p>
+            <w:pPr>
+              <w:spacing w:after="10" w:line="270" w:lineRule="auto"/>
+            </w:pPr>
+            <w:r>
+              <w:rPr>
+                <w:rFonts w:ascii="Calibri" w:hAnsi="Calibri" w:eastAsia="微软雅黑" w:cs="Calibri"/>
+                <w:sz w:val="17"/>
+                <w:szCs w:val="17"/>
+              </w:rPr>
+              <w:t xml:space="preserve">[59]</w:t>
+            </w:r>
+          </w:p>
+        </w:tc>
+      </w:tr>
+    </w:tbl>
+    <w:p>
+      <w:pPr>
+        <w:spacing w:after="60"/>
+      </w:pPr>
     </w:p>
     <w:p>
       <w:pPr>
@@ -20119,15 +21380,52 @@
           <w:sz w:val="21"/>
           <w:szCs w:val="21"/>
         </w:rPr>
-        <w:t xml:space="preserve">奥运金牌与级别不匹配</w:t>
-      </w:r>
-      <w:r>
-        <w:rPr>
-          <w:rFonts w:ascii="Calibri" w:hAnsi="Calibri" w:eastAsia="微软雅黑" w:cs="Calibri"/>
-          <w:sz w:val="21"/>
-          <w:szCs w:val="21"/>
-        </w:rPr>
-        <w:t xml:space="preserve">：中国摔跤唯一的两枚奥运金牌来自女子72公斤，洛杉矶没有该级别；男子古典式、自由式从未夺金，最好成绩是银牌（常永祥2008年，曹利国2024年），经验不能直接迁移到古典式60公斤。[7、8]</w:t>
+        <w:t xml:space="preserve">说明：</w:t>
+      </w:r>
+      <w:r>
+        <w:rPr>
+          <w:rFonts w:ascii="Calibri" w:hAnsi="Calibri" w:eastAsia="微软雅黑" w:cs="Calibri"/>
+          <w:sz w:val="21"/>
+          <w:szCs w:val="21"/>
+        </w:rPr>
+        <w:t xml:space="preserve">日本协会刊物中的训练和减重细节来自3名自由式冠军（樋口黎、藤波朱理、镜优翔），古典式专项的科研支持没有找到公开资料</w:t>
+      </w:r>
+      <w:r>
+        <w:rPr>
+          <w:rFonts w:ascii="Calibri" w:hAnsi="Calibri" w:eastAsia="微软雅黑" w:cs="Calibri"/>
+          <w:b/>
+          <w:bCs/>
+          <w:color w:val="C00000"/>
+          <w:sz w:val="21"/>
+          <w:szCs w:val="21"/>
+        </w:rPr>
+        <w:t xml:space="preserve">【待核实】</w:t>
+      </w:r>
+      <w:r>
+        <w:rPr>
+          <w:rFonts w:ascii="Calibri" w:hAnsi="Calibri" w:eastAsia="微软雅黑" w:cs="Calibri"/>
+          <w:sz w:val="21"/>
+          <w:szCs w:val="21"/>
+        </w:rPr>
+        <w:t xml:space="preserve">。</w:t>
+      </w:r>
+    </w:p>
+    <w:p>
+      <w:pPr>
+        <w:pStyle w:val="3"/>
+        <w:keepNext/>
+        <w:spacing w:before="180" w:after="80"/>
+      </w:pPr>
+      <w:r>
+        <w:rPr>
+          <w:rFonts w:ascii="Calibri" w:hAnsi="Calibri" w:eastAsia="微软雅黑" w:cs="Calibri"/>
+          <w:b/>
+          <w:bCs/>
+          <w:color w:val="1F3A5F"/>
+          <w:sz w:val="24"/>
+          <w:szCs w:val="24"/>
+        </w:rPr>
+        <w:t xml:space="preserve">6.5 对曹利国的启示（分析判断，不是公开资料结论）</w:t>
       </w:r>
     </w:p>
     <w:p>
@@ -20147,23 +21445,15 @@
           <w:sz w:val="21"/>
           <w:szCs w:val="21"/>
         </w:rPr>
-        <w:t xml:space="preserve">2027年世锦赛是关键节点：</w:t>
-      </w:r>
-      <w:r>
-        <w:rPr>
-          <w:rFonts w:ascii="Calibri" w:hAnsi="Calibri" w:eastAsia="微软雅黑" w:cs="Calibri"/>
-          <w:sz w:val="21"/>
-          <w:szCs w:val="21"/>
-        </w:rPr>
-        <w:t xml:space="preserve">前4名直接为国家夺得名额。曹利国2026年世锦赛第5名，离奖牌只差一场（铜牌战1∶5负苏尔坦加利）；能否进入2027年世锦赛名单，比2028年亚洲资格赛更早决定机会。</w:t>
-      </w:r>
-      <w:r>
-        <w:rPr>
-          <w:rFonts w:ascii="Calibri" w:hAnsi="Calibri" w:eastAsia="微软雅黑" w:cs="Calibri"/>
-          <w:sz w:val="21"/>
-          <w:szCs w:val="21"/>
-        </w:rPr>
-        <w:t xml:space="preserve">[1、26]</w:t>
+        <w:t xml:space="preserve">奥运金牌与级别不匹配</w:t>
+      </w:r>
+      <w:r>
+        <w:rPr>
+          <w:rFonts w:ascii="Calibri" w:hAnsi="Calibri" w:eastAsia="微软雅黑" w:cs="Calibri"/>
+          <w:sz w:val="21"/>
+          <w:szCs w:val="21"/>
+        </w:rPr>
+        <w:t xml:space="preserve">：中国摔跤唯一的两枚奥运金牌来自女子72公斤，洛杉矶没有该级别；男子古典式、自由式从未夺金，最好成绩是银牌（常永祥2008年，曹利国2024年），经验不能直接迁移到古典式60公斤。[7、8]</w:t>
       </w:r>
     </w:p>
     <w:p>
@@ -20183,23 +21473,23 @@
           <w:sz w:val="21"/>
           <w:szCs w:val="21"/>
         </w:rPr>
-        <w:t xml:space="preserve">对手集中在日本：</w:t>
-      </w:r>
-      <w:r>
-        <w:rPr>
-          <w:rFonts w:ascii="Calibri" w:hAnsi="Calibri" w:eastAsia="微软雅黑" w:cs="Calibri"/>
-          <w:sz w:val="21"/>
-          <w:szCs w:val="21"/>
-        </w:rPr>
-        <w:t xml:space="preserve">日本60公斤级有文田健一郎（巴黎冠军）、五味虹登（2026年世界冠军）以及SHIOTANI Yu、INABA Kaito等多名竞争者；文田和五味都在跪撑进攻上得分，曹利国对二人3战全负。备战重点应放在跪撑防守（尤其是抱腰翻、抱胸翻）和针对日本选手的录像研究。</w:t>
-      </w:r>
-      <w:r>
-        <w:rPr>
-          <w:rFonts w:ascii="Calibri" w:hAnsi="Calibri" w:eastAsia="微软雅黑" w:cs="Calibri"/>
-          <w:sz w:val="21"/>
-          <w:szCs w:val="21"/>
-        </w:rPr>
-        <w:t xml:space="preserve">[26、29、30]</w:t>
+        <w:t xml:space="preserve">2027年世锦赛是关键节点：</w:t>
+      </w:r>
+      <w:r>
+        <w:rPr>
+          <w:rFonts w:ascii="Calibri" w:hAnsi="Calibri" w:eastAsia="微软雅黑" w:cs="Calibri"/>
+          <w:sz w:val="21"/>
+          <w:szCs w:val="21"/>
+        </w:rPr>
+        <w:t xml:space="preserve">前4名直接为国家夺得名额。曹利国2026年世锦赛第5名，离奖牌只差一场（铜牌战1∶5负苏尔坦加利）；能否进入2027年世锦赛名单，比2028年亚洲资格赛更早决定机会。</w:t>
+      </w:r>
+      <w:r>
+        <w:rPr>
+          <w:rFonts w:ascii="Calibri" w:hAnsi="Calibri" w:eastAsia="微软雅黑" w:cs="Calibri"/>
+          <w:sz w:val="21"/>
+          <w:szCs w:val="21"/>
+        </w:rPr>
+        <w:t xml:space="preserve">[1、26]</w:t>
       </w:r>
     </w:p>
     <w:p>
@@ -20219,23 +21509,23 @@
           <w:sz w:val="21"/>
           <w:szCs w:val="21"/>
         </w:rPr>
-        <w:t xml:space="preserve">国内排序优先：</w:t>
-      </w:r>
-      <w:r>
-        <w:rPr>
-          <w:rFonts w:ascii="Calibri" w:hAnsi="Calibri" w:eastAsia="微软雅黑" w:cs="Calibri"/>
-          <w:sz w:val="21"/>
-          <w:szCs w:val="21"/>
-        </w:rPr>
-        <w:t xml:space="preserve">2026年谭浩东拿走亚锦赛和亚运会名额，曹利国只打了世锦赛。向举摔柔中心索取2026年三站积分和综合排名，是判断曹利国国内位置成本最低的办法。</w:t>
-      </w:r>
-      <w:r>
-        <w:rPr>
-          <w:rFonts w:ascii="Calibri" w:hAnsi="Calibri" w:eastAsia="微软雅黑" w:cs="Calibri"/>
-          <w:sz w:val="21"/>
-          <w:szCs w:val="21"/>
-        </w:rPr>
-        <w:t xml:space="preserve">[17、27]</w:t>
+        <w:t xml:space="preserve">对手集中在日本：</w:t>
+      </w:r>
+      <w:r>
+        <w:rPr>
+          <w:rFonts w:ascii="Calibri" w:hAnsi="Calibri" w:eastAsia="微软雅黑" w:cs="Calibri"/>
+          <w:sz w:val="21"/>
+          <w:szCs w:val="21"/>
+        </w:rPr>
+        <w:t xml:space="preserve">日本60公斤级有文田健一郎（巴黎冠军）、五味虹登（2026年世界冠军）以及SHIOTANI Yu、INABA Kaito等多名竞争者；文田和五味都在跪撑进攻上得分，曹利国对二人3战全负。备战重点应放在跪撑防守（尤其是抱腰翻、抱胸翻）和针对日本选手的录像研究。</w:t>
+      </w:r>
+      <w:r>
+        <w:rPr>
+          <w:rFonts w:ascii="Calibri" w:hAnsi="Calibri" w:eastAsia="微软雅黑" w:cs="Calibri"/>
+          <w:sz w:val="21"/>
+          <w:szCs w:val="21"/>
+        </w:rPr>
+        <w:t xml:space="preserve">[26、29、30]</w:t>
       </w:r>
     </w:p>
     <w:p>
@@ -20255,15 +21545,23 @@
           <w:sz w:val="21"/>
           <w:szCs w:val="21"/>
         </w:rPr>
-        <w:t xml:space="preserve">赛前适应营</w:t>
-      </w:r>
-      <w:r>
-        <w:rPr>
-          <w:rFonts w:ascii="Calibri" w:hAnsi="Calibri" w:eastAsia="微软雅黑" w:cs="Calibri"/>
-          <w:sz w:val="21"/>
-          <w:szCs w:val="21"/>
-        </w:rPr>
-        <w:t xml:space="preserve">：2016年里约备战时国家队在秦皇岛集训，赛前在圣保罗设适应营再进入奥运村，可作为2028年备战安排的参照。[8]</w:t>
+        <w:t xml:space="preserve">国内排序优先：</w:t>
+      </w:r>
+      <w:r>
+        <w:rPr>
+          <w:rFonts w:ascii="Calibri" w:hAnsi="Calibri" w:eastAsia="微软雅黑" w:cs="Calibri"/>
+          <w:sz w:val="21"/>
+          <w:szCs w:val="21"/>
+        </w:rPr>
+        <w:t xml:space="preserve">2026年谭浩东拿走亚锦赛和亚运会名额，曹利国只打了世锦赛。向举摔柔中心索取2026年三站积分和综合排名，是判断曹利国国内位置成本最低的办法。</w:t>
+      </w:r>
+      <w:r>
+        <w:rPr>
+          <w:rFonts w:ascii="Calibri" w:hAnsi="Calibri" w:eastAsia="微软雅黑" w:cs="Calibri"/>
+          <w:sz w:val="21"/>
+          <w:szCs w:val="21"/>
+        </w:rPr>
+        <w:t xml:space="preserve">[17、27]</w:t>
       </w:r>
     </w:p>
     <w:p>
@@ -20283,15 +21581,115 @@
           <w:sz w:val="21"/>
           <w:szCs w:val="21"/>
         </w:rPr>
-        <w:t xml:space="preserve">保障信息缺口</w:t>
-      </w:r>
-      <w:r>
-        <w:rPr>
-          <w:rFonts w:ascii="Calibri" w:hAnsi="Calibri" w:eastAsia="微软雅黑" w:cs="Calibri"/>
-          <w:sz w:val="21"/>
-          <w:szCs w:val="21"/>
-        </w:rPr>
-        <w:t xml:space="preserve">：中国和外国冠军的科研、医疗、营养保障缺公开资料，不能据此给出具体改进措施</w:t>
+        <w:t xml:space="preserve">赛前适应营</w:t>
+      </w:r>
+      <w:r>
+        <w:rPr>
+          <w:rFonts w:ascii="Calibri" w:hAnsi="Calibri" w:eastAsia="微软雅黑" w:cs="Calibri"/>
+          <w:sz w:val="21"/>
+          <w:szCs w:val="21"/>
+        </w:rPr>
+        <w:t xml:space="preserve">：2016年里约备战时国家队在秦皇岛集训，赛前在圣保罗设适应营再进入奥运村，可作为2028年备战安排的参照。[8]</w:t>
+      </w:r>
+    </w:p>
+    <w:p>
+      <w:pPr>
+        <w:pStyle w:val="19"/>
+        <w:numPr>
+          <w:ilvl w:val="0"/>
+          <w:numId w:val="2"/>
+        </w:numPr>
+        <w:spacing w:after="60" w:line="320" w:lineRule="auto"/>
+      </w:pPr>
+      <w:r>
+        <w:rPr>
+          <w:rFonts w:ascii="Calibri" w:hAnsi="Calibri" w:eastAsia="微软雅黑" w:cs="Calibri"/>
+          <w:b/>
+          <w:bCs/>
+          <w:sz w:val="21"/>
+          <w:szCs w:val="21"/>
+        </w:rPr>
+        <w:t xml:space="preserve">减重要有量化上限：</w:t>
+      </w:r>
+      <w:r>
+        <w:rPr>
+          <w:rFonts w:ascii="Calibri" w:hAnsi="Calibri" w:eastAsia="微软雅黑" w:cs="Calibri"/>
+          <w:sz w:val="21"/>
+          <w:szCs w:val="21"/>
+        </w:rPr>
+        <w:t xml:space="preserve">日本体育科学中心的研究建议快速减重不超过体重的5%；洛杉矶仍是两天赛制，第二天进决赛和复活赛的人要再称重且没有体重浮动（规则第8条）。曹利国赛前一周的超重比例和减重幅度应纳入日常监测（分析判断）。</w:t>
+      </w:r>
+      <w:r>
+        <w:rPr>
+          <w:rFonts w:ascii="Calibri" w:hAnsi="Calibri" w:eastAsia="微软雅黑" w:cs="Calibri"/>
+          <w:sz w:val="21"/>
+          <w:szCs w:val="21"/>
+        </w:rPr>
+        <w:t xml:space="preserve">[22、58]</w:t>
+      </w:r>
+    </w:p>
+    <w:p>
+      <w:pPr>
+        <w:pStyle w:val="19"/>
+        <w:numPr>
+          <w:ilvl w:val="0"/>
+          <w:numId w:val="2"/>
+        </w:numPr>
+        <w:spacing w:after="60" w:line="320" w:lineRule="auto"/>
+      </w:pPr>
+      <w:r>
+        <w:rPr>
+          <w:rFonts w:ascii="Calibri" w:hAnsi="Calibri" w:eastAsia="微软雅黑" w:cs="Calibri"/>
+          <w:b/>
+          <w:bCs/>
+          <w:sz w:val="21"/>
+          <w:szCs w:val="21"/>
+        </w:rPr>
+        <w:t xml:space="preserve">可借鉴的低成本做法：</w:t>
+      </w:r>
+      <w:r>
+        <w:rPr>
+          <w:rFonts w:ascii="Calibri" w:hAnsi="Calibri" w:eastAsia="微软雅黑" w:cs="Calibri"/>
+          <w:sz w:val="21"/>
+          <w:szCs w:val="21"/>
+        </w:rPr>
+        <w:t xml:space="preserve">日本的保障里，赛时远程录像分析、低氧舱功率车训练、协会每年发布科学通讯，都不依赖大规模投入；广西可以对照第3.2节的逐场比分，先做曹利国负场的跪撑录像分析（分析判断）。</w:t>
+      </w:r>
+      <w:r>
+        <w:rPr>
+          <w:rFonts w:ascii="Calibri" w:hAnsi="Calibri" w:eastAsia="微软雅黑" w:cs="Calibri"/>
+          <w:sz w:val="21"/>
+          <w:szCs w:val="21"/>
+        </w:rPr>
+        <w:t xml:space="preserve">[54、56]</w:t>
+      </w:r>
+    </w:p>
+    <w:p>
+      <w:pPr>
+        <w:pStyle w:val="19"/>
+        <w:numPr>
+          <w:ilvl w:val="0"/>
+          <w:numId w:val="2"/>
+        </w:numPr>
+        <w:spacing w:after="60" w:line="320" w:lineRule="auto"/>
+      </w:pPr>
+      <w:r>
+        <w:rPr>
+          <w:rFonts w:ascii="Calibri" w:hAnsi="Calibri" w:eastAsia="微软雅黑" w:cs="Calibri"/>
+          <w:b/>
+          <w:bCs/>
+          <w:sz w:val="21"/>
+          <w:szCs w:val="21"/>
+        </w:rPr>
+        <w:t xml:space="preserve">保障信息缺口：</w:t>
+      </w:r>
+      <w:r>
+        <w:rPr>
+          <w:rFonts w:ascii="Calibri" w:hAnsi="Calibri" w:eastAsia="微软雅黑" w:cs="Calibri"/>
+          <w:sz w:val="21"/>
+          <w:szCs w:val="21"/>
+        </w:rPr>
+        <w:t xml:space="preserve">中国冠军的科研、医疗、营养保障缺公开资料；日本资料主要来自自由式选手，古典式专项保障细节未见公开，不能据此给出具体改进措施</w:t>
       </w:r>
       <w:r>
         <w:rPr>
@@ -23015,6 +24413,204 @@
           <w:szCs w:val="19"/>
         </w:rPr>
         <w:t xml:space="preserve">  广西重竞技运动发展中心（广西壮族自治区体育局网）。曹利国摘获银牌！广西摔跤项目首枚奥运奖牌诞生（2024年8月7日），经浏览器插件摘录原文。</w:t>
+      </w:r>
+    </w:p>
+    <w:p>
+      <w:pPr>
+        <w:spacing w:after="40" w:line="280" w:lineRule="auto"/>
+        <w:ind w:left="420" w:hanging="420"/>
+      </w:pPr>
+      <w:r>
+        <w:rPr>
+          <w:rFonts w:ascii="Calibri" w:hAnsi="Calibri" w:eastAsia="微软雅黑" w:cs="Calibri"/>
+          <w:sz w:val="19"/>
+          <w:szCs w:val="19"/>
+        </w:rPr>
+        <w:t xml:space="preserve">[54]</w:t>
+      </w:r>
+      <w:r>
+        <w:rPr>
+          <w:rFonts w:ascii="Calibri" w:hAnsi="Calibri" w:eastAsia="微软雅黑" w:cs="Calibri"/>
+          <w:sz w:val="19"/>
+          <w:szCs w:val="19"/>
+        </w:rPr>
+        <w:t xml:space="preserve">  日本体育振兴中心高性能体育中心。高性能体育中心2024年度年报，已读摔跤相关部分。</w:t>
+      </w:r>
+    </w:p>
+    <w:p>
+      <w:pPr>
+        <w:spacing w:after="40" w:line="280" w:lineRule="auto"/>
+        <w:ind w:left="420" w:hanging="420"/>
+      </w:pPr>
+      <w:r>
+        <w:rPr>
+          <w:rFonts w:ascii="Calibri" w:hAnsi="Calibri" w:eastAsia="微软雅黑" w:cs="Calibri"/>
+          <w:sz w:val="19"/>
+          <w:szCs w:val="19"/>
+        </w:rPr>
+        <w:t xml:space="preserve">[55]</w:t>
+      </w:r>
+      <w:r>
+        <w:rPr>
+          <w:rFonts w:ascii="Calibri" w:hAnsi="Calibri" w:eastAsia="微软雅黑" w:cs="Calibri"/>
+          <w:sz w:val="19"/>
+          <w:szCs w:val="19"/>
+        </w:rPr>
+        <w:t xml:space="preserve">  日本摔跤协会。第1回レスリングサイエンスハブ開催報告（2025年12月26日），已读。</w:t>
+      </w:r>
+    </w:p>
+    <w:p>
+      <w:pPr>
+        <w:spacing w:after="40" w:line="280" w:lineRule="auto"/>
+        <w:ind w:left="420" w:hanging="420"/>
+      </w:pPr>
+      <w:r>
+        <w:rPr>
+          <w:rFonts w:ascii="Calibri" w:hAnsi="Calibri" w:eastAsia="微软雅黑" w:cs="Calibri"/>
+          <w:sz w:val="19"/>
+          <w:szCs w:val="19"/>
+        </w:rPr>
+        <w:t xml:space="preserve">[56]</w:t>
+      </w:r>
+      <w:r>
+        <w:rPr>
+          <w:rFonts w:ascii="Calibri" w:hAnsi="Calibri" w:eastAsia="微软雅黑" w:cs="Calibri"/>
+          <w:sz w:val="19"/>
+          <w:szCs w:val="19"/>
+        </w:rPr>
+        <w:t xml:space="preserve">  日本摔跤协会运动医科学委员会、科学部会。高性能摔跤科学通讯第6期（2025年12月17日），已读全文。</w:t>
+      </w:r>
+    </w:p>
+    <w:p>
+      <w:pPr>
+        <w:spacing w:after="40" w:line="280" w:lineRule="auto"/>
+        <w:ind w:left="420" w:hanging="420"/>
+      </w:pPr>
+      <w:r>
+        <w:rPr>
+          <w:rFonts w:ascii="Calibri" w:hAnsi="Calibri" w:eastAsia="微软雅黑" w:cs="Calibri"/>
+          <w:sz w:val="19"/>
+          <w:szCs w:val="19"/>
+        </w:rPr>
+        <w:t xml:space="preserve">[57]</w:t>
+      </w:r>
+      <w:r>
+        <w:rPr>
+          <w:rFonts w:ascii="Calibri" w:hAnsi="Calibri" w:eastAsia="微软雅黑" w:cs="Calibri"/>
+          <w:sz w:val="19"/>
+          <w:szCs w:val="19"/>
+        </w:rPr>
+        <w:t xml:space="preserve">  Kondo E, Sagayama H, Yamada Y, et al. Energy Deficit Required for Rapid Weight Loss in Elite Collegiate Wrestlers. Nutrients, 2018. doi:10.3390/nu10050536（PubMed摘要已读）。</w:t>
+      </w:r>
+    </w:p>
+    <w:p>
+      <w:pPr>
+        <w:spacing w:after="40" w:line="280" w:lineRule="auto"/>
+        <w:ind w:left="420" w:hanging="420"/>
+      </w:pPr>
+      <w:r>
+        <w:rPr>
+          <w:rFonts w:ascii="Calibri" w:hAnsi="Calibri" w:eastAsia="微软雅黑" w:cs="Calibri"/>
+          <w:sz w:val="19"/>
+          <w:szCs w:val="19"/>
+        </w:rPr>
+        <w:t xml:space="preserve">[58]</w:t>
+      </w:r>
+      <w:r>
+        <w:rPr>
+          <w:rFonts w:ascii="Calibri" w:hAnsi="Calibri" w:eastAsia="微软雅黑" w:cs="Calibri"/>
+          <w:sz w:val="19"/>
+          <w:szCs w:val="19"/>
+        </w:rPr>
+        <w:t xml:space="preserve">  Kondo E, Nishimaki M, Yamashita D, Nakajima K. The link between the range of rapid weight loss and physical conditions of elite wrestlers during competition under the morning weigh-in rule. J Sports Med Phys Fitness, 2020. doi:10.23736/S0022-4707.20.11221-0（PubMed摘要已读）。</w:t>
+      </w:r>
+    </w:p>
+    <w:p>
+      <w:pPr>
+        <w:spacing w:after="40" w:line="280" w:lineRule="auto"/>
+        <w:ind w:left="420" w:hanging="420"/>
+      </w:pPr>
+      <w:r>
+        <w:rPr>
+          <w:rFonts w:ascii="Calibri" w:hAnsi="Calibri" w:eastAsia="微软雅黑" w:cs="Calibri"/>
+          <w:sz w:val="19"/>
+          <w:szCs w:val="19"/>
+        </w:rPr>
+        <w:t xml:space="preserve">[59]</w:t>
+      </w:r>
+      <w:r>
+        <w:rPr>
+          <w:rFonts w:ascii="Calibri" w:hAnsi="Calibri" w:eastAsia="微软雅黑" w:cs="Calibri"/>
+          <w:sz w:val="19"/>
+          <w:szCs w:val="19"/>
+        </w:rPr>
+        <w:t xml:space="preserve">  nippon.com. Triumphs and Looming Concerns: Decoding Japan’s Medal Count in Paris（2024年），已读。</w:t>
+      </w:r>
+    </w:p>
+    <w:p>
+      <w:pPr>
+        <w:spacing w:after="40" w:line="280" w:lineRule="auto"/>
+        <w:ind w:left="420" w:hanging="420"/>
+      </w:pPr>
+      <w:r>
+        <w:rPr>
+          <w:rFonts w:ascii="Calibri" w:hAnsi="Calibri" w:eastAsia="微软雅黑" w:cs="Calibri"/>
+          <w:sz w:val="19"/>
+          <w:szCs w:val="19"/>
+        </w:rPr>
+        <w:t xml:space="preserve">[60]</w:t>
+      </w:r>
+      <w:r>
+        <w:rPr>
+          <w:rFonts w:ascii="Calibri" w:hAnsi="Calibri" w:eastAsia="微软雅黑" w:cs="Calibri"/>
+          <w:sz w:val="19"/>
+          <w:szCs w:val="19"/>
+        </w:rPr>
+        <w:t xml:space="preserve">  每日新潮。文田健一郎与日下尚夺金 古典式复权（2024年8月9日，第2页），已读。</w:t>
+      </w:r>
+    </w:p>
+    <w:p>
+      <w:pPr>
+        <w:spacing w:after="40" w:line="280" w:lineRule="auto"/>
+        <w:ind w:left="420" w:hanging="420"/>
+      </w:pPr>
+      <w:r>
+        <w:rPr>
+          <w:rFonts w:ascii="Calibri" w:hAnsi="Calibri" w:eastAsia="微软雅黑" w:cs="Calibri"/>
+          <w:sz w:val="19"/>
+          <w:szCs w:val="19"/>
+        </w:rPr>
+        <w:t xml:space="preserve">[61]</w:t>
+      </w:r>
+      <w:r>
+        <w:rPr>
+          <w:rFonts w:ascii="Calibri" w:hAnsi="Calibri" w:eastAsia="微软雅黑" w:cs="Calibri"/>
+          <w:sz w:val="19"/>
+          <w:szCs w:val="19"/>
+        </w:rPr>
+        <w:t xml:space="preserve">  日本奥委会。文田健一郎专访：この歩みを止めたくない（2024年8月7日采访），已读。</w:t>
+      </w:r>
+    </w:p>
+    <w:p>
+      <w:pPr>
+        <w:spacing w:after="40" w:line="280" w:lineRule="auto"/>
+        <w:ind w:left="420" w:hanging="420"/>
+      </w:pPr>
+      <w:r>
+        <w:rPr>
+          <w:rFonts w:ascii="Calibri" w:hAnsi="Calibri" w:eastAsia="微软雅黑" w:cs="Calibri"/>
+          <w:sz w:val="19"/>
+          <w:szCs w:val="19"/>
+        </w:rPr>
+        <w:t xml:space="preserve">[62]</w:t>
+      </w:r>
+      <w:r>
+        <w:rPr>
+          <w:rFonts w:ascii="Calibri" w:hAnsi="Calibri" w:eastAsia="微软雅黑" w:cs="Calibri"/>
+          <w:sz w:val="19"/>
+          <w:szCs w:val="19"/>
+        </w:rPr>
+        <w:t xml:space="preserve">  体育报知（雅虎新闻转载）。古典式日本代表集训公开（2026年8月25日），已读。</w:t>
       </w:r>
     </w:p>
     <w:sectPr>

</xml_diff>